<commit_message>
updated WSRC tutorial deck and lab instructions
</commit_message>
<xml_diff>
--- a/2025_WSRC/2026 WSRC Tutorial Lab Instructions.docx
+++ b/2025_WSRC/2026 WSRC Tutorial Lab Instructions.docx
@@ -3,126 +3,48 @@
 <w:document xmlns:wpc="http://schemas.microsoft.com/office/word/2010/wordprocessingCanvas" xmlns:cx="http://schemas.microsoft.com/office/drawing/2014/chartex" xmlns:cx1="http://schemas.microsoft.com/office/drawing/2015/9/8/chartex" xmlns:cx2="http://schemas.microsoft.com/office/drawing/2015/10/21/chartex" xmlns:cx3="http://schemas.microsoft.com/office/drawing/2016/5/9/chartex" xmlns:cx4="http://schemas.microsoft.com/office/drawing/2016/5/10/chartex" xmlns:cx5="http://schemas.microsoft.com/office/drawing/2016/5/11/chartex" xmlns:cx6="http://schemas.microsoft.com/office/drawing/2016/5/12/chartex" xmlns:cx7="http://schemas.microsoft.com/office/drawing/2016/5/13/chartex" xmlns:cx8="http://schemas.microsoft.com/office/drawing/2016/5/14/chartex" xmlns:mc="http://schemas.openxmlformats.org/markup-compatibility/2006" xmlns:aink="http://schemas.microsoft.com/office/drawing/2016/ink" xmlns:am3d="http://schemas.microsoft.com/office/drawing/2017/model3d" xmlns:o="urn:schemas-microsoft-com:office:office" xmlns:oel="http://schemas.microsoft.com/office/2019/extlst" xmlns:r="http://schemas.openxmlformats.org/officeDocument/2006/relationships" xmlns:m="http://schemas.openxmlformats.org/officeDocument/2006/math" xmlns:v="urn:schemas-microsoft-com:vml" xmlns:wp14="http://schemas.microsoft.com/office/word/2010/wordprocessingDrawing" xmlns:wp="http://schemas.openxmlformats.org/drawingml/2006/wordprocessingDrawing" xmlns:w10="urn:schemas-microsoft-com:office:word" xmlns:w="http://schemas.openxmlformats.org/wordprocessingml/2006/main" xmlns:w14="http://schemas.microsoft.com/office/word/2010/wordml" xmlns:w15="http://schemas.microsoft.com/office/word/2012/wordml" xmlns:w16cex="http://schemas.microsoft.com/office/word/2018/wordml/cex" xmlns:w16cid="http://schemas.microsoft.com/office/word/2016/wordml/cid" xmlns:w16="http://schemas.microsoft.com/office/word/2018/wordml" xmlns:w16du="http://schemas.microsoft.com/office/word/2023/wordml/word16du" xmlns:w16sdtdh="http://schemas.microsoft.com/office/word/2020/wordml/sdtdatahash" xmlns:w16sdtfl="http://schemas.microsoft.com/office/word/2024/wordml/sdtformatlock" xmlns:w16se="http://schemas.microsoft.com/office/word/2015/wordml/symex" xmlns:wpg="http://schemas.microsoft.com/office/word/2010/wordprocessingGroup" xmlns:wpi="http://schemas.microsoft.com/office/word/2010/wordprocessingInk" xmlns:wne="http://schemas.microsoft.com/office/word/2006/wordml" xmlns:wps="http://schemas.microsoft.com/office/word/2010/wordprocessingShape" mc:Ignorable="w14 w15 w16se w16cid w16 w16cex w16sdtdh w16sdtfl w16du wp14">
   <w:body>
     <w:p>
-      <w:r>
+      <w:pPr>
+        <w:rPr>
+          <w:rFonts w:ascii="Montserrat" w:hAnsi="Montserrat"/>
+          <w:b/>
+          <w:bCs/>
+        </w:rPr>
+      </w:pPr>
+      <w:r>
+        <w:rPr>
+          <w:rFonts w:ascii="Montserrat" w:hAnsi="Montserrat"/>
+          <w:b/>
+          <w:bCs/>
+        </w:rPr>
         <w:t>2026 WSRC Tutorial Lab Instructions</w:t>
       </w:r>
     </w:p>
     <w:p>
       <w:pPr>
         <w:rPr>
-          <w:rFonts w:ascii="Lucida Grande" w:hAnsi="Lucida Grande" w:cs="Lucida Grande"/>
-          <w:color w:val="000000"/>
-          <w:sz w:val="20"/>
-          <w:szCs w:val="20"/>
-          <w:shd w:val="clear" w:color="auto" w:fill="DBF8F5"/>
-        </w:rPr>
-      </w:pPr>
-      <w:r>
-        <w:rPr>
-          <w:rFonts w:ascii="Lucida Grande" w:hAnsi="Lucida Grande" w:cs="Lucida Grande"/>
-          <w:color w:val="000000"/>
-          <w:sz w:val="20"/>
-          <w:szCs w:val="20"/>
-          <w:shd w:val="clear" w:color="auto" w:fill="DBF8F5"/>
-        </w:rPr>
-        <w:t>This 4-hour tutorial will present an introduction to the Lifecycle Modeling Language (LML) with an instructor-led, hands-on lab. Attendees will learn how crucial project management (PM) tasks are addressed by the language and integrated with the design architecture. Participants will have the opportunity to complete model-based systems engineering (MBSE) activities created and led by experts in the field. In addition to constructing a system structural and functional architecture, this tutorial will demonstrate traceability of these elements to requirements, risk, schedule, and scope management efforts that are imperative for successful projects. Maintaining awareness of PM metrics during development and design phases is facilitated by including this information in the systems engineering (SE) model. Real-time PM decisions captured in the model facilitates transparency and collaboration between disciplines while enabling the design team to adjust accordingly without significant delays. Participants should expect to learn:</w:t>
-      </w:r>
-      <w:r>
-        <w:rPr>
-          <w:rFonts w:ascii="Aptos" w:hAnsi="Aptos"/>
-          <w:color w:val="000000"/>
-        </w:rPr>
-        <w:br/>
-      </w:r>
-      <w:r>
-        <w:rPr>
-          <w:rFonts w:ascii="Lucida Grande" w:hAnsi="Lucida Grande" w:cs="Lucida Grande"/>
-          <w:color w:val="000000"/>
-          <w:sz w:val="20"/>
-          <w:szCs w:val="20"/>
-          <w:shd w:val="clear" w:color="auto" w:fill="DBF8F5"/>
-        </w:rPr>
-        <w:t>• LML fundamentals</w:t>
-      </w:r>
-      <w:r>
-        <w:rPr>
-          <w:rFonts w:ascii="Aptos" w:hAnsi="Aptos"/>
-          <w:color w:val="000000"/>
-        </w:rPr>
-        <w:br/>
-      </w:r>
-      <w:r>
-        <w:rPr>
-          <w:rFonts w:ascii="Lucida Grande" w:hAnsi="Lucida Grande" w:cs="Lucida Grande"/>
-          <w:color w:val="000000"/>
-          <w:sz w:val="20"/>
-          <w:szCs w:val="20"/>
-          <w:shd w:val="clear" w:color="auto" w:fill="DBF8F5"/>
-        </w:rPr>
-        <w:t>• PM fundamentals</w:t>
-      </w:r>
-      <w:r>
-        <w:rPr>
-          <w:rFonts w:ascii="Aptos" w:hAnsi="Aptos"/>
-          <w:color w:val="000000"/>
-        </w:rPr>
-        <w:br/>
-      </w:r>
-      <w:r>
-        <w:rPr>
-          <w:rFonts w:ascii="Lucida Grande" w:hAnsi="Lucida Grande" w:cs="Lucida Grande"/>
-          <w:color w:val="000000"/>
-          <w:sz w:val="20"/>
-          <w:szCs w:val="20"/>
-          <w:shd w:val="clear" w:color="auto" w:fill="DBF8F5"/>
-        </w:rPr>
-        <w:t>• How a standardized modeling language improves communication</w:t>
-      </w:r>
-      <w:r>
-        <w:rPr>
-          <w:rFonts w:ascii="Aptos" w:hAnsi="Aptos"/>
-          <w:color w:val="000000"/>
-        </w:rPr>
-        <w:br/>
-      </w:r>
-      <w:r>
-        <w:rPr>
-          <w:rFonts w:ascii="Lucida Grande" w:hAnsi="Lucida Grande" w:cs="Lucida Grande"/>
-          <w:color w:val="000000"/>
-          <w:sz w:val="20"/>
-          <w:szCs w:val="20"/>
-          <w:shd w:val="clear" w:color="auto" w:fill="DBF8F5"/>
-        </w:rPr>
-        <w:t>• How to manage project requirements, risk, scheduling, and scope within an SE model</w:t>
-      </w:r>
-      <w:r>
-        <w:rPr>
-          <w:rFonts w:ascii="Aptos" w:hAnsi="Aptos"/>
-          <w:color w:val="000000"/>
-        </w:rPr>
-        <w:br/>
-      </w:r>
-      <w:r>
-        <w:rPr>
-          <w:rFonts w:ascii="Lucida Grande" w:hAnsi="Lucida Grande" w:cs="Lucida Grande"/>
-          <w:color w:val="000000"/>
-          <w:sz w:val="20"/>
-          <w:szCs w:val="20"/>
-          <w:shd w:val="clear" w:color="auto" w:fill="DBF8F5"/>
-        </w:rPr>
-        <w:t>• How an SE model that integrates PM aspects improves overall performance</w:t>
-      </w:r>
-    </w:p>
-    <w:p>
-      <w:pPr>
-        <w:rPr>
-          <w:rFonts w:ascii="Lucida Grande" w:hAnsi="Lucida Grande" w:cs="Lucida Grande"/>
-          <w:color w:val="000000"/>
-          <w:sz w:val="20"/>
-          <w:szCs w:val="20"/>
-          <w:shd w:val="clear" w:color="auto" w:fill="DBF8F5"/>
-        </w:rPr>
-      </w:pPr>
+          <w:rFonts w:ascii="Montserrat" w:hAnsi="Montserrat"/>
+          <w:b/>
+          <w:bCs/>
+        </w:rPr>
+      </w:pPr>
+      <w:r>
+        <w:rPr>
+          <w:rFonts w:ascii="Montserrat" w:hAnsi="Montserrat"/>
+          <w:b/>
+          <w:bCs/>
+        </w:rPr>
+        <w:t>Pre-</w:t>
+      </w:r>
+      <w:proofErr w:type="spellStart"/>
+      <w:r>
+        <w:rPr>
+          <w:rFonts w:ascii="Montserrat" w:hAnsi="Montserrat"/>
+          <w:b/>
+          <w:bCs/>
+        </w:rPr>
+        <w:t>reqs</w:t>
+      </w:r>
+      <w:proofErr w:type="spellEnd"/>
     </w:p>
     <w:p>
       <w:pPr>
@@ -145,9 +67,2537 @@
         </w:numPr>
       </w:pPr>
       <w:r>
-        <w:t>Create a new project named “</w:t>
-      </w:r>
-    </w:p>
+        <w:t xml:space="preserve">Create a </w:t>
+      </w:r>
+      <w:r>
+        <w:t>N</w:t>
+      </w:r>
+      <w:r>
+        <w:t xml:space="preserve">ew </w:t>
+      </w:r>
+      <w:r>
+        <w:t>P</w:t>
+      </w:r>
+      <w:r>
+        <w:t>roject named “</w:t>
+      </w:r>
+      <w:r>
+        <w:t>Cell Phone Model</w:t>
+      </w:r>
+      <w:r>
+        <w:t>”</w:t>
+      </w:r>
+    </w:p>
+    <w:p>
+      <w:pPr>
+        <w:rPr>
+          <w:rFonts w:ascii="Montserrat" w:hAnsi="Montserrat"/>
+          <w:b/>
+          <w:bCs/>
+        </w:rPr>
+      </w:pPr>
+      <w:r>
+        <w:rPr>
+          <w:rFonts w:ascii="Montserrat" w:hAnsi="Montserrat"/>
+          <w:b/>
+          <w:bCs/>
+        </w:rPr>
+        <w:t xml:space="preserve">Mod 4 - Requirements </w:t>
+      </w:r>
+      <w:r>
+        <w:rPr>
+          <w:rFonts w:ascii="Montserrat" w:hAnsi="Montserrat"/>
+          <w:b/>
+          <w:bCs/>
+        </w:rPr>
+        <w:t xml:space="preserve">Architecture </w:t>
+      </w:r>
+      <w:r>
+        <w:rPr>
+          <w:rFonts w:ascii="Montserrat" w:hAnsi="Montserrat"/>
+          <w:b/>
+          <w:bCs/>
+        </w:rPr>
+        <w:t>Lab</w:t>
+      </w:r>
+    </w:p>
+    <w:p>
+      <w:pPr>
+        <w:pStyle w:val="paragraph"/>
+        <w:numPr>
+          <w:ilvl w:val="0"/>
+          <w:numId w:val="6"/>
+        </w:numPr>
+        <w:spacing w:before="0" w:beforeAutospacing="0" w:after="0" w:afterAutospacing="0"/>
+        <w:textAlignment w:val="baseline"/>
+        <w:rPr>
+          <w:rStyle w:val="eop"/>
+          <w:rFonts w:asciiTheme="minorHAnsi" w:hAnsiTheme="minorHAnsi" w:cs="Calibri"/>
+          <w:sz w:val="22"/>
+          <w:szCs w:val="22"/>
+        </w:rPr>
+      </w:pPr>
+      <w:r>
+        <w:rPr>
+          <w:rStyle w:val="normaltextrun"/>
+          <w:rFonts w:asciiTheme="minorHAnsi" w:eastAsiaTheme="majorEastAsia" w:hAnsiTheme="minorHAnsi" w:cs="Calibri"/>
+          <w:sz w:val="22"/>
+          <w:szCs w:val="22"/>
+        </w:rPr>
+        <w:t xml:space="preserve">Create a </w:t>
+      </w:r>
+      <w:r>
+        <w:rPr>
+          <w:rStyle w:val="normaltextrun"/>
+          <w:rFonts w:asciiTheme="minorHAnsi" w:eastAsiaTheme="majorEastAsia" w:hAnsiTheme="minorHAnsi" w:cs="Calibri"/>
+          <w:i/>
+          <w:iCs/>
+          <w:sz w:val="22"/>
+          <w:szCs w:val="22"/>
+        </w:rPr>
+        <w:t>Requirements Document</w:t>
+      </w:r>
+      <w:r>
+        <w:rPr>
+          <w:rStyle w:val="normaltextrun"/>
+          <w:rFonts w:asciiTheme="minorHAnsi" w:eastAsiaTheme="majorEastAsia" w:hAnsiTheme="minorHAnsi" w:cs="Calibri"/>
+          <w:sz w:val="22"/>
+          <w:szCs w:val="22"/>
+        </w:rPr>
+        <w:t xml:space="preserve"> named “Cell Phone Stakeholder Needs”.</w:t>
+      </w:r>
+    </w:p>
+    <w:p>
+      <w:pPr>
+        <w:pStyle w:val="paragraph"/>
+        <w:numPr>
+          <w:ilvl w:val="0"/>
+          <w:numId w:val="6"/>
+        </w:numPr>
+        <w:spacing w:before="0" w:beforeAutospacing="0" w:after="0" w:afterAutospacing="0"/>
+        <w:textAlignment w:val="baseline"/>
+        <w:rPr>
+          <w:rStyle w:val="eop"/>
+          <w:rFonts w:asciiTheme="minorHAnsi" w:hAnsiTheme="minorHAnsi" w:cs="Calibri"/>
+          <w:sz w:val="22"/>
+          <w:szCs w:val="22"/>
+        </w:rPr>
+      </w:pPr>
+      <w:r>
+        <w:rPr>
+          <w:rStyle w:val="eop"/>
+          <w:rFonts w:asciiTheme="minorHAnsi" w:eastAsiaTheme="majorEastAsia" w:hAnsiTheme="minorHAnsi" w:cs="Calibri"/>
+          <w:sz w:val="22"/>
+          <w:szCs w:val="22"/>
+        </w:rPr>
+        <w:t>Add the following Requirements:</w:t>
+      </w:r>
+    </w:p>
+    <w:tbl>
+      <w:tblPr>
+        <w:tblStyle w:val="TableGrid"/>
+        <w:tblW w:w="0" w:type="auto"/>
+        <w:tblLook w:val="04A0" w:firstRow="1" w:lastRow="0" w:firstColumn="1" w:lastColumn="0" w:noHBand="0" w:noVBand="1"/>
+      </w:tblPr>
+      <w:tblGrid>
+        <w:gridCol w:w="1075"/>
+        <w:gridCol w:w="2700"/>
+        <w:gridCol w:w="5575"/>
+      </w:tblGrid>
+      <w:tr>
+        <w:tc>
+          <w:tcPr>
+            <w:tcW w:w="1075" w:type="dxa"/>
+          </w:tcPr>
+          <w:p>
+            <w:pPr>
+              <w:pStyle w:val="paragraph"/>
+              <w:spacing w:before="0" w:beforeAutospacing="0" w:after="0" w:afterAutospacing="0"/>
+              <w:textAlignment w:val="baseline"/>
+              <w:rPr>
+                <w:rFonts w:asciiTheme="minorHAnsi" w:hAnsiTheme="minorHAnsi" w:cs="Calibri"/>
+                <w:b/>
+                <w:bCs/>
+              </w:rPr>
+            </w:pPr>
+            <w:r>
+              <w:rPr>
+                <w:rFonts w:asciiTheme="minorHAnsi" w:hAnsiTheme="minorHAnsi" w:cs="Calibri"/>
+                <w:b/>
+                <w:bCs/>
+              </w:rPr>
+              <w:t>ID</w:t>
+            </w:r>
+          </w:p>
+        </w:tc>
+        <w:tc>
+          <w:tcPr>
+            <w:tcW w:w="2700" w:type="dxa"/>
+          </w:tcPr>
+          <w:p>
+            <w:pPr>
+              <w:pStyle w:val="paragraph"/>
+              <w:spacing w:before="0" w:beforeAutospacing="0" w:after="0" w:afterAutospacing="0"/>
+              <w:textAlignment w:val="baseline"/>
+              <w:rPr>
+                <w:rFonts w:asciiTheme="minorHAnsi" w:hAnsiTheme="minorHAnsi" w:cs="Calibri"/>
+                <w:b/>
+                <w:bCs/>
+              </w:rPr>
+            </w:pPr>
+            <w:r>
+              <w:rPr>
+                <w:rFonts w:asciiTheme="minorHAnsi" w:hAnsiTheme="minorHAnsi" w:cs="Calibri"/>
+                <w:b/>
+                <w:bCs/>
+              </w:rPr>
+              <w:t>Name</w:t>
+            </w:r>
+          </w:p>
+        </w:tc>
+        <w:tc>
+          <w:tcPr>
+            <w:tcW w:w="5575" w:type="dxa"/>
+          </w:tcPr>
+          <w:p>
+            <w:pPr>
+              <w:pStyle w:val="paragraph"/>
+              <w:spacing w:before="0" w:beforeAutospacing="0" w:after="0" w:afterAutospacing="0"/>
+              <w:textAlignment w:val="baseline"/>
+              <w:rPr>
+                <w:rFonts w:asciiTheme="minorHAnsi" w:hAnsiTheme="minorHAnsi" w:cs="Calibri"/>
+                <w:b/>
+                <w:bCs/>
+              </w:rPr>
+            </w:pPr>
+            <w:r>
+              <w:rPr>
+                <w:rFonts w:asciiTheme="minorHAnsi" w:hAnsiTheme="minorHAnsi" w:cs="Calibri"/>
+                <w:b/>
+                <w:bCs/>
+              </w:rPr>
+              <w:t>Text</w:t>
+            </w:r>
+          </w:p>
+        </w:tc>
+      </w:tr>
+      <w:tr>
+        <w:tc>
+          <w:tcPr>
+            <w:tcW w:w="1075" w:type="dxa"/>
+          </w:tcPr>
+          <w:p>
+            <w:pPr>
+              <w:pStyle w:val="paragraph"/>
+              <w:spacing w:before="0" w:beforeAutospacing="0" w:after="0" w:afterAutospacing="0"/>
+              <w:textAlignment w:val="baseline"/>
+              <w:rPr>
+                <w:rFonts w:asciiTheme="minorHAnsi" w:hAnsiTheme="minorHAnsi" w:cs="Calibri"/>
+              </w:rPr>
+            </w:pPr>
+            <w:r>
+              <w:rPr>
+                <w:rFonts w:asciiTheme="minorHAnsi" w:hAnsiTheme="minorHAnsi" w:cs="Calibri"/>
+              </w:rPr>
+              <w:t>SN-1</w:t>
+            </w:r>
+          </w:p>
+        </w:tc>
+        <w:tc>
+          <w:tcPr>
+            <w:tcW w:w="2700" w:type="dxa"/>
+          </w:tcPr>
+          <w:p>
+            <w:pPr>
+              <w:pStyle w:val="paragraph"/>
+              <w:spacing w:before="0" w:beforeAutospacing="0" w:after="0" w:afterAutospacing="0"/>
+              <w:textAlignment w:val="baseline"/>
+              <w:rPr>
+                <w:rFonts w:asciiTheme="minorHAnsi" w:hAnsiTheme="minorHAnsi" w:cs="Calibri"/>
+              </w:rPr>
+            </w:pPr>
+            <w:r>
+              <w:rPr>
+                <w:rFonts w:asciiTheme="minorHAnsi" w:hAnsiTheme="minorHAnsi" w:cs="Calibri"/>
+              </w:rPr>
+              <w:t>Voice Communications</w:t>
+            </w:r>
+          </w:p>
+        </w:tc>
+        <w:tc>
+          <w:tcPr>
+            <w:tcW w:w="5575" w:type="dxa"/>
+          </w:tcPr>
+          <w:p>
+            <w:pPr>
+              <w:pStyle w:val="NormalWeb"/>
+              <w:rPr>
+                <w:rFonts w:asciiTheme="minorHAnsi" w:hAnsiTheme="minorHAnsi"/>
+              </w:rPr>
+            </w:pPr>
+            <w:r>
+              <w:rPr>
+                <w:rFonts w:asciiTheme="minorHAnsi" w:hAnsiTheme="minorHAnsi"/>
+              </w:rPr>
+              <w:t>The cellphone will enable the user to engage in voice communication with someone else.</w:t>
+            </w:r>
+          </w:p>
+        </w:tc>
+      </w:tr>
+      <w:tr>
+        <w:tc>
+          <w:tcPr>
+            <w:tcW w:w="1075" w:type="dxa"/>
+          </w:tcPr>
+          <w:p>
+            <w:pPr>
+              <w:pStyle w:val="paragraph"/>
+              <w:spacing w:before="0" w:beforeAutospacing="0" w:after="0" w:afterAutospacing="0"/>
+              <w:textAlignment w:val="baseline"/>
+              <w:rPr>
+                <w:rFonts w:asciiTheme="minorHAnsi" w:hAnsiTheme="minorHAnsi" w:cs="Calibri"/>
+              </w:rPr>
+            </w:pPr>
+            <w:r>
+              <w:rPr>
+                <w:rFonts w:asciiTheme="minorHAnsi" w:hAnsiTheme="minorHAnsi" w:cs="Calibri"/>
+              </w:rPr>
+              <w:t>SN-2</w:t>
+            </w:r>
+          </w:p>
+        </w:tc>
+        <w:tc>
+          <w:tcPr>
+            <w:tcW w:w="2700" w:type="dxa"/>
+          </w:tcPr>
+          <w:p>
+            <w:pPr>
+              <w:pStyle w:val="paragraph"/>
+              <w:spacing w:before="0" w:beforeAutospacing="0" w:after="0" w:afterAutospacing="0"/>
+              <w:textAlignment w:val="baseline"/>
+              <w:rPr>
+                <w:rFonts w:asciiTheme="minorHAnsi" w:hAnsiTheme="minorHAnsi" w:cs="Calibri"/>
+              </w:rPr>
+            </w:pPr>
+            <w:r>
+              <w:rPr>
+                <w:rFonts w:asciiTheme="minorHAnsi" w:hAnsiTheme="minorHAnsi" w:cs="Calibri"/>
+              </w:rPr>
+              <w:t>Text Communications</w:t>
+            </w:r>
+          </w:p>
+        </w:tc>
+        <w:tc>
+          <w:tcPr>
+            <w:tcW w:w="5575" w:type="dxa"/>
+          </w:tcPr>
+          <w:p>
+            <w:pPr>
+              <w:pStyle w:val="paragraph"/>
+              <w:spacing w:before="0" w:beforeAutospacing="0" w:after="0" w:afterAutospacing="0"/>
+              <w:textAlignment w:val="baseline"/>
+              <w:rPr>
+                <w:rFonts w:asciiTheme="minorHAnsi" w:hAnsiTheme="minorHAnsi" w:cs="Calibri"/>
+              </w:rPr>
+            </w:pPr>
+            <w:r>
+              <w:rPr>
+                <w:rFonts w:asciiTheme="minorHAnsi" w:hAnsiTheme="minorHAnsi" w:cs="Arial"/>
+                <w:color w:val="2B2B3A"/>
+                <w:shd w:val="clear" w:color="auto" w:fill="FFFFFF"/>
+              </w:rPr>
+              <w:t>The cellphone will enable the user to engage in textual communications with someone else.</w:t>
+            </w:r>
+          </w:p>
+        </w:tc>
+      </w:tr>
+      <w:tr>
+        <w:tc>
+          <w:tcPr>
+            <w:tcW w:w="1075" w:type="dxa"/>
+          </w:tcPr>
+          <w:p>
+            <w:pPr>
+              <w:pStyle w:val="paragraph"/>
+              <w:spacing w:before="0" w:beforeAutospacing="0" w:after="0" w:afterAutospacing="0"/>
+              <w:textAlignment w:val="baseline"/>
+              <w:rPr>
+                <w:rFonts w:asciiTheme="minorHAnsi" w:hAnsiTheme="minorHAnsi" w:cs="Calibri"/>
+              </w:rPr>
+            </w:pPr>
+            <w:r>
+              <w:rPr>
+                <w:rFonts w:asciiTheme="minorHAnsi" w:hAnsiTheme="minorHAnsi" w:cs="Calibri"/>
+              </w:rPr>
+              <w:t>SN-3</w:t>
+            </w:r>
+          </w:p>
+        </w:tc>
+        <w:tc>
+          <w:tcPr>
+            <w:tcW w:w="2700" w:type="dxa"/>
+          </w:tcPr>
+          <w:p>
+            <w:pPr>
+              <w:pStyle w:val="paragraph"/>
+              <w:spacing w:before="0" w:beforeAutospacing="0" w:after="0" w:afterAutospacing="0"/>
+              <w:textAlignment w:val="baseline"/>
+              <w:rPr>
+                <w:rFonts w:asciiTheme="minorHAnsi" w:hAnsiTheme="minorHAnsi" w:cs="Calibri"/>
+              </w:rPr>
+            </w:pPr>
+            <w:r>
+              <w:rPr>
+                <w:rFonts w:asciiTheme="minorHAnsi" w:hAnsiTheme="minorHAnsi" w:cs="Calibri"/>
+              </w:rPr>
+              <w:t>Play Videos</w:t>
+            </w:r>
+          </w:p>
+        </w:tc>
+        <w:tc>
+          <w:tcPr>
+            <w:tcW w:w="5575" w:type="dxa"/>
+          </w:tcPr>
+          <w:p>
+            <w:pPr>
+              <w:pStyle w:val="paragraph"/>
+              <w:spacing w:before="0" w:beforeAutospacing="0" w:after="0" w:afterAutospacing="0"/>
+              <w:textAlignment w:val="baseline"/>
+              <w:rPr>
+                <w:rFonts w:asciiTheme="minorHAnsi" w:hAnsiTheme="minorHAnsi" w:cs="Calibri"/>
+              </w:rPr>
+            </w:pPr>
+            <w:r>
+              <w:rPr>
+                <w:rFonts w:asciiTheme="minorHAnsi" w:hAnsiTheme="minorHAnsi" w:cs="Arial"/>
+                <w:color w:val="2B2B3A"/>
+                <w:shd w:val="clear" w:color="auto" w:fill="FFFFFF"/>
+              </w:rPr>
+              <w:t>The cellphone will enable the user to watch videos.</w:t>
+            </w:r>
+          </w:p>
+        </w:tc>
+      </w:tr>
+      <w:tr>
+        <w:tc>
+          <w:tcPr>
+            <w:tcW w:w="1075" w:type="dxa"/>
+          </w:tcPr>
+          <w:p>
+            <w:pPr>
+              <w:pStyle w:val="paragraph"/>
+              <w:spacing w:before="0" w:beforeAutospacing="0" w:after="0" w:afterAutospacing="0"/>
+              <w:textAlignment w:val="baseline"/>
+              <w:rPr>
+                <w:rFonts w:asciiTheme="minorHAnsi" w:hAnsiTheme="minorHAnsi" w:cs="Calibri"/>
+              </w:rPr>
+            </w:pPr>
+            <w:r>
+              <w:rPr>
+                <w:rFonts w:asciiTheme="minorHAnsi" w:hAnsiTheme="minorHAnsi" w:cs="Calibri"/>
+              </w:rPr>
+              <w:t>SN-4</w:t>
+            </w:r>
+          </w:p>
+        </w:tc>
+        <w:tc>
+          <w:tcPr>
+            <w:tcW w:w="2700" w:type="dxa"/>
+          </w:tcPr>
+          <w:p>
+            <w:pPr>
+              <w:pStyle w:val="paragraph"/>
+              <w:spacing w:before="0" w:beforeAutospacing="0" w:after="0" w:afterAutospacing="0"/>
+              <w:textAlignment w:val="baseline"/>
+              <w:rPr>
+                <w:rFonts w:asciiTheme="minorHAnsi" w:hAnsiTheme="minorHAnsi" w:cs="Calibri"/>
+              </w:rPr>
+            </w:pPr>
+            <w:r>
+              <w:rPr>
+                <w:rFonts w:asciiTheme="minorHAnsi" w:hAnsiTheme="minorHAnsi" w:cs="Calibri"/>
+              </w:rPr>
+              <w:t>Listen to Music</w:t>
+            </w:r>
+          </w:p>
+        </w:tc>
+        <w:tc>
+          <w:tcPr>
+            <w:tcW w:w="5575" w:type="dxa"/>
+          </w:tcPr>
+          <w:p>
+            <w:pPr>
+              <w:pStyle w:val="paragraph"/>
+              <w:spacing w:before="0" w:beforeAutospacing="0" w:after="0" w:afterAutospacing="0"/>
+              <w:textAlignment w:val="baseline"/>
+              <w:rPr>
+                <w:rFonts w:asciiTheme="minorHAnsi" w:hAnsiTheme="minorHAnsi" w:cs="Calibri"/>
+              </w:rPr>
+            </w:pPr>
+            <w:r>
+              <w:rPr>
+                <w:rFonts w:asciiTheme="minorHAnsi" w:hAnsiTheme="minorHAnsi" w:cs="Arial"/>
+                <w:color w:val="2B2B3A"/>
+                <w:shd w:val="clear" w:color="auto" w:fill="FFFFFF"/>
+              </w:rPr>
+              <w:t>The cellphone will enable the user to listen to music.</w:t>
+            </w:r>
+          </w:p>
+        </w:tc>
+      </w:tr>
+      <w:tr>
+        <w:tc>
+          <w:tcPr>
+            <w:tcW w:w="1075" w:type="dxa"/>
+          </w:tcPr>
+          <w:p>
+            <w:pPr>
+              <w:pStyle w:val="paragraph"/>
+              <w:spacing w:before="0" w:beforeAutospacing="0" w:after="0" w:afterAutospacing="0"/>
+              <w:textAlignment w:val="baseline"/>
+              <w:rPr>
+                <w:rFonts w:asciiTheme="minorHAnsi" w:hAnsiTheme="minorHAnsi" w:cs="Calibri"/>
+              </w:rPr>
+            </w:pPr>
+            <w:r>
+              <w:rPr>
+                <w:rFonts w:asciiTheme="minorHAnsi" w:hAnsiTheme="minorHAnsi" w:cs="Calibri"/>
+              </w:rPr>
+              <w:t>SN-5</w:t>
+            </w:r>
+          </w:p>
+        </w:tc>
+        <w:tc>
+          <w:tcPr>
+            <w:tcW w:w="2700" w:type="dxa"/>
+          </w:tcPr>
+          <w:p>
+            <w:pPr>
+              <w:pStyle w:val="paragraph"/>
+              <w:spacing w:before="0" w:beforeAutospacing="0" w:after="0" w:afterAutospacing="0"/>
+              <w:textAlignment w:val="baseline"/>
+              <w:rPr>
+                <w:rFonts w:asciiTheme="minorHAnsi" w:hAnsiTheme="minorHAnsi" w:cs="Calibri"/>
+              </w:rPr>
+            </w:pPr>
+            <w:r>
+              <w:rPr>
+                <w:rFonts w:asciiTheme="minorHAnsi" w:hAnsiTheme="minorHAnsi" w:cs="Calibri"/>
+              </w:rPr>
+              <w:t>Access Internet</w:t>
+            </w:r>
+          </w:p>
+        </w:tc>
+        <w:tc>
+          <w:tcPr>
+            <w:tcW w:w="5575" w:type="dxa"/>
+          </w:tcPr>
+          <w:p>
+            <w:pPr>
+              <w:pStyle w:val="paragraph"/>
+              <w:spacing w:before="0" w:beforeAutospacing="0" w:after="0" w:afterAutospacing="0"/>
+              <w:textAlignment w:val="baseline"/>
+              <w:rPr>
+                <w:rFonts w:asciiTheme="minorHAnsi" w:hAnsiTheme="minorHAnsi" w:cs="Calibri"/>
+              </w:rPr>
+            </w:pPr>
+            <w:r>
+              <w:rPr>
+                <w:rFonts w:asciiTheme="minorHAnsi" w:hAnsiTheme="minorHAnsi" w:cs="Arial"/>
+                <w:color w:val="2B2B3A"/>
+                <w:shd w:val="clear" w:color="auto" w:fill="FFFFFF"/>
+              </w:rPr>
+              <w:t>The cellphone will enable the user to access the internet, and all websites on the internet.</w:t>
+            </w:r>
+          </w:p>
+        </w:tc>
+      </w:tr>
+    </w:tbl>
+    <w:p>
+      <w:pPr>
+        <w:pStyle w:val="paragraph"/>
+        <w:spacing w:before="0" w:beforeAutospacing="0" w:after="0" w:afterAutospacing="0"/>
+        <w:textAlignment w:val="baseline"/>
+        <w:rPr>
+          <w:rFonts w:asciiTheme="minorHAnsi" w:hAnsiTheme="minorHAnsi" w:cs="Calibri"/>
+          <w:sz w:val="22"/>
+          <w:szCs w:val="22"/>
+        </w:rPr>
+      </w:pPr>
+    </w:p>
+    <w:p>
+      <w:pPr>
+        <w:pStyle w:val="paragraph"/>
+        <w:numPr>
+          <w:ilvl w:val="0"/>
+          <w:numId w:val="6"/>
+        </w:numPr>
+        <w:spacing w:before="0" w:beforeAutospacing="0" w:after="0" w:afterAutospacing="0"/>
+        <w:textAlignment w:val="baseline"/>
+        <w:rPr>
+          <w:rStyle w:val="normaltextrun"/>
+          <w:rFonts w:asciiTheme="minorHAnsi" w:hAnsiTheme="minorHAnsi" w:cs="Calibri"/>
+          <w:sz w:val="22"/>
+          <w:szCs w:val="22"/>
+        </w:rPr>
+      </w:pPr>
+      <w:r>
+        <w:rPr>
+          <w:rStyle w:val="normaltextrun"/>
+          <w:rFonts w:asciiTheme="minorHAnsi" w:hAnsiTheme="minorHAnsi" w:cs="Calibri"/>
+          <w:sz w:val="22"/>
+          <w:szCs w:val="22"/>
+        </w:rPr>
+        <w:t>To add a new Label, go to the Schema Editor from the top-left “MENU” drop-down.</w:t>
+      </w:r>
+    </w:p>
+    <w:p>
+      <w:pPr>
+        <w:pStyle w:val="paragraph"/>
+        <w:spacing w:before="0" w:beforeAutospacing="0" w:after="0" w:afterAutospacing="0"/>
+        <w:ind w:left="720"/>
+        <w:jc w:val="center"/>
+        <w:textAlignment w:val="baseline"/>
+        <w:rPr>
+          <w:rStyle w:val="normaltextrun"/>
+          <w:rFonts w:asciiTheme="minorHAnsi" w:hAnsiTheme="minorHAnsi" w:cs="Calibri"/>
+          <w:sz w:val="22"/>
+          <w:szCs w:val="22"/>
+        </w:rPr>
+      </w:pPr>
+      <w:r>
+        <w:rPr>
+          <w:rStyle w:val="normaltextrun"/>
+          <w:rFonts w:asciiTheme="minorHAnsi" w:hAnsiTheme="minorHAnsi" w:cs="Calibri"/>
+          <w:sz w:val="22"/>
+          <w:szCs w:val="22"/>
+        </w:rPr>
+        <w:drawing>
+          <wp:inline distT="0" distB="0" distL="0" distR="0" wp14:anchorId="0FD18657" wp14:editId="7115C4AF">
+            <wp:extent cx="1762672" cy="3009600"/>
+            <wp:effectExtent l="0" t="0" r="3175" b="635"/>
+            <wp:docPr id="581857390" name="Picture 1" descr="A screenshot of a computer&#10;&#10;AI-generated content may be incorrect."/>
+            <wp:cNvGraphicFramePr>
+              <a:graphicFrameLocks xmlns:a="http://schemas.openxmlformats.org/drawingml/2006/main" noChangeAspect="1"/>
+            </wp:cNvGraphicFramePr>
+            <a:graphic xmlns:a="http://schemas.openxmlformats.org/drawingml/2006/main">
+              <a:graphicData uri="http://schemas.openxmlformats.org/drawingml/2006/picture">
+                <pic:pic xmlns:pic="http://schemas.openxmlformats.org/drawingml/2006/picture">
+                  <pic:nvPicPr>
+                    <pic:cNvPr id="581857390" name="Picture 1" descr="A screenshot of a computer&#10;&#10;AI-generated content may be incorrect."/>
+                    <pic:cNvPicPr/>
+                  </pic:nvPicPr>
+                  <pic:blipFill>
+                    <a:blip r:embed="rId6"/>
+                    <a:stretch>
+                      <a:fillRect/>
+                    </a:stretch>
+                  </pic:blipFill>
+                  <pic:spPr>
+                    <a:xfrm>
+                      <a:off x="0" y="0"/>
+                      <a:ext cx="1768874" cy="3020189"/>
+                    </a:xfrm>
+                    <a:prstGeom prst="rect">
+                      <a:avLst/>
+                    </a:prstGeom>
+                  </pic:spPr>
+                </pic:pic>
+              </a:graphicData>
+            </a:graphic>
+          </wp:inline>
+        </w:drawing>
+      </w:r>
+    </w:p>
+    <w:p>
+      <w:pPr>
+        <w:pStyle w:val="paragraph"/>
+        <w:numPr>
+          <w:ilvl w:val="0"/>
+          <w:numId w:val="6"/>
+        </w:numPr>
+        <w:spacing w:before="0" w:beforeAutospacing="0" w:after="0" w:afterAutospacing="0"/>
+        <w:textAlignment w:val="baseline"/>
+        <w:rPr>
+          <w:rStyle w:val="normaltextrun"/>
+          <w:rFonts w:asciiTheme="minorHAnsi" w:hAnsiTheme="minorHAnsi" w:cs="Calibri"/>
+          <w:sz w:val="22"/>
+          <w:szCs w:val="22"/>
+        </w:rPr>
+      </w:pPr>
+      <w:r>
+        <w:rPr>
+          <w:rStyle w:val="normaltextrun"/>
+          <w:rFonts w:asciiTheme="minorHAnsi" w:hAnsiTheme="minorHAnsi" w:cs="Calibri"/>
+          <w:sz w:val="22"/>
+          <w:szCs w:val="22"/>
+        </w:rPr>
+        <w:t>Add a new Label named “Stakeholder Need”.</w:t>
+      </w:r>
+    </w:p>
+    <w:p>
+      <w:pPr>
+        <w:pStyle w:val="paragraph"/>
+        <w:spacing w:before="0" w:beforeAutospacing="0" w:after="0" w:afterAutospacing="0"/>
+        <w:ind w:left="720"/>
+        <w:jc w:val="center"/>
+        <w:textAlignment w:val="baseline"/>
+        <w:rPr>
+          <w:rStyle w:val="normaltextrun"/>
+          <w:rFonts w:asciiTheme="minorHAnsi" w:hAnsiTheme="minorHAnsi" w:cs="Calibri"/>
+          <w:sz w:val="22"/>
+          <w:szCs w:val="22"/>
+        </w:rPr>
+      </w:pPr>
+      <w:r>
+        <w:rPr>
+          <w:rStyle w:val="normaltextrun"/>
+          <w:rFonts w:asciiTheme="minorHAnsi" w:hAnsiTheme="minorHAnsi" w:cs="Calibri"/>
+          <w:sz w:val="22"/>
+          <w:szCs w:val="22"/>
+        </w:rPr>
+        <w:lastRenderedPageBreak/>
+        <w:drawing>
+          <wp:inline distT="0" distB="0" distL="0" distR="0" wp14:anchorId="7DCE7178" wp14:editId="5685279D">
+            <wp:extent cx="4201200" cy="1293126"/>
+            <wp:effectExtent l="12700" t="12700" r="15240" b="15240"/>
+            <wp:docPr id="802940776" name="Picture 1" descr="A screenshot of a phone&#10;&#10;AI-generated content may be incorrect."/>
+            <wp:cNvGraphicFramePr>
+              <a:graphicFrameLocks xmlns:a="http://schemas.openxmlformats.org/drawingml/2006/main" noChangeAspect="1"/>
+            </wp:cNvGraphicFramePr>
+            <a:graphic xmlns:a="http://schemas.openxmlformats.org/drawingml/2006/main">
+              <a:graphicData uri="http://schemas.openxmlformats.org/drawingml/2006/picture">
+                <pic:pic xmlns:pic="http://schemas.openxmlformats.org/drawingml/2006/picture">
+                  <pic:nvPicPr>
+                    <pic:cNvPr id="802940776" name="Picture 1" descr="A screenshot of a phone&#10;&#10;AI-generated content may be incorrect."/>
+                    <pic:cNvPicPr/>
+                  </pic:nvPicPr>
+                  <pic:blipFill>
+                    <a:blip r:embed="rId7"/>
+                    <a:stretch>
+                      <a:fillRect/>
+                    </a:stretch>
+                  </pic:blipFill>
+                  <pic:spPr>
+                    <a:xfrm>
+                      <a:off x="0" y="0"/>
+                      <a:ext cx="4235457" cy="1303670"/>
+                    </a:xfrm>
+                    <a:prstGeom prst="rect">
+                      <a:avLst/>
+                    </a:prstGeom>
+                    <a:ln>
+                      <a:solidFill>
+                        <a:schemeClr val="tx1"/>
+                      </a:solidFill>
+                    </a:ln>
+                  </pic:spPr>
+                </pic:pic>
+              </a:graphicData>
+            </a:graphic>
+          </wp:inline>
+        </w:drawing>
+      </w:r>
+    </w:p>
+    <w:p>
+      <w:pPr>
+        <w:pStyle w:val="paragraph"/>
+        <w:numPr>
+          <w:ilvl w:val="0"/>
+          <w:numId w:val="6"/>
+        </w:numPr>
+        <w:spacing w:before="0" w:beforeAutospacing="0" w:after="0" w:afterAutospacing="0"/>
+        <w:textAlignment w:val="baseline"/>
+        <w:rPr>
+          <w:rStyle w:val="normaltextrun"/>
+          <w:rFonts w:asciiTheme="minorHAnsi" w:hAnsiTheme="minorHAnsi" w:cs="Calibri"/>
+          <w:sz w:val="22"/>
+          <w:szCs w:val="22"/>
+        </w:rPr>
+      </w:pPr>
+      <w:r>
+        <w:rPr>
+          <w:rStyle w:val="normaltextrun"/>
+          <w:rFonts w:asciiTheme="minorHAnsi" w:hAnsiTheme="minorHAnsi" w:cs="Calibri"/>
+          <w:sz w:val="22"/>
+          <w:szCs w:val="22"/>
+        </w:rPr>
+        <w:t>Select the Requirement asset as the “Class(es)” field and select “Save”.</w:t>
+      </w:r>
+    </w:p>
+    <w:p>
+      <w:pPr>
+        <w:pStyle w:val="paragraph"/>
+        <w:spacing w:before="0" w:beforeAutospacing="0" w:after="0" w:afterAutospacing="0"/>
+        <w:ind w:left="720"/>
+        <w:jc w:val="center"/>
+        <w:textAlignment w:val="baseline"/>
+        <w:rPr>
+          <w:rStyle w:val="normaltextrun"/>
+          <w:rFonts w:asciiTheme="minorHAnsi" w:hAnsiTheme="minorHAnsi" w:cs="Calibri"/>
+          <w:sz w:val="22"/>
+          <w:szCs w:val="22"/>
+        </w:rPr>
+      </w:pPr>
+      <w:r>
+        <w:rPr>
+          <w:rStyle w:val="normaltextrun"/>
+          <w:rFonts w:asciiTheme="minorHAnsi" w:hAnsiTheme="minorHAnsi" w:cs="Calibri"/>
+          <w:sz w:val="22"/>
+          <w:szCs w:val="22"/>
+        </w:rPr>
+        <w:drawing>
+          <wp:inline distT="0" distB="0" distL="0" distR="0" wp14:anchorId="7978DEAB" wp14:editId="71E9470E">
+            <wp:extent cx="3981600" cy="2034615"/>
+            <wp:effectExtent l="12700" t="12700" r="19050" b="10160"/>
+            <wp:docPr id="1841036496" name="Picture 1" descr="A screenshot of a computer&#10;&#10;AI-generated content may be incorrect."/>
+            <wp:cNvGraphicFramePr>
+              <a:graphicFrameLocks xmlns:a="http://schemas.openxmlformats.org/drawingml/2006/main" noChangeAspect="1"/>
+            </wp:cNvGraphicFramePr>
+            <a:graphic xmlns:a="http://schemas.openxmlformats.org/drawingml/2006/main">
+              <a:graphicData uri="http://schemas.openxmlformats.org/drawingml/2006/picture">
+                <pic:pic xmlns:pic="http://schemas.openxmlformats.org/drawingml/2006/picture">
+                  <pic:nvPicPr>
+                    <pic:cNvPr id="1841036496" name="Picture 1" descr="A screenshot of a computer&#10;&#10;AI-generated content may be incorrect."/>
+                    <pic:cNvPicPr/>
+                  </pic:nvPicPr>
+                  <pic:blipFill>
+                    <a:blip r:embed="rId8"/>
+                    <a:stretch>
+                      <a:fillRect/>
+                    </a:stretch>
+                  </pic:blipFill>
+                  <pic:spPr>
+                    <a:xfrm>
+                      <a:off x="0" y="0"/>
+                      <a:ext cx="4006197" cy="2047184"/>
+                    </a:xfrm>
+                    <a:prstGeom prst="rect">
+                      <a:avLst/>
+                    </a:prstGeom>
+                    <a:ln>
+                      <a:solidFill>
+                        <a:schemeClr val="tx1"/>
+                      </a:solidFill>
+                    </a:ln>
+                  </pic:spPr>
+                </pic:pic>
+              </a:graphicData>
+            </a:graphic>
+          </wp:inline>
+        </w:drawing>
+      </w:r>
+    </w:p>
+    <w:p>
+      <w:pPr>
+        <w:pStyle w:val="paragraph"/>
+        <w:numPr>
+          <w:ilvl w:val="0"/>
+          <w:numId w:val="6"/>
+        </w:numPr>
+        <w:spacing w:before="0" w:beforeAutospacing="0" w:after="0" w:afterAutospacing="0"/>
+        <w:textAlignment w:val="baseline"/>
+        <w:rPr>
+          <w:rStyle w:val="normaltextrun"/>
+          <w:rFonts w:asciiTheme="minorHAnsi" w:hAnsiTheme="minorHAnsi" w:cs="Calibri"/>
+          <w:sz w:val="22"/>
+          <w:szCs w:val="22"/>
+        </w:rPr>
+      </w:pPr>
+      <w:r>
+        <w:rPr>
+          <w:rStyle w:val="normaltextrun"/>
+          <w:rFonts w:asciiTheme="minorHAnsi" w:hAnsiTheme="minorHAnsi" w:cs="Calibri"/>
+          <w:sz w:val="22"/>
+          <w:szCs w:val="22"/>
+        </w:rPr>
+        <w:t xml:space="preserve">Navigate to the Database View. Select SN-1. Select the Metadata panel and </w:t>
+      </w:r>
+      <w:r>
+        <w:rPr>
+          <w:rStyle w:val="normaltextrun"/>
+          <w:rFonts w:asciiTheme="minorHAnsi" w:hAnsiTheme="minorHAnsi" w:cs="Calibri"/>
+          <w:sz w:val="22"/>
+          <w:szCs w:val="22"/>
+        </w:rPr>
+        <w:t>click the + next to the “Stakeholder Need” label. Repeat this for SN-2 through SN-5.</w:t>
+      </w:r>
+    </w:p>
+    <w:p>
+      <w:pPr>
+        <w:pStyle w:val="paragraph"/>
+        <w:numPr>
+          <w:ilvl w:val="0"/>
+          <w:numId w:val="6"/>
+        </w:numPr>
+        <w:spacing w:before="0" w:beforeAutospacing="0" w:after="0" w:afterAutospacing="0"/>
+        <w:textAlignment w:val="baseline"/>
+        <w:rPr>
+          <w:rStyle w:val="normaltextrun"/>
+          <w:rFonts w:asciiTheme="minorHAnsi" w:hAnsiTheme="minorHAnsi" w:cs="Calibri"/>
+          <w:sz w:val="22"/>
+          <w:szCs w:val="22"/>
+        </w:rPr>
+      </w:pPr>
+      <w:r>
+        <w:rPr>
+          <w:rStyle w:val="normaltextrun"/>
+          <w:rFonts w:asciiTheme="minorHAnsi" w:hAnsiTheme="minorHAnsi" w:cs="Calibri"/>
+          <w:sz w:val="22"/>
+          <w:szCs w:val="22"/>
+        </w:rPr>
+        <w:t>Return to the “Cell Phone Stakeholder Needs” Requirements Diagram and select the wrench in the top-right. From the drop-down select “Display Options”.</w:t>
+      </w:r>
+    </w:p>
+    <w:p>
+      <w:pPr>
+        <w:pStyle w:val="paragraph"/>
+        <w:numPr>
+          <w:ilvl w:val="0"/>
+          <w:numId w:val="6"/>
+        </w:numPr>
+        <w:spacing w:before="0" w:beforeAutospacing="0" w:after="0" w:afterAutospacing="0"/>
+        <w:textAlignment w:val="baseline"/>
+        <w:rPr>
+          <w:rStyle w:val="normaltextrun"/>
+          <w:rFonts w:asciiTheme="minorHAnsi" w:hAnsiTheme="minorHAnsi" w:cs="Calibri"/>
+          <w:sz w:val="22"/>
+          <w:szCs w:val="22"/>
+        </w:rPr>
+      </w:pPr>
+      <w:r>
+        <w:rPr>
+          <w:rStyle w:val="normaltextrun"/>
+          <w:rFonts w:asciiTheme="minorHAnsi" w:hAnsiTheme="minorHAnsi" w:cs="Calibri"/>
+          <w:sz w:val="22"/>
+          <w:szCs w:val="22"/>
+        </w:rPr>
+        <w:t>Remove the “Rationale Column” from the “Display Attributes Columns” field as shown:</w:t>
+      </w:r>
+    </w:p>
+    <w:p>
+      <w:pPr>
+        <w:pStyle w:val="paragraph"/>
+        <w:spacing w:before="0" w:beforeAutospacing="0" w:after="0" w:afterAutospacing="0"/>
+        <w:ind w:left="720"/>
+        <w:textAlignment w:val="baseline"/>
+        <w:rPr>
+          <w:rStyle w:val="normaltextrun"/>
+          <w:rFonts w:asciiTheme="minorHAnsi" w:hAnsiTheme="minorHAnsi" w:cs="Calibri"/>
+          <w:sz w:val="22"/>
+          <w:szCs w:val="22"/>
+        </w:rPr>
+      </w:pPr>
+    </w:p>
+    <w:p>
+      <w:pPr>
+        <w:pStyle w:val="paragraph"/>
+        <w:spacing w:before="0" w:beforeAutospacing="0" w:after="0" w:afterAutospacing="0"/>
+        <w:jc w:val="center"/>
+        <w:textAlignment w:val="baseline"/>
+        <w:rPr>
+          <w:rStyle w:val="normaltextrun"/>
+          <w:rFonts w:asciiTheme="minorHAnsi" w:hAnsiTheme="minorHAnsi" w:cs="Calibri"/>
+          <w:sz w:val="22"/>
+          <w:szCs w:val="22"/>
+        </w:rPr>
+      </w:pPr>
+      <w:r>
+        <w:rPr>
+          <w:rStyle w:val="normaltextrun"/>
+          <w:rFonts w:asciiTheme="minorHAnsi" w:hAnsiTheme="minorHAnsi" w:cs="Calibri"/>
+          <w:sz w:val="22"/>
+          <w:szCs w:val="22"/>
+        </w:rPr>
+        <w:drawing>
+          <wp:inline distT="0" distB="0" distL="0" distR="0" wp14:anchorId="61440294" wp14:editId="58A6C226">
+            <wp:extent cx="3276000" cy="1279600"/>
+            <wp:effectExtent l="12700" t="12700" r="13335" b="15875"/>
+            <wp:docPr id="1750218509" name="Picture 1" descr="A screenshot of a computer&#10;&#10;AI-generated content may be incorrect."/>
+            <wp:cNvGraphicFramePr>
+              <a:graphicFrameLocks xmlns:a="http://schemas.openxmlformats.org/drawingml/2006/main" noChangeAspect="1"/>
+            </wp:cNvGraphicFramePr>
+            <a:graphic xmlns:a="http://schemas.openxmlformats.org/drawingml/2006/main">
+              <a:graphicData uri="http://schemas.openxmlformats.org/drawingml/2006/picture">
+                <pic:pic xmlns:pic="http://schemas.openxmlformats.org/drawingml/2006/picture">
+                  <pic:nvPicPr>
+                    <pic:cNvPr id="1750218509" name="Picture 1" descr="A screenshot of a computer&#10;&#10;AI-generated content may be incorrect."/>
+                    <pic:cNvPicPr/>
+                  </pic:nvPicPr>
+                  <pic:blipFill>
+                    <a:blip r:embed="rId9"/>
+                    <a:stretch>
+                      <a:fillRect/>
+                    </a:stretch>
+                  </pic:blipFill>
+                  <pic:spPr>
+                    <a:xfrm>
+                      <a:off x="0" y="0"/>
+                      <a:ext cx="3330051" cy="1300712"/>
+                    </a:xfrm>
+                    <a:prstGeom prst="rect">
+                      <a:avLst/>
+                    </a:prstGeom>
+                    <a:ln>
+                      <a:solidFill>
+                        <a:schemeClr val="tx1"/>
+                      </a:solidFill>
+                    </a:ln>
+                  </pic:spPr>
+                </pic:pic>
+              </a:graphicData>
+            </a:graphic>
+          </wp:inline>
+        </w:drawing>
+      </w:r>
+    </w:p>
+    <w:p>
+      <w:pPr>
+        <w:pStyle w:val="paragraph"/>
+        <w:spacing w:before="0" w:beforeAutospacing="0" w:after="0" w:afterAutospacing="0"/>
+        <w:textAlignment w:val="baseline"/>
+        <w:rPr>
+          <w:rStyle w:val="normaltextrun"/>
+          <w:rFonts w:asciiTheme="minorHAnsi" w:hAnsiTheme="minorHAnsi" w:cs="Calibri"/>
+          <w:sz w:val="22"/>
+          <w:szCs w:val="22"/>
+        </w:rPr>
+      </w:pPr>
+    </w:p>
+    <w:p>
+      <w:pPr>
+        <w:pStyle w:val="paragraph"/>
+        <w:numPr>
+          <w:ilvl w:val="0"/>
+          <w:numId w:val="6"/>
+        </w:numPr>
+        <w:spacing w:before="0" w:beforeAutospacing="0" w:after="0" w:afterAutospacing="0"/>
+        <w:textAlignment w:val="baseline"/>
+        <w:rPr>
+          <w:rStyle w:val="normaltextrun"/>
+          <w:rFonts w:asciiTheme="minorHAnsi" w:hAnsiTheme="minorHAnsi" w:cs="Calibri"/>
+          <w:sz w:val="22"/>
+          <w:szCs w:val="22"/>
+        </w:rPr>
+      </w:pPr>
+      <w:r>
+        <w:rPr>
+          <w:rStyle w:val="normaltextrun"/>
+          <w:rFonts w:asciiTheme="minorHAnsi" w:hAnsiTheme="minorHAnsi" w:cs="Calibri"/>
+          <w:sz w:val="22"/>
+          <w:szCs w:val="22"/>
+        </w:rPr>
+        <w:t>The document should now look like this:</w:t>
+      </w:r>
+    </w:p>
+    <w:p>
+      <w:pPr>
+        <w:pStyle w:val="paragraph"/>
+        <w:spacing w:before="0" w:beforeAutospacing="0" w:after="0" w:afterAutospacing="0"/>
+        <w:ind w:left="720"/>
+        <w:jc w:val="center"/>
+        <w:textAlignment w:val="baseline"/>
+        <w:rPr>
+          <w:rStyle w:val="normaltextrun"/>
+          <w:rFonts w:asciiTheme="minorHAnsi" w:hAnsiTheme="minorHAnsi" w:cs="Calibri"/>
+          <w:sz w:val="22"/>
+          <w:szCs w:val="22"/>
+        </w:rPr>
+      </w:pPr>
+      <w:r>
+        <w:rPr>
+          <w:rStyle w:val="normaltextrun"/>
+          <w:rFonts w:asciiTheme="minorHAnsi" w:hAnsiTheme="minorHAnsi" w:cs="Calibri"/>
+          <w:sz w:val="22"/>
+          <w:szCs w:val="22"/>
+        </w:rPr>
+        <w:lastRenderedPageBreak/>
+        <w:drawing>
+          <wp:inline distT="0" distB="0" distL="0" distR="0" wp14:anchorId="7D30B1F4" wp14:editId="5B5291AA">
+            <wp:extent cx="3312000" cy="2084508"/>
+            <wp:effectExtent l="12700" t="12700" r="15875" b="11430"/>
+            <wp:docPr id="763850981" name="Picture 1" descr="A screenshot of a computer&#10;&#10;AI-generated content may be incorrect."/>
+            <wp:cNvGraphicFramePr>
+              <a:graphicFrameLocks xmlns:a="http://schemas.openxmlformats.org/drawingml/2006/main" noChangeAspect="1"/>
+            </wp:cNvGraphicFramePr>
+            <a:graphic xmlns:a="http://schemas.openxmlformats.org/drawingml/2006/main">
+              <a:graphicData uri="http://schemas.openxmlformats.org/drawingml/2006/picture">
+                <pic:pic xmlns:pic="http://schemas.openxmlformats.org/drawingml/2006/picture">
+                  <pic:nvPicPr>
+                    <pic:cNvPr id="763850981" name="Picture 1" descr="A screenshot of a computer&#10;&#10;AI-generated content may be incorrect."/>
+                    <pic:cNvPicPr/>
+                  </pic:nvPicPr>
+                  <pic:blipFill>
+                    <a:blip r:embed="rId10"/>
+                    <a:stretch>
+                      <a:fillRect/>
+                    </a:stretch>
+                  </pic:blipFill>
+                  <pic:spPr>
+                    <a:xfrm>
+                      <a:off x="0" y="0"/>
+                      <a:ext cx="3316892" cy="2087587"/>
+                    </a:xfrm>
+                    <a:prstGeom prst="rect">
+                      <a:avLst/>
+                    </a:prstGeom>
+                    <a:ln>
+                      <a:solidFill>
+                        <a:schemeClr val="tx1"/>
+                      </a:solidFill>
+                    </a:ln>
+                  </pic:spPr>
+                </pic:pic>
+              </a:graphicData>
+            </a:graphic>
+          </wp:inline>
+        </w:drawing>
+      </w:r>
+    </w:p>
+    <w:p>
+      <w:pPr>
+        <w:pStyle w:val="paragraph"/>
+        <w:spacing w:before="0" w:beforeAutospacing="0" w:after="0" w:afterAutospacing="0"/>
+        <w:ind w:left="720"/>
+        <w:textAlignment w:val="baseline"/>
+        <w:rPr>
+          <w:rStyle w:val="normaltextrun"/>
+          <w:rFonts w:asciiTheme="minorHAnsi" w:hAnsiTheme="minorHAnsi" w:cs="Calibri"/>
+          <w:sz w:val="22"/>
+          <w:szCs w:val="22"/>
+        </w:rPr>
+      </w:pPr>
+    </w:p>
+    <w:p>
+      <w:pPr>
+        <w:pStyle w:val="paragraph"/>
+        <w:numPr>
+          <w:ilvl w:val="0"/>
+          <w:numId w:val="6"/>
+        </w:numPr>
+        <w:spacing w:before="0" w:beforeAutospacing="0" w:after="0" w:afterAutospacing="0"/>
+        <w:textAlignment w:val="baseline"/>
+        <w:rPr>
+          <w:rStyle w:val="eop"/>
+          <w:rFonts w:asciiTheme="minorHAnsi" w:hAnsiTheme="minorHAnsi" w:cs="Calibri"/>
+          <w:sz w:val="22"/>
+          <w:szCs w:val="22"/>
+        </w:rPr>
+      </w:pPr>
+      <w:r>
+        <w:rPr>
+          <w:rStyle w:val="normaltextrun"/>
+          <w:rFonts w:asciiTheme="minorHAnsi" w:eastAsiaTheme="majorEastAsia" w:hAnsiTheme="minorHAnsi" w:cs="Calibri"/>
+          <w:sz w:val="22"/>
+          <w:szCs w:val="22"/>
+        </w:rPr>
+        <w:t>Perform Quality Check</w:t>
+      </w:r>
+      <w:r>
+        <w:rPr>
+          <w:rStyle w:val="normaltextrun"/>
+          <w:rFonts w:asciiTheme="minorHAnsi" w:eastAsiaTheme="majorEastAsia" w:hAnsiTheme="minorHAnsi" w:cs="Calibri"/>
+          <w:sz w:val="22"/>
+          <w:szCs w:val="22"/>
+        </w:rPr>
+        <w:t>.</w:t>
+      </w:r>
+      <w:r>
+        <w:rPr>
+          <w:rStyle w:val="eop"/>
+          <w:rFonts w:asciiTheme="minorHAnsi" w:eastAsiaTheme="majorEastAsia" w:hAnsiTheme="minorHAnsi" w:cs="Calibri"/>
+          <w:sz w:val="22"/>
+          <w:szCs w:val="22"/>
+        </w:rPr>
+        <w:t> </w:t>
+      </w:r>
+    </w:p>
+    <w:p>
+      <w:pPr>
+        <w:pStyle w:val="paragraph"/>
+        <w:spacing w:before="0" w:beforeAutospacing="0" w:after="0" w:afterAutospacing="0"/>
+        <w:ind w:left="720"/>
+        <w:textAlignment w:val="baseline"/>
+        <w:rPr>
+          <w:rStyle w:val="eop"/>
+          <w:rFonts w:asciiTheme="minorHAnsi" w:hAnsiTheme="minorHAnsi" w:cs="Calibri"/>
+          <w:sz w:val="22"/>
+          <w:szCs w:val="22"/>
+        </w:rPr>
+      </w:pPr>
+    </w:p>
+    <w:p>
+      <w:pPr>
+        <w:pStyle w:val="paragraph"/>
+        <w:spacing w:before="0" w:beforeAutospacing="0" w:after="0" w:afterAutospacing="0"/>
+        <w:ind w:left="720"/>
+        <w:jc w:val="center"/>
+        <w:textAlignment w:val="baseline"/>
+        <w:rPr>
+          <w:rFonts w:asciiTheme="minorHAnsi" w:hAnsiTheme="minorHAnsi" w:cs="Calibri"/>
+          <w:sz w:val="22"/>
+          <w:szCs w:val="22"/>
+        </w:rPr>
+      </w:pPr>
+      <w:r>
+        <w:rPr>
+          <w:rFonts w:asciiTheme="minorHAnsi" w:hAnsiTheme="minorHAnsi" w:cs="Calibri"/>
+          <w:sz w:val="22"/>
+          <w:szCs w:val="22"/>
+        </w:rPr>
+        <w:drawing>
+          <wp:inline distT="0" distB="0" distL="0" distR="0" wp14:anchorId="36A4BD9C" wp14:editId="2B32BB43">
+            <wp:extent cx="2843513" cy="1958400"/>
+            <wp:effectExtent l="12700" t="12700" r="14605" b="10160"/>
+            <wp:docPr id="1882806276" name="Picture 1" descr="A screenshot of a computer&#10;&#10;AI-generated content may be incorrect."/>
+            <wp:cNvGraphicFramePr>
+              <a:graphicFrameLocks xmlns:a="http://schemas.openxmlformats.org/drawingml/2006/main" noChangeAspect="1"/>
+            </wp:cNvGraphicFramePr>
+            <a:graphic xmlns:a="http://schemas.openxmlformats.org/drawingml/2006/main">
+              <a:graphicData uri="http://schemas.openxmlformats.org/drawingml/2006/picture">
+                <pic:pic xmlns:pic="http://schemas.openxmlformats.org/drawingml/2006/picture">
+                  <pic:nvPicPr>
+                    <pic:cNvPr id="1882806276" name="Picture 1" descr="A screenshot of a computer&#10;&#10;AI-generated content may be incorrect."/>
+                    <pic:cNvPicPr/>
+                  </pic:nvPicPr>
+                  <pic:blipFill>
+                    <a:blip r:embed="rId11"/>
+                    <a:stretch>
+                      <a:fillRect/>
+                    </a:stretch>
+                  </pic:blipFill>
+                  <pic:spPr>
+                    <a:xfrm>
+                      <a:off x="0" y="0"/>
+                      <a:ext cx="2852219" cy="1964396"/>
+                    </a:xfrm>
+                    <a:prstGeom prst="rect">
+                      <a:avLst/>
+                    </a:prstGeom>
+                    <a:ln>
+                      <a:solidFill>
+                        <a:schemeClr val="tx1"/>
+                      </a:solidFill>
+                    </a:ln>
+                  </pic:spPr>
+                </pic:pic>
+              </a:graphicData>
+            </a:graphic>
+          </wp:inline>
+        </w:drawing>
+      </w:r>
+    </w:p>
+    <w:p>
+      <w:pPr>
+        <w:rPr>
+          <w:rFonts w:ascii="Montserrat" w:hAnsi="Montserrat"/>
+          <w:b/>
+          <w:bCs/>
+        </w:rPr>
+      </w:pPr>
+    </w:p>
+    <w:p>
+      <w:pPr>
+        <w:pStyle w:val="ListParagraph"/>
+        <w:numPr>
+          <w:ilvl w:val="0"/>
+          <w:numId w:val="6"/>
+        </w:numPr>
+        <w:rPr>
+          <w:rStyle w:val="normaltextrun"/>
+        </w:rPr>
+      </w:pPr>
+      <w:r>
+        <w:rPr>
+          <w:rStyle w:val="normaltextrun"/>
+          <w:rFonts w:cs="Calibri"/>
+          <w:color w:val="000000"/>
+          <w:sz w:val="22"/>
+          <w:szCs w:val="22"/>
+          <w:shd w:val="clear" w:color="auto" w:fill="FFFFFF"/>
+        </w:rPr>
+        <w:t>Generate</w:t>
+      </w:r>
+      <w:r>
+        <w:rPr>
+          <w:rStyle w:val="normaltextrun"/>
+          <w:rFonts w:cs="Calibri"/>
+          <w:color w:val="000000"/>
+          <w:sz w:val="22"/>
+          <w:szCs w:val="22"/>
+          <w:shd w:val="clear" w:color="auto" w:fill="FFFFFF"/>
+        </w:rPr>
+        <w:t xml:space="preserve"> a</w:t>
+      </w:r>
+      <w:r>
+        <w:rPr>
+          <w:rStyle w:val="normaltextrun"/>
+          <w:rFonts w:cs="Calibri"/>
+          <w:color w:val="000000"/>
+          <w:sz w:val="22"/>
+          <w:szCs w:val="22"/>
+          <w:shd w:val="clear" w:color="auto" w:fill="FFFFFF"/>
+        </w:rPr>
+        <w:t xml:space="preserve"> </w:t>
+      </w:r>
+      <w:r>
+        <w:rPr>
+          <w:rStyle w:val="normaltextrun"/>
+          <w:rFonts w:cs="Calibri"/>
+          <w:b/>
+          <w:bCs/>
+          <w:color w:val="000000"/>
+          <w:sz w:val="22"/>
+          <w:szCs w:val="22"/>
+          <w:shd w:val="clear" w:color="auto" w:fill="FFFFFF"/>
+        </w:rPr>
+        <w:t>T</w:t>
+      </w:r>
+      <w:r>
+        <w:rPr>
+          <w:rStyle w:val="normaltextrun"/>
+          <w:rFonts w:cs="Calibri"/>
+          <w:b/>
+          <w:bCs/>
+          <w:color w:val="000000"/>
+          <w:sz w:val="22"/>
+          <w:szCs w:val="22"/>
+          <w:shd w:val="clear" w:color="auto" w:fill="FFFFFF"/>
+        </w:rPr>
+        <w:t xml:space="preserve">est </w:t>
+      </w:r>
+      <w:r>
+        <w:rPr>
+          <w:rStyle w:val="normaltextrun"/>
+          <w:rFonts w:cs="Calibri"/>
+          <w:b/>
+          <w:bCs/>
+          <w:color w:val="000000"/>
+          <w:sz w:val="22"/>
+          <w:szCs w:val="22"/>
+          <w:shd w:val="clear" w:color="auto" w:fill="FFFFFF"/>
+        </w:rPr>
+        <w:t>C</w:t>
+      </w:r>
+      <w:r>
+        <w:rPr>
+          <w:rStyle w:val="normaltextrun"/>
+          <w:rFonts w:cs="Calibri"/>
+          <w:b/>
+          <w:bCs/>
+          <w:color w:val="000000"/>
+          <w:sz w:val="22"/>
+          <w:szCs w:val="22"/>
+          <w:shd w:val="clear" w:color="auto" w:fill="FFFFFF"/>
+        </w:rPr>
+        <w:t>ase</w:t>
+      </w:r>
+      <w:r>
+        <w:rPr>
+          <w:rStyle w:val="normaltextrun"/>
+          <w:rFonts w:cs="Calibri"/>
+          <w:color w:val="000000"/>
+          <w:sz w:val="22"/>
+          <w:szCs w:val="22"/>
+          <w:shd w:val="clear" w:color="auto" w:fill="FFFFFF"/>
+        </w:rPr>
+        <w:t xml:space="preserve"> </w:t>
+      </w:r>
+      <w:r>
+        <w:rPr>
+          <w:rStyle w:val="normaltextrun"/>
+          <w:rFonts w:cs="Calibri"/>
+          <w:color w:val="000000"/>
+          <w:sz w:val="22"/>
+          <w:szCs w:val="22"/>
+          <w:shd w:val="clear" w:color="auto" w:fill="FFFFFF"/>
+        </w:rPr>
+        <w:t xml:space="preserve">from a </w:t>
+      </w:r>
+      <w:r>
+        <w:rPr>
+          <w:rStyle w:val="normaltextrun"/>
+          <w:rFonts w:cs="Calibri"/>
+          <w:b/>
+          <w:bCs/>
+          <w:color w:val="000000"/>
+          <w:sz w:val="22"/>
+          <w:szCs w:val="22"/>
+          <w:shd w:val="clear" w:color="auto" w:fill="FFFFFF"/>
+        </w:rPr>
+        <w:t xml:space="preserve">Requirement </w:t>
+      </w:r>
+      <w:r>
+        <w:rPr>
+          <w:rStyle w:val="normaltextrun"/>
+          <w:rFonts w:cs="Calibri"/>
+          <w:color w:val="000000"/>
+          <w:sz w:val="22"/>
+          <w:szCs w:val="22"/>
+          <w:shd w:val="clear" w:color="auto" w:fill="FFFFFF"/>
+        </w:rPr>
+        <w:t>of your choice</w:t>
+      </w:r>
+      <w:r>
+        <w:rPr>
+          <w:rStyle w:val="normaltextrun"/>
+          <w:rFonts w:cs="Calibri"/>
+          <w:color w:val="000000"/>
+          <w:sz w:val="22"/>
+          <w:szCs w:val="22"/>
+          <w:shd w:val="clear" w:color="auto" w:fill="FFFFFF"/>
+        </w:rPr>
+        <w:t>. Review the Description, Expected Result, and Verification Method fields. Update as necessary and select “Create”.</w:t>
+      </w:r>
+    </w:p>
+    <w:p>
+      <w:pPr>
+        <w:pStyle w:val="ListParagraph"/>
+        <w:jc w:val="center"/>
+      </w:pPr>
+      <w:r>
+        <w:rPr>
+          <w:rStyle w:val="normaltextrun"/>
+        </w:rPr>
+        <w:lastRenderedPageBreak/>
+        <w:drawing>
+          <wp:inline distT="0" distB="0" distL="0" distR="0" wp14:anchorId="01CC04F8" wp14:editId="6F055C82">
+            <wp:extent cx="4600800" cy="3021487"/>
+            <wp:effectExtent l="12700" t="12700" r="9525" b="13970"/>
+            <wp:docPr id="1650650745" name="Picture 1" descr="A screenshot of a phone call&#10;&#10;AI-generated content may be incorrect."/>
+            <wp:cNvGraphicFramePr>
+              <a:graphicFrameLocks xmlns:a="http://schemas.openxmlformats.org/drawingml/2006/main" noChangeAspect="1"/>
+            </wp:cNvGraphicFramePr>
+            <a:graphic xmlns:a="http://schemas.openxmlformats.org/drawingml/2006/main">
+              <a:graphicData uri="http://schemas.openxmlformats.org/drawingml/2006/picture">
+                <pic:pic xmlns:pic="http://schemas.openxmlformats.org/drawingml/2006/picture">
+                  <pic:nvPicPr>
+                    <pic:cNvPr id="1650650745" name="Picture 1" descr="A screenshot of a phone call&#10;&#10;AI-generated content may be incorrect."/>
+                    <pic:cNvPicPr/>
+                  </pic:nvPicPr>
+                  <pic:blipFill>
+                    <a:blip r:embed="rId12"/>
+                    <a:stretch>
+                      <a:fillRect/>
+                    </a:stretch>
+                  </pic:blipFill>
+                  <pic:spPr>
+                    <a:xfrm>
+                      <a:off x="0" y="0"/>
+                      <a:ext cx="4605977" cy="3024887"/>
+                    </a:xfrm>
+                    <a:prstGeom prst="rect">
+                      <a:avLst/>
+                    </a:prstGeom>
+                    <a:ln>
+                      <a:solidFill>
+                        <a:schemeClr val="tx1"/>
+                      </a:solidFill>
+                    </a:ln>
+                  </pic:spPr>
+                </pic:pic>
+              </a:graphicData>
+            </a:graphic>
+          </wp:inline>
+        </w:drawing>
+      </w:r>
+    </w:p>
+    <w:p>
+      <w:pPr>
+        <w:pStyle w:val="ListParagraph"/>
+      </w:pPr>
+    </w:p>
+    <w:p>
+      <w:pPr>
+        <w:pStyle w:val="ListParagraph"/>
+        <w:numPr>
+          <w:ilvl w:val="0"/>
+          <w:numId w:val="6"/>
+        </w:numPr>
+      </w:pPr>
+      <w:r>
+        <w:t xml:space="preserve">Generate a </w:t>
+      </w:r>
+      <w:r>
+        <w:rPr>
+          <w:b/>
+          <w:bCs/>
+        </w:rPr>
+        <w:t>Risk</w:t>
+      </w:r>
+      <w:r>
+        <w:t xml:space="preserve"> for the same </w:t>
+      </w:r>
+      <w:r>
+        <w:rPr>
+          <w:b/>
+          <w:bCs/>
+        </w:rPr>
+        <w:t>R</w:t>
+      </w:r>
+      <w:r>
+        <w:rPr>
+          <w:b/>
+          <w:bCs/>
+        </w:rPr>
+        <w:t>equirement</w:t>
+      </w:r>
+      <w:r>
+        <w:t xml:space="preserve">. </w:t>
+      </w:r>
+    </w:p>
+    <w:p>
+      <w:pPr>
+        <w:pStyle w:val="ListParagraph"/>
+      </w:pPr>
+      <w:r>
+        <w:rPr>
+          <w:b/>
+          <w:bCs/>
+        </w:rPr>
+        <w:t>NOTE: You will have the option to create up to three (3) Risks for a single Requirement. Please only select one</w:t>
+      </w:r>
+      <w:r>
+        <w:rPr>
+          <w:b/>
+          <w:bCs/>
+        </w:rPr>
+        <w:t xml:space="preserve"> (1)</w:t>
+      </w:r>
+      <w:r>
+        <w:rPr>
+          <w:b/>
+          <w:bCs/>
+        </w:rPr>
+        <w:t xml:space="preserve"> so we do not run out of tokens.</w:t>
+      </w:r>
+    </w:p>
+    <w:p>
+      <w:pPr>
+        <w:pStyle w:val="ListParagraph"/>
+        <w:numPr>
+          <w:ilvl w:val="0"/>
+          <w:numId w:val="6"/>
+        </w:numPr>
+      </w:pPr>
+      <w:r>
+        <w:t>Review the Description, Consequence Description, Consequence, Probability, and Risk Label fields and update as necessary. Select “Create”.</w:t>
+      </w:r>
+    </w:p>
+    <w:p>
+      <w:pPr>
+        <w:pStyle w:val="ListParagraph"/>
+      </w:pPr>
+    </w:p>
+    <w:p>
+      <w:pPr>
+        <w:pStyle w:val="ListParagraph"/>
+        <w:jc w:val="center"/>
+      </w:pPr>
+      <w:r>
+        <w:drawing>
+          <wp:inline distT="0" distB="0" distL="0" distR="0" wp14:anchorId="2521C695" wp14:editId="778F49C9">
+            <wp:extent cx="4140214" cy="3348000"/>
+            <wp:effectExtent l="12700" t="12700" r="12700" b="17780"/>
+            <wp:docPr id="1099510361" name="Picture 1" descr="A screenshot of a computer&#10;&#10;AI-generated content may be incorrect."/>
+            <wp:cNvGraphicFramePr>
+              <a:graphicFrameLocks xmlns:a="http://schemas.openxmlformats.org/drawingml/2006/main" noChangeAspect="1"/>
+            </wp:cNvGraphicFramePr>
+            <a:graphic xmlns:a="http://schemas.openxmlformats.org/drawingml/2006/main">
+              <a:graphicData uri="http://schemas.openxmlformats.org/drawingml/2006/picture">
+                <pic:pic xmlns:pic="http://schemas.openxmlformats.org/drawingml/2006/picture">
+                  <pic:nvPicPr>
+                    <pic:cNvPr id="1099510361" name="Picture 1" descr="A screenshot of a computer&#10;&#10;AI-generated content may be incorrect."/>
+                    <pic:cNvPicPr/>
+                  </pic:nvPicPr>
+                  <pic:blipFill>
+                    <a:blip r:embed="rId13"/>
+                    <a:stretch>
+                      <a:fillRect/>
+                    </a:stretch>
+                  </pic:blipFill>
+                  <pic:spPr>
+                    <a:xfrm>
+                      <a:off x="0" y="0"/>
+                      <a:ext cx="4143875" cy="3350960"/>
+                    </a:xfrm>
+                    <a:prstGeom prst="rect">
+                      <a:avLst/>
+                    </a:prstGeom>
+                    <a:ln>
+                      <a:solidFill>
+                        <a:schemeClr val="tx1"/>
+                      </a:solidFill>
+                    </a:ln>
+                  </pic:spPr>
+                </pic:pic>
+              </a:graphicData>
+            </a:graphic>
+          </wp:inline>
+        </w:drawing>
+      </w:r>
+    </w:p>
+    <w:p>
+      <w:pPr>
+        <w:pStyle w:val="ListParagraph"/>
+        <w:numPr>
+          <w:ilvl w:val="0"/>
+          <w:numId w:val="6"/>
+        </w:numPr>
+      </w:pPr>
+      <w:r>
+        <w:lastRenderedPageBreak/>
+        <w:t xml:space="preserve">Inspect the “Relationship” tab of the </w:t>
+      </w:r>
+      <w:r>
+        <w:rPr>
+          <w:b/>
+          <w:bCs/>
+        </w:rPr>
+        <w:t>Requirement</w:t>
+      </w:r>
+      <w:r>
+        <w:t xml:space="preserve"> and there should now be a “causes” relationship with the newly </w:t>
+      </w:r>
+      <w:r>
+        <w:t>generated</w:t>
+      </w:r>
+      <w:r>
+        <w:t xml:space="preserve"> </w:t>
+      </w:r>
+      <w:r>
+        <w:rPr>
+          <w:b/>
+          <w:bCs/>
+        </w:rPr>
+        <w:t>Risk</w:t>
+      </w:r>
+      <w:r>
+        <w:t xml:space="preserve"> and a “verified by” relationship with the newly </w:t>
+      </w:r>
+      <w:r>
+        <w:t>generated</w:t>
+      </w:r>
+      <w:r>
+        <w:t xml:space="preserve"> </w:t>
+      </w:r>
+      <w:r>
+        <w:rPr>
+          <w:b/>
+          <w:bCs/>
+        </w:rPr>
+        <w:t>Test Case</w:t>
+      </w:r>
+      <w:r>
+        <w:t>.</w:t>
+      </w:r>
+    </w:p>
+    <w:p>
+      <w:pPr>
+        <w:pStyle w:val="ListParagraph"/>
+      </w:pPr>
+    </w:p>
+    <w:p>
+      <w:pPr>
+        <w:rPr>
+          <w:rFonts w:ascii="Montserrat" w:hAnsi="Montserrat"/>
+          <w:b/>
+          <w:bCs/>
+        </w:rPr>
+      </w:pPr>
+      <w:r>
+        <w:rPr>
+          <w:rFonts w:ascii="Montserrat" w:hAnsi="Montserrat"/>
+          <w:b/>
+          <w:bCs/>
+        </w:rPr>
+        <w:br w:type="page"/>
+      </w:r>
+    </w:p>
+    <w:p>
+      <w:pPr>
+        <w:rPr>
+          <w:rFonts w:ascii="Montserrat" w:hAnsi="Montserrat"/>
+          <w:b/>
+          <w:bCs/>
+        </w:rPr>
+      </w:pPr>
+      <w:r>
+        <w:rPr>
+          <w:rFonts w:ascii="Montserrat" w:hAnsi="Montserrat"/>
+          <w:b/>
+          <w:bCs/>
+        </w:rPr>
+        <w:lastRenderedPageBreak/>
+        <w:t>Mod 6 – Structural Architecture Lab</w:t>
+      </w:r>
+    </w:p>
+    <w:p>
+      <w:pPr>
+        <w:pStyle w:val="ListParagraph"/>
+        <w:numPr>
+          <w:ilvl w:val="0"/>
+          <w:numId w:val="5"/>
+        </w:numPr>
+      </w:pPr>
+      <w:r>
+        <w:t xml:space="preserve">Create </w:t>
+      </w:r>
+      <w:r>
+        <w:t xml:space="preserve">an </w:t>
+      </w:r>
+      <w:r>
+        <w:rPr>
+          <w:b/>
+          <w:bCs/>
+        </w:rPr>
+        <w:t>Asset</w:t>
+      </w:r>
+      <w:r>
+        <w:t xml:space="preserve"> named “</w:t>
+      </w:r>
+      <w:r>
+        <w:t>Cell Phone</w:t>
+      </w:r>
+      <w:r>
+        <w:t>”.</w:t>
+      </w:r>
+    </w:p>
+    <w:p>
+      <w:pPr>
+        <w:pStyle w:val="ListParagraph"/>
+        <w:numPr>
+          <w:ilvl w:val="0"/>
+          <w:numId w:val="5"/>
+        </w:numPr>
+      </w:pPr>
+      <w:r>
+        <w:t xml:space="preserve">Create an Asset Diagram for the </w:t>
+      </w:r>
+      <w:r>
+        <w:t>“</w:t>
+      </w:r>
+      <w:r>
+        <w:t>Cell Phone</w:t>
+      </w:r>
+      <w:r>
+        <w:t xml:space="preserve">” and add the following </w:t>
+      </w:r>
+      <w:r>
+        <w:rPr>
+          <w:b/>
+          <w:bCs/>
+        </w:rPr>
+        <w:t>Assets</w:t>
+      </w:r>
+      <w:r>
+        <w:t>:</w:t>
+      </w:r>
+    </w:p>
+    <w:p>
+      <w:pPr>
+        <w:pStyle w:val="ListParagraph"/>
+        <w:numPr>
+          <w:ilvl w:val="1"/>
+          <w:numId w:val="5"/>
+        </w:numPr>
+      </w:pPr>
+      <w:r>
+        <w:t>Battery</w:t>
+      </w:r>
+    </w:p>
+    <w:p>
+      <w:pPr>
+        <w:pStyle w:val="ListParagraph"/>
+        <w:numPr>
+          <w:ilvl w:val="1"/>
+          <w:numId w:val="5"/>
+        </w:numPr>
+      </w:pPr>
+      <w:r>
+        <w:t>CPU</w:t>
+      </w:r>
+    </w:p>
+    <w:p>
+      <w:pPr>
+        <w:pStyle w:val="ListParagraph"/>
+        <w:numPr>
+          <w:ilvl w:val="1"/>
+          <w:numId w:val="5"/>
+        </w:numPr>
+      </w:pPr>
+      <w:r>
+        <w:t>Communication Subsystem</w:t>
+      </w:r>
+    </w:p>
+    <w:p>
+      <w:pPr>
+        <w:pStyle w:val="ListParagraph"/>
+        <w:numPr>
+          <w:ilvl w:val="1"/>
+          <w:numId w:val="5"/>
+        </w:numPr>
+      </w:pPr>
+      <w:r>
+        <w:t>Camera Subsystem</w:t>
+      </w:r>
+    </w:p>
+    <w:p>
+      <w:pPr>
+        <w:jc w:val="center"/>
+      </w:pPr>
+      <w:r>
+        <w:drawing>
+          <wp:inline distT="0" distB="0" distL="0" distR="0" wp14:anchorId="33007D25" wp14:editId="153808D4">
+            <wp:extent cx="2457792" cy="1924100"/>
+            <wp:effectExtent l="12700" t="12700" r="19050" b="6350"/>
+            <wp:docPr id="3" name="Picture 2" descr="A screenshot of a computer&#10;&#10;AI-generated content may be incorrect.">
+              <a:extLst xmlns:a="http://schemas.openxmlformats.org/drawingml/2006/main">
+                <a:ext uri="{FF2B5EF4-FFF2-40B4-BE49-F238E27FC236}">
+                  <a16:creationId xmlns:a16="http://schemas.microsoft.com/office/drawing/2014/main" id="{1C9883CB-23C2-8238-40C2-788F06BF0EEC}"/>
+                </a:ext>
+              </a:extLst>
+            </wp:docPr>
+            <wp:cNvGraphicFramePr>
+              <a:graphicFrameLocks xmlns:a="http://schemas.openxmlformats.org/drawingml/2006/main" noChangeAspect="1"/>
+            </wp:cNvGraphicFramePr>
+            <a:graphic xmlns:a="http://schemas.openxmlformats.org/drawingml/2006/main">
+              <a:graphicData uri="http://schemas.openxmlformats.org/drawingml/2006/picture">
+                <pic:pic xmlns:pic="http://schemas.openxmlformats.org/drawingml/2006/picture">
+                  <pic:nvPicPr>
+                    <pic:cNvPr id="3" name="Picture 2" descr="A screenshot of a computer&#10;&#10;AI-generated content may be incorrect.">
+                      <a:extLst>
+                        <a:ext uri="{FF2B5EF4-FFF2-40B4-BE49-F238E27FC236}">
+                          <a16:creationId xmlns:a16="http://schemas.microsoft.com/office/drawing/2014/main" id="{1C9883CB-23C2-8238-40C2-788F06BF0EEC}"/>
+                        </a:ext>
+                      </a:extLst>
+                    </pic:cNvPr>
+                    <pic:cNvPicPr>
+                      <a:picLocks noChangeAspect="1"/>
+                    </pic:cNvPicPr>
+                  </pic:nvPicPr>
+                  <pic:blipFill>
+                    <a:blip r:embed="rId14"/>
+                    <a:stretch>
+                      <a:fillRect/>
+                    </a:stretch>
+                  </pic:blipFill>
+                  <pic:spPr>
+                    <a:xfrm>
+                      <a:off x="0" y="0"/>
+                      <a:ext cx="2466303" cy="1930763"/>
+                    </a:xfrm>
+                    <a:prstGeom prst="rect">
+                      <a:avLst/>
+                    </a:prstGeom>
+                    <a:ln>
+                      <a:solidFill>
+                        <a:schemeClr val="tx1"/>
+                      </a:solidFill>
+                    </a:ln>
+                  </pic:spPr>
+                </pic:pic>
+              </a:graphicData>
+            </a:graphic>
+          </wp:inline>
+        </w:drawing>
+      </w:r>
+    </w:p>
+    <w:p>
+      <w:pPr>
+        <w:rPr>
+          <w:b/>
+          <w:bCs/>
+        </w:rPr>
+      </w:pPr>
+      <w:r>
+        <w:rPr>
+          <w:b/>
+          <w:bCs/>
+        </w:rPr>
+        <w:t>NOTE: This screenshot was taken after the decomposition of the “Camera Subsystem” Asset.</w:t>
+      </w:r>
+    </w:p>
+    <w:p>
+      <w:pPr>
+        <w:pStyle w:val="ListParagraph"/>
+        <w:numPr>
+          <w:ilvl w:val="0"/>
+          <w:numId w:val="5"/>
+        </w:numPr>
+      </w:pPr>
+      <w:r>
+        <w:t>Create an Asset Diagram for the Camera Subsystem and add the following</w:t>
+      </w:r>
+      <w:r>
+        <w:t xml:space="preserve"> </w:t>
+      </w:r>
+      <w:r>
+        <w:rPr>
+          <w:b/>
+          <w:bCs/>
+        </w:rPr>
+        <w:t>Assets</w:t>
+      </w:r>
+      <w:r>
+        <w:t>:</w:t>
+      </w:r>
+    </w:p>
+    <w:p>
+      <w:pPr>
+        <w:pStyle w:val="ListParagraph"/>
+        <w:jc w:val="center"/>
+      </w:pPr>
+      <w:r>
+        <w:drawing>
+          <wp:inline distT="0" distB="0" distL="0" distR="0" wp14:anchorId="21347D37" wp14:editId="51951ED6">
+            <wp:extent cx="2908800" cy="811033"/>
+            <wp:effectExtent l="12700" t="12700" r="12700" b="14605"/>
+            <wp:docPr id="988216156" name="Picture 1" descr="A white background with black dots&#10;&#10;AI-generated content may be incorrect."/>
+            <wp:cNvGraphicFramePr>
+              <a:graphicFrameLocks xmlns:a="http://schemas.openxmlformats.org/drawingml/2006/main" noChangeAspect="1"/>
+            </wp:cNvGraphicFramePr>
+            <a:graphic xmlns:a="http://schemas.openxmlformats.org/drawingml/2006/main">
+              <a:graphicData uri="http://schemas.openxmlformats.org/drawingml/2006/picture">
+                <pic:pic xmlns:pic="http://schemas.openxmlformats.org/drawingml/2006/picture">
+                  <pic:nvPicPr>
+                    <pic:cNvPr id="988216156" name="Picture 1" descr="A white background with black dots&#10;&#10;AI-generated content may be incorrect."/>
+                    <pic:cNvPicPr/>
+                  </pic:nvPicPr>
+                  <pic:blipFill>
+                    <a:blip r:embed="rId15"/>
+                    <a:stretch>
+                      <a:fillRect/>
+                    </a:stretch>
+                  </pic:blipFill>
+                  <pic:spPr>
+                    <a:xfrm>
+                      <a:off x="0" y="0"/>
+                      <a:ext cx="2920099" cy="814183"/>
+                    </a:xfrm>
+                    <a:prstGeom prst="rect">
+                      <a:avLst/>
+                    </a:prstGeom>
+                    <a:ln>
+                      <a:solidFill>
+                        <a:schemeClr val="tx1"/>
+                      </a:solidFill>
+                    </a:ln>
+                  </pic:spPr>
+                </pic:pic>
+              </a:graphicData>
+            </a:graphic>
+          </wp:inline>
+        </w:drawing>
+      </w:r>
+    </w:p>
+    <w:p>
+      <w:pPr>
+        <w:pStyle w:val="ListParagraph"/>
+        <w:numPr>
+          <w:ilvl w:val="0"/>
+          <w:numId w:val="5"/>
+        </w:numPr>
+      </w:pPr>
+      <w:r>
+        <w:t xml:space="preserve">Navigate to the Cell Phone </w:t>
+      </w:r>
+      <w:r>
+        <w:rPr>
+          <w:b/>
+          <w:bCs/>
+        </w:rPr>
+        <w:t>Asset</w:t>
+      </w:r>
+      <w:r>
+        <w:t>. Open the Class Diagram.</w:t>
+      </w:r>
+    </w:p>
+    <w:p>
+      <w:pPr>
+        <w:jc w:val="center"/>
+      </w:pPr>
+      <w:r>
+        <w:drawing>
+          <wp:inline distT="0" distB="0" distL="0" distR="0" wp14:anchorId="52A0B835" wp14:editId="0EE77B23">
+            <wp:extent cx="4442400" cy="1579045"/>
+            <wp:effectExtent l="12700" t="12700" r="15875" b="8890"/>
+            <wp:docPr id="628176086" name="Picture 1" descr="A diagram of a camera system&#10;&#10;AI-generated content may be incorrect."/>
+            <wp:cNvGraphicFramePr>
+              <a:graphicFrameLocks xmlns:a="http://schemas.openxmlformats.org/drawingml/2006/main" noChangeAspect="1"/>
+            </wp:cNvGraphicFramePr>
+            <a:graphic xmlns:a="http://schemas.openxmlformats.org/drawingml/2006/main">
+              <a:graphicData uri="http://schemas.openxmlformats.org/drawingml/2006/picture">
+                <pic:pic xmlns:pic="http://schemas.openxmlformats.org/drawingml/2006/picture">
+                  <pic:nvPicPr>
+                    <pic:cNvPr id="628176086" name="Picture 1" descr="A diagram of a camera system&#10;&#10;AI-generated content may be incorrect."/>
+                    <pic:cNvPicPr/>
+                  </pic:nvPicPr>
+                  <pic:blipFill>
+                    <a:blip r:embed="rId16"/>
+                    <a:stretch>
+                      <a:fillRect/>
+                    </a:stretch>
+                  </pic:blipFill>
+                  <pic:spPr>
+                    <a:xfrm>
+                      <a:off x="0" y="0"/>
+                      <a:ext cx="4454616" cy="1583387"/>
+                    </a:xfrm>
+                    <a:prstGeom prst="rect">
+                      <a:avLst/>
+                    </a:prstGeom>
+                    <a:ln>
+                      <a:solidFill>
+                        <a:schemeClr val="tx1"/>
+                      </a:solidFill>
+                    </a:ln>
+                  </pic:spPr>
+                </pic:pic>
+              </a:graphicData>
+            </a:graphic>
+          </wp:inline>
+        </w:drawing>
+      </w:r>
+    </w:p>
+    <w:p>
+      <w:pPr>
+        <w:rPr>
+          <w:b/>
+          <w:bCs/>
+        </w:rPr>
+      </w:pPr>
+      <w:r>
+        <w:rPr>
+          <w:b/>
+          <w:bCs/>
+        </w:rPr>
+        <w:t>NOTE: We have not added Attributes to the Battery or Camera Subsystem Asset.</w:t>
+      </w:r>
+    </w:p>
+    <w:p>
+      <w:pPr>
+        <w:pStyle w:val="ListParagraph"/>
+        <w:numPr>
+          <w:ilvl w:val="0"/>
+          <w:numId w:val="5"/>
+        </w:numPr>
+      </w:pPr>
+      <w:r>
+        <w:t>Open the Hierarchy Diagram.</w:t>
+      </w:r>
+    </w:p>
+    <w:p>
+      <w:pPr>
+        <w:pStyle w:val="ListParagraph"/>
+        <w:jc w:val="center"/>
+      </w:pPr>
+      <w:r>
+        <w:lastRenderedPageBreak/>
+        <w:drawing>
+          <wp:inline distT="0" distB="0" distL="0" distR="0" wp14:anchorId="20E6CAD8" wp14:editId="795235E8">
+            <wp:extent cx="2829209" cy="1720800"/>
+            <wp:effectExtent l="12700" t="12700" r="15875" b="6985"/>
+            <wp:docPr id="285829380" name="Picture 1" descr="A diagram of a cell phone&#10;&#10;AI-generated content may be incorrect."/>
+            <wp:cNvGraphicFramePr>
+              <a:graphicFrameLocks xmlns:a="http://schemas.openxmlformats.org/drawingml/2006/main" noChangeAspect="1"/>
+            </wp:cNvGraphicFramePr>
+            <a:graphic xmlns:a="http://schemas.openxmlformats.org/drawingml/2006/main">
+              <a:graphicData uri="http://schemas.openxmlformats.org/drawingml/2006/picture">
+                <pic:pic xmlns:pic="http://schemas.openxmlformats.org/drawingml/2006/picture">
+                  <pic:nvPicPr>
+                    <pic:cNvPr id="285829380" name="Picture 1" descr="A diagram of a cell phone&#10;&#10;AI-generated content may be incorrect."/>
+                    <pic:cNvPicPr/>
+                  </pic:nvPicPr>
+                  <pic:blipFill>
+                    <a:blip r:embed="rId17"/>
+                    <a:stretch>
+                      <a:fillRect/>
+                    </a:stretch>
+                  </pic:blipFill>
+                  <pic:spPr>
+                    <a:xfrm>
+                      <a:off x="0" y="0"/>
+                      <a:ext cx="2841388" cy="1728208"/>
+                    </a:xfrm>
+                    <a:prstGeom prst="rect">
+                      <a:avLst/>
+                    </a:prstGeom>
+                    <a:ln>
+                      <a:solidFill>
+                        <a:schemeClr val="tx1"/>
+                      </a:solidFill>
+                    </a:ln>
+                  </pic:spPr>
+                </pic:pic>
+              </a:graphicData>
+            </a:graphic>
+          </wp:inline>
+        </w:drawing>
+      </w:r>
+    </w:p>
+    <w:p>
+      <w:pPr>
+        <w:pStyle w:val="ListParagraph"/>
+      </w:pPr>
+    </w:p>
+    <w:p>
+      <w:pPr>
+        <w:pStyle w:val="ListParagraph"/>
+        <w:numPr>
+          <w:ilvl w:val="0"/>
+          <w:numId w:val="5"/>
+        </w:numPr>
+      </w:pPr>
+      <w:r>
+        <w:t>Open the Layer Diagram.</w:t>
+      </w:r>
+    </w:p>
+    <w:p>
+      <w:pPr>
+        <w:pStyle w:val="ListParagraph"/>
+      </w:pPr>
+    </w:p>
+    <w:p>
+      <w:pPr>
+        <w:pStyle w:val="ListParagraph"/>
+        <w:jc w:val="center"/>
+      </w:pPr>
+      <w:r>
+        <w:drawing>
+          <wp:inline distT="0" distB="0" distL="0" distR="0" wp14:anchorId="24397CA7" wp14:editId="29F7A148">
+            <wp:extent cx="1842625" cy="2599200"/>
+            <wp:effectExtent l="12700" t="12700" r="12065" b="17145"/>
+            <wp:docPr id="1111152883" name="Picture 1" descr="A screenshot of a cell phone&#10;&#10;AI-generated content may be incorrect."/>
+            <wp:cNvGraphicFramePr>
+              <a:graphicFrameLocks xmlns:a="http://schemas.openxmlformats.org/drawingml/2006/main" noChangeAspect="1"/>
+            </wp:cNvGraphicFramePr>
+            <a:graphic xmlns:a="http://schemas.openxmlformats.org/drawingml/2006/main">
+              <a:graphicData uri="http://schemas.openxmlformats.org/drawingml/2006/picture">
+                <pic:pic xmlns:pic="http://schemas.openxmlformats.org/drawingml/2006/picture">
+                  <pic:nvPicPr>
+                    <pic:cNvPr id="1111152883" name="Picture 1" descr="A screenshot of a cell phone&#10;&#10;AI-generated content may be incorrect."/>
+                    <pic:cNvPicPr/>
+                  </pic:nvPicPr>
+                  <pic:blipFill>
+                    <a:blip r:embed="rId18"/>
+                    <a:stretch>
+                      <a:fillRect/>
+                    </a:stretch>
+                  </pic:blipFill>
+                  <pic:spPr>
+                    <a:xfrm>
+                      <a:off x="0" y="0"/>
+                      <a:ext cx="1847795" cy="2606493"/>
+                    </a:xfrm>
+                    <a:prstGeom prst="rect">
+                      <a:avLst/>
+                    </a:prstGeom>
+                    <a:ln>
+                      <a:solidFill>
+                        <a:schemeClr val="tx1"/>
+                      </a:solidFill>
+                    </a:ln>
+                  </pic:spPr>
+                </pic:pic>
+              </a:graphicData>
+            </a:graphic>
+          </wp:inline>
+        </w:drawing>
+      </w:r>
+    </w:p>
+    <w:p>
+      <w:pPr>
+        <w:pStyle w:val="ListParagraph"/>
+        <w:numPr>
+          <w:ilvl w:val="0"/>
+          <w:numId w:val="5"/>
+        </w:numPr>
+      </w:pPr>
+      <w:r>
+        <w:t xml:space="preserve">Open the Risk Diagram. Drag and drop the generated Risk onto the matrix. </w:t>
+      </w:r>
+    </w:p>
+    <w:p>
+      <w:pPr>
+        <w:pStyle w:val="ListParagraph"/>
+        <w:jc w:val="center"/>
+      </w:pPr>
+      <w:r>
+        <w:drawing>
+          <wp:inline distT="0" distB="0" distL="0" distR="0" wp14:anchorId="5B8F4FFF" wp14:editId="35656BDF">
+            <wp:extent cx="4094729" cy="1965120"/>
+            <wp:effectExtent l="12700" t="12700" r="7620" b="16510"/>
+            <wp:docPr id="466406098" name="Picture 1" descr="A screenshot of a computer screen&#10;&#10;AI-generated content may be incorrect."/>
+            <wp:cNvGraphicFramePr>
+              <a:graphicFrameLocks xmlns:a="http://schemas.openxmlformats.org/drawingml/2006/main" noChangeAspect="1"/>
+            </wp:cNvGraphicFramePr>
+            <a:graphic xmlns:a="http://schemas.openxmlformats.org/drawingml/2006/main">
+              <a:graphicData uri="http://schemas.openxmlformats.org/drawingml/2006/picture">
+                <pic:pic xmlns:pic="http://schemas.openxmlformats.org/drawingml/2006/picture">
+                  <pic:nvPicPr>
+                    <pic:cNvPr id="466406098" name="Picture 1" descr="A screenshot of a computer screen&#10;&#10;AI-generated content may be incorrect."/>
+                    <pic:cNvPicPr/>
+                  </pic:nvPicPr>
+                  <pic:blipFill>
+                    <a:blip r:embed="rId19"/>
+                    <a:stretch>
+                      <a:fillRect/>
+                    </a:stretch>
+                  </pic:blipFill>
+                  <pic:spPr>
+                    <a:xfrm>
+                      <a:off x="0" y="0"/>
+                      <a:ext cx="4103245" cy="1969207"/>
+                    </a:xfrm>
+                    <a:prstGeom prst="rect">
+                      <a:avLst/>
+                    </a:prstGeom>
+                    <a:ln>
+                      <a:solidFill>
+                        <a:schemeClr val="tx1"/>
+                      </a:solidFill>
+                    </a:ln>
+                  </pic:spPr>
+                </pic:pic>
+              </a:graphicData>
+            </a:graphic>
+          </wp:inline>
+        </w:drawing>
+      </w:r>
+      <w:r>
+        <w:br/>
+      </w:r>
+      <w:r>
+        <w:t xml:space="preserve">8. </w:t>
+      </w:r>
+      <w:r>
+        <w:t>Open the SysML BDD. Select the wrench in the top left and select “Layout Diagram” from the drop-down.</w:t>
+      </w:r>
+    </w:p>
+    <w:p>
+      <w:pPr>
+        <w:pStyle w:val="ListParagraph"/>
+      </w:pPr>
+      <w:r>
+        <w:t xml:space="preserve">9. Open the SysML IBD and </w:t>
+      </w:r>
+      <w:r>
+        <w:t xml:space="preserve">notice </w:t>
+      </w:r>
+      <w:r>
+        <w:t>it should look just like the Layer Diagram.</w:t>
+      </w:r>
+    </w:p>
+    <w:p>
+      <w:pPr>
+        <w:rPr>
+          <w:rFonts w:ascii="Montserrat" w:hAnsi="Montserrat"/>
+          <w:b/>
+          <w:bCs/>
+        </w:rPr>
+      </w:pPr>
+      <w:r>
+        <w:rPr>
+          <w:rFonts w:ascii="Montserrat" w:hAnsi="Montserrat"/>
+          <w:b/>
+          <w:bCs/>
+        </w:rPr>
+        <w:lastRenderedPageBreak/>
+        <w:t>Mod 7 – Functional Architecture Lab</w:t>
+      </w:r>
+    </w:p>
+    <w:p>
+      <w:pPr>
+        <w:pStyle w:val="ListParagraph"/>
+        <w:numPr>
+          <w:ilvl w:val="0"/>
+          <w:numId w:val="7"/>
+        </w:numPr>
+      </w:pPr>
+      <w:r>
+        <w:t xml:space="preserve">Create an </w:t>
+      </w:r>
+      <w:r>
+        <w:rPr>
+          <w:b/>
+          <w:bCs/>
+        </w:rPr>
+        <w:t>Action</w:t>
+      </w:r>
+      <w:r>
+        <w:t xml:space="preserve"> named “Make Phone Call”. Open the LML Action Diagram from this entity.</w:t>
+      </w:r>
+    </w:p>
+    <w:p>
+      <w:pPr>
+        <w:pStyle w:val="ListParagraph"/>
+        <w:numPr>
+          <w:ilvl w:val="0"/>
+          <w:numId w:val="7"/>
+        </w:numPr>
+      </w:pPr>
+      <w:r>
+        <w:t>Create the following LML Action Diagram:</w:t>
+      </w:r>
+    </w:p>
+    <w:p>
+      <w:pPr>
+        <w:pStyle w:val="ListParagraph"/>
+        <w:jc w:val="center"/>
+      </w:pPr>
+      <w:r>
+        <w:drawing>
+          <wp:inline distT="0" distB="0" distL="0" distR="0" wp14:anchorId="732CE4C1" wp14:editId="76DBC0BE">
+            <wp:extent cx="5943600" cy="2023745"/>
+            <wp:effectExtent l="12700" t="12700" r="12700" b="8255"/>
+            <wp:docPr id="258539653" name="Picture 1" descr="A diagram of a flowchart&#10;&#10;AI-generated content may be incorrect."/>
+            <wp:cNvGraphicFramePr>
+              <a:graphicFrameLocks xmlns:a="http://schemas.openxmlformats.org/drawingml/2006/main" noChangeAspect="1"/>
+            </wp:cNvGraphicFramePr>
+            <a:graphic xmlns:a="http://schemas.openxmlformats.org/drawingml/2006/main">
+              <a:graphicData uri="http://schemas.openxmlformats.org/drawingml/2006/picture">
+                <pic:pic xmlns:pic="http://schemas.openxmlformats.org/drawingml/2006/picture">
+                  <pic:nvPicPr>
+                    <pic:cNvPr id="258539653" name="Picture 1" descr="A diagram of a flowchart&#10;&#10;AI-generated content may be incorrect."/>
+                    <pic:cNvPicPr/>
+                  </pic:nvPicPr>
+                  <pic:blipFill>
+                    <a:blip r:embed="rId20"/>
+                    <a:stretch>
+                      <a:fillRect/>
+                    </a:stretch>
+                  </pic:blipFill>
+                  <pic:spPr>
+                    <a:xfrm>
+                      <a:off x="0" y="0"/>
+                      <a:ext cx="5943600" cy="2023745"/>
+                    </a:xfrm>
+                    <a:prstGeom prst="rect">
+                      <a:avLst/>
+                    </a:prstGeom>
+                    <a:ln>
+                      <a:solidFill>
+                        <a:schemeClr val="tx1"/>
+                      </a:solidFill>
+                    </a:ln>
+                  </pic:spPr>
+                </pic:pic>
+              </a:graphicData>
+            </a:graphic>
+          </wp:inline>
+        </w:drawing>
+      </w:r>
+    </w:p>
+    <w:p>
+      <w:pPr>
+        <w:pStyle w:val="ListParagraph"/>
+        <w:numPr>
+          <w:ilvl w:val="0"/>
+          <w:numId w:val="7"/>
+        </w:numPr>
+      </w:pPr>
+      <w:r>
+        <w:t xml:space="preserve">Create an LML Action Diagram from the </w:t>
+      </w:r>
+      <w:r>
+        <w:rPr>
+          <w:b/>
+          <w:bCs/>
+        </w:rPr>
+        <w:t>Test Case</w:t>
+      </w:r>
+      <w:r>
+        <w:t xml:space="preserve"> generated in Module 4.</w:t>
+      </w:r>
+      <w:r>
+        <w:t xml:space="preserve"> </w:t>
+      </w:r>
+    </w:p>
+    <w:p>
+      <w:pPr>
+        <w:pStyle w:val="ListParagraph"/>
+        <w:rPr>
+          <w:b/>
+          <w:bCs/>
+        </w:rPr>
+      </w:pPr>
+      <w:r>
+        <w:rPr>
+          <w:b/>
+          <w:bCs/>
+        </w:rPr>
+        <w:t>NOTE: This will vary for each individual.</w:t>
+      </w:r>
+    </w:p>
+    <w:p>
+      <w:pPr>
+        <w:pStyle w:val="ListParagraph"/>
+        <w:numPr>
+          <w:ilvl w:val="0"/>
+          <w:numId w:val="7"/>
+        </w:numPr>
+      </w:pPr>
+      <w:r>
+        <w:t xml:space="preserve">Create a traceability matrix that assigns </w:t>
+      </w:r>
+      <w:r>
+        <w:rPr>
+          <w:b/>
+          <w:bCs/>
+        </w:rPr>
+        <w:t>Assets</w:t>
+      </w:r>
+      <w:r>
+        <w:t xml:space="preserve"> to the </w:t>
+      </w:r>
+      <w:r>
+        <w:rPr>
+          <w:b/>
+          <w:bCs/>
+        </w:rPr>
+        <w:t>Actions</w:t>
+      </w:r>
+      <w:r>
+        <w:rPr>
+          <w:b/>
+          <w:bCs/>
+        </w:rPr>
+        <w:t xml:space="preserve"> </w:t>
+      </w:r>
+      <w:r>
+        <w:t>that each performs:</w:t>
+      </w:r>
+    </w:p>
+    <w:p>
+      <w:pPr>
+        <w:pStyle w:val="ListParagraph"/>
+        <w:jc w:val="center"/>
+      </w:pPr>
+      <w:r>
+        <w:drawing>
+          <wp:inline distT="0" distB="0" distL="0" distR="0" wp14:anchorId="417C89DD" wp14:editId="5C1D4DEE">
+            <wp:extent cx="3969823" cy="2519735"/>
+            <wp:effectExtent l="12700" t="12700" r="18415" b="7620"/>
+            <wp:docPr id="1711594067" name="Picture 1" descr="A screenshot of a phone call&#10;&#10;AI-generated content may be incorrect."/>
+            <wp:cNvGraphicFramePr>
+              <a:graphicFrameLocks xmlns:a="http://schemas.openxmlformats.org/drawingml/2006/main" noChangeAspect="1"/>
+            </wp:cNvGraphicFramePr>
+            <a:graphic xmlns:a="http://schemas.openxmlformats.org/drawingml/2006/main">
+              <a:graphicData uri="http://schemas.openxmlformats.org/drawingml/2006/picture">
+                <pic:pic xmlns:pic="http://schemas.openxmlformats.org/drawingml/2006/picture">
+                  <pic:nvPicPr>
+                    <pic:cNvPr id="1711594067" name="Picture 1" descr="A screenshot of a phone call&#10;&#10;AI-generated content may be incorrect."/>
+                    <pic:cNvPicPr/>
+                  </pic:nvPicPr>
+                  <pic:blipFill>
+                    <a:blip r:embed="rId21"/>
+                    <a:stretch>
+                      <a:fillRect/>
+                    </a:stretch>
+                  </pic:blipFill>
+                  <pic:spPr>
+                    <a:xfrm>
+                      <a:off x="0" y="0"/>
+                      <a:ext cx="3976570" cy="2524017"/>
+                    </a:xfrm>
+                    <a:prstGeom prst="rect">
+                      <a:avLst/>
+                    </a:prstGeom>
+                    <a:ln>
+                      <a:solidFill>
+                        <a:schemeClr val="tx1"/>
+                      </a:solidFill>
+                    </a:ln>
+                  </pic:spPr>
+                </pic:pic>
+              </a:graphicData>
+            </a:graphic>
+          </wp:inline>
+        </w:drawing>
+      </w:r>
+    </w:p>
+    <w:p>
+      <w:pPr>
+        <w:pStyle w:val="ListParagraph"/>
+        <w:jc w:val="center"/>
+      </w:pPr>
+    </w:p>
+    <w:p>
+      <w:pPr>
+        <w:pStyle w:val="ListParagraph"/>
+        <w:numPr>
+          <w:ilvl w:val="0"/>
+          <w:numId w:val="7"/>
+        </w:numPr>
+      </w:pPr>
+      <w:r>
+        <w:t xml:space="preserve">Open the LML Spider Diagram for </w:t>
+      </w:r>
+      <w:r>
+        <w:t>the “Cell Phone” Asset.</w:t>
+      </w:r>
+    </w:p>
+    <w:p>
+      <w:pPr>
+        <w:pStyle w:val="ListParagraph"/>
+        <w:jc w:val="center"/>
+      </w:pPr>
+      <w:r>
+        <w:rPr>
+          <w:noProof/>
+        </w:rPr>
+        <w:lastRenderedPageBreak/>
+        <w:drawing>
+          <wp:inline distT="0" distB="0" distL="0" distR="0" wp14:anchorId="0ADC4661" wp14:editId="23393541">
+            <wp:extent cx="3898640" cy="3980695"/>
+            <wp:effectExtent l="12700" t="12700" r="13335" b="7620"/>
+            <wp:docPr id="46247936" name="Picture 2" descr="A diagram of a cell phone&#10;&#10;AI-generated content may be incorrect."/>
+            <wp:cNvGraphicFramePr>
+              <a:graphicFrameLocks xmlns:a="http://schemas.openxmlformats.org/drawingml/2006/main" noChangeAspect="1"/>
+            </wp:cNvGraphicFramePr>
+            <a:graphic xmlns:a="http://schemas.openxmlformats.org/drawingml/2006/main">
+              <a:graphicData uri="http://schemas.openxmlformats.org/drawingml/2006/picture">
+                <pic:pic xmlns:pic="http://schemas.openxmlformats.org/drawingml/2006/picture">
+                  <pic:nvPicPr>
+                    <pic:cNvPr id="46247936" name="Picture 2" descr="A diagram of a cell phone&#10;&#10;AI-generated content may be incorrect."/>
+                    <pic:cNvPicPr/>
+                  </pic:nvPicPr>
+                  <pic:blipFill>
+                    <a:blip r:embed="rId22" cstate="print">
+                      <a:extLst>
+                        <a:ext uri="{28A0092B-C50C-407E-A947-70E740481C1C}">
+                          <a14:useLocalDpi xmlns:a14="http://schemas.microsoft.com/office/drawing/2010/main" val="0"/>
+                        </a:ext>
+                      </a:extLst>
+                    </a:blip>
+                    <a:stretch>
+                      <a:fillRect/>
+                    </a:stretch>
+                  </pic:blipFill>
+                  <pic:spPr>
+                    <a:xfrm>
+                      <a:off x="0" y="0"/>
+                      <a:ext cx="3908131" cy="3990385"/>
+                    </a:xfrm>
+                    <a:prstGeom prst="rect">
+                      <a:avLst/>
+                    </a:prstGeom>
+                    <a:ln>
+                      <a:solidFill>
+                        <a:schemeClr val="tx1"/>
+                      </a:solidFill>
+                    </a:ln>
+                  </pic:spPr>
+                </pic:pic>
+              </a:graphicData>
+            </a:graphic>
+          </wp:inline>
+        </w:drawing>
+      </w:r>
+    </w:p>
+    <w:p/>
+    <w:p/>
     <w:sectPr>
       <w:pgSz w:w="12240" w:h="15840"/>
       <w:pgMar w:top="1440" w:right="1440" w:bottom="1440" w:left="1440" w:header="720" w:footer="720" w:gutter="0"/>
@@ -251,8 +2701,614 @@
       </w:pPr>
     </w:lvl>
   </w:abstractNum>
+  <w:abstractNum w:abstractNumId="1" w15:restartNumberingAfterBreak="0">
+    <w:nsid w:val="0C3B6BFF"/>
+    <w:multiLevelType w:val="hybridMultilevel"/>
+    <w:tmpl w:val="3DA09894"/>
+    <w:lvl w:ilvl="0" w:tplc="0409000F">
+      <w:start w:val="1"/>
+      <w:numFmt w:val="decimal"/>
+      <w:lvlText w:val="%1."/>
+      <w:lvlJc w:val="left"/>
+      <w:pPr>
+        <w:ind w:left="720" w:hanging="360"/>
+      </w:pPr>
+      <w:rPr>
+        <w:rFonts w:hint="default"/>
+      </w:rPr>
+    </w:lvl>
+    <w:lvl w:ilvl="1" w:tplc="04090001">
+      <w:start w:val="1"/>
+      <w:numFmt w:val="bullet"/>
+      <w:lvlText w:val=""/>
+      <w:lvlJc w:val="left"/>
+      <w:pPr>
+        <w:ind w:left="1440" w:hanging="360"/>
+      </w:pPr>
+      <w:rPr>
+        <w:rFonts w:ascii="Symbol" w:hAnsi="Symbol" w:hint="default"/>
+      </w:rPr>
+    </w:lvl>
+    <w:lvl w:ilvl="2" w:tplc="0409001B" w:tentative="1">
+      <w:start w:val="1"/>
+      <w:numFmt w:val="lowerRoman"/>
+      <w:lvlText w:val="%3."/>
+      <w:lvlJc w:val="right"/>
+      <w:pPr>
+        <w:ind w:left="2160" w:hanging="180"/>
+      </w:pPr>
+    </w:lvl>
+    <w:lvl w:ilvl="3" w:tplc="0409000F" w:tentative="1">
+      <w:start w:val="1"/>
+      <w:numFmt w:val="decimal"/>
+      <w:lvlText w:val="%4."/>
+      <w:lvlJc w:val="left"/>
+      <w:pPr>
+        <w:ind w:left="2880" w:hanging="360"/>
+      </w:pPr>
+    </w:lvl>
+    <w:lvl w:ilvl="4" w:tplc="04090019" w:tentative="1">
+      <w:start w:val="1"/>
+      <w:numFmt w:val="lowerLetter"/>
+      <w:lvlText w:val="%5."/>
+      <w:lvlJc w:val="left"/>
+      <w:pPr>
+        <w:ind w:left="3600" w:hanging="360"/>
+      </w:pPr>
+    </w:lvl>
+    <w:lvl w:ilvl="5" w:tplc="0409001B" w:tentative="1">
+      <w:start w:val="1"/>
+      <w:numFmt w:val="lowerRoman"/>
+      <w:lvlText w:val="%6."/>
+      <w:lvlJc w:val="right"/>
+      <w:pPr>
+        <w:ind w:left="4320" w:hanging="180"/>
+      </w:pPr>
+    </w:lvl>
+    <w:lvl w:ilvl="6" w:tplc="0409000F" w:tentative="1">
+      <w:start w:val="1"/>
+      <w:numFmt w:val="decimal"/>
+      <w:lvlText w:val="%7."/>
+      <w:lvlJc w:val="left"/>
+      <w:pPr>
+        <w:ind w:left="5040" w:hanging="360"/>
+      </w:pPr>
+    </w:lvl>
+    <w:lvl w:ilvl="7" w:tplc="04090019" w:tentative="1">
+      <w:start w:val="1"/>
+      <w:numFmt w:val="lowerLetter"/>
+      <w:lvlText w:val="%8."/>
+      <w:lvlJc w:val="left"/>
+      <w:pPr>
+        <w:ind w:left="5760" w:hanging="360"/>
+      </w:pPr>
+    </w:lvl>
+    <w:lvl w:ilvl="8" w:tplc="0409001B" w:tentative="1">
+      <w:start w:val="1"/>
+      <w:numFmt w:val="lowerRoman"/>
+      <w:lvlText w:val="%9."/>
+      <w:lvlJc w:val="right"/>
+      <w:pPr>
+        <w:ind w:left="6480" w:hanging="180"/>
+      </w:pPr>
+    </w:lvl>
+  </w:abstractNum>
+  <w:abstractNum w:abstractNumId="2" w15:restartNumberingAfterBreak="0">
+    <w:nsid w:val="21586A94"/>
+    <w:multiLevelType w:val="hybridMultilevel"/>
+    <w:tmpl w:val="D4566E76"/>
+    <w:lvl w:ilvl="0" w:tplc="0409000F">
+      <w:start w:val="1"/>
+      <w:numFmt w:val="decimal"/>
+      <w:lvlText w:val="%1."/>
+      <w:lvlJc w:val="left"/>
+      <w:pPr>
+        <w:ind w:left="720" w:hanging="360"/>
+      </w:pPr>
+      <w:rPr>
+        <w:rFonts w:hint="default"/>
+      </w:rPr>
+    </w:lvl>
+    <w:lvl w:ilvl="1" w:tplc="04090019" w:tentative="1">
+      <w:start w:val="1"/>
+      <w:numFmt w:val="lowerLetter"/>
+      <w:lvlText w:val="%2."/>
+      <w:lvlJc w:val="left"/>
+      <w:pPr>
+        <w:ind w:left="1440" w:hanging="360"/>
+      </w:pPr>
+    </w:lvl>
+    <w:lvl w:ilvl="2" w:tplc="0409001B" w:tentative="1">
+      <w:start w:val="1"/>
+      <w:numFmt w:val="lowerRoman"/>
+      <w:lvlText w:val="%3."/>
+      <w:lvlJc w:val="right"/>
+      <w:pPr>
+        <w:ind w:left="2160" w:hanging="180"/>
+      </w:pPr>
+    </w:lvl>
+    <w:lvl w:ilvl="3" w:tplc="0409000F" w:tentative="1">
+      <w:start w:val="1"/>
+      <w:numFmt w:val="decimal"/>
+      <w:lvlText w:val="%4."/>
+      <w:lvlJc w:val="left"/>
+      <w:pPr>
+        <w:ind w:left="2880" w:hanging="360"/>
+      </w:pPr>
+    </w:lvl>
+    <w:lvl w:ilvl="4" w:tplc="04090019" w:tentative="1">
+      <w:start w:val="1"/>
+      <w:numFmt w:val="lowerLetter"/>
+      <w:lvlText w:val="%5."/>
+      <w:lvlJc w:val="left"/>
+      <w:pPr>
+        <w:ind w:left="3600" w:hanging="360"/>
+      </w:pPr>
+    </w:lvl>
+    <w:lvl w:ilvl="5" w:tplc="0409001B" w:tentative="1">
+      <w:start w:val="1"/>
+      <w:numFmt w:val="lowerRoman"/>
+      <w:lvlText w:val="%6."/>
+      <w:lvlJc w:val="right"/>
+      <w:pPr>
+        <w:ind w:left="4320" w:hanging="180"/>
+      </w:pPr>
+    </w:lvl>
+    <w:lvl w:ilvl="6" w:tplc="0409000F" w:tentative="1">
+      <w:start w:val="1"/>
+      <w:numFmt w:val="decimal"/>
+      <w:lvlText w:val="%7."/>
+      <w:lvlJc w:val="left"/>
+      <w:pPr>
+        <w:ind w:left="5040" w:hanging="360"/>
+      </w:pPr>
+    </w:lvl>
+    <w:lvl w:ilvl="7" w:tplc="04090019" w:tentative="1">
+      <w:start w:val="1"/>
+      <w:numFmt w:val="lowerLetter"/>
+      <w:lvlText w:val="%8."/>
+      <w:lvlJc w:val="left"/>
+      <w:pPr>
+        <w:ind w:left="5760" w:hanging="360"/>
+      </w:pPr>
+    </w:lvl>
+    <w:lvl w:ilvl="8" w:tplc="0409001B" w:tentative="1">
+      <w:start w:val="1"/>
+      <w:numFmt w:val="lowerRoman"/>
+      <w:lvlText w:val="%9."/>
+      <w:lvlJc w:val="right"/>
+      <w:pPr>
+        <w:ind w:left="6480" w:hanging="180"/>
+      </w:pPr>
+    </w:lvl>
+  </w:abstractNum>
+  <w:abstractNum w:abstractNumId="3" w15:restartNumberingAfterBreak="0">
+    <w:nsid w:val="4A781677"/>
+    <w:multiLevelType w:val="hybridMultilevel"/>
+    <w:tmpl w:val="8906188C"/>
+    <w:lvl w:ilvl="0" w:tplc="64B27E4C">
+      <w:start w:val="1"/>
+      <w:numFmt w:val="decimal"/>
+      <w:lvlText w:val="%1."/>
+      <w:lvlJc w:val="left"/>
+      <w:pPr>
+        <w:ind w:left="720" w:hanging="360"/>
+      </w:pPr>
+      <w:rPr>
+        <w:rFonts w:eastAsiaTheme="majorEastAsia" w:hint="default"/>
+      </w:rPr>
+    </w:lvl>
+    <w:lvl w:ilvl="1" w:tplc="04090019" w:tentative="1">
+      <w:start w:val="1"/>
+      <w:numFmt w:val="lowerLetter"/>
+      <w:lvlText w:val="%2."/>
+      <w:lvlJc w:val="left"/>
+      <w:pPr>
+        <w:ind w:left="1440" w:hanging="360"/>
+      </w:pPr>
+    </w:lvl>
+    <w:lvl w:ilvl="2" w:tplc="0409001B" w:tentative="1">
+      <w:start w:val="1"/>
+      <w:numFmt w:val="lowerRoman"/>
+      <w:lvlText w:val="%3."/>
+      <w:lvlJc w:val="right"/>
+      <w:pPr>
+        <w:ind w:left="2160" w:hanging="180"/>
+      </w:pPr>
+    </w:lvl>
+    <w:lvl w:ilvl="3" w:tplc="0409000F" w:tentative="1">
+      <w:start w:val="1"/>
+      <w:numFmt w:val="decimal"/>
+      <w:lvlText w:val="%4."/>
+      <w:lvlJc w:val="left"/>
+      <w:pPr>
+        <w:ind w:left="2880" w:hanging="360"/>
+      </w:pPr>
+    </w:lvl>
+    <w:lvl w:ilvl="4" w:tplc="04090019" w:tentative="1">
+      <w:start w:val="1"/>
+      <w:numFmt w:val="lowerLetter"/>
+      <w:lvlText w:val="%5."/>
+      <w:lvlJc w:val="left"/>
+      <w:pPr>
+        <w:ind w:left="3600" w:hanging="360"/>
+      </w:pPr>
+    </w:lvl>
+    <w:lvl w:ilvl="5" w:tplc="0409001B" w:tentative="1">
+      <w:start w:val="1"/>
+      <w:numFmt w:val="lowerRoman"/>
+      <w:lvlText w:val="%6."/>
+      <w:lvlJc w:val="right"/>
+      <w:pPr>
+        <w:ind w:left="4320" w:hanging="180"/>
+      </w:pPr>
+    </w:lvl>
+    <w:lvl w:ilvl="6" w:tplc="0409000F" w:tentative="1">
+      <w:start w:val="1"/>
+      <w:numFmt w:val="decimal"/>
+      <w:lvlText w:val="%7."/>
+      <w:lvlJc w:val="left"/>
+      <w:pPr>
+        <w:ind w:left="5040" w:hanging="360"/>
+      </w:pPr>
+    </w:lvl>
+    <w:lvl w:ilvl="7" w:tplc="04090019" w:tentative="1">
+      <w:start w:val="1"/>
+      <w:numFmt w:val="lowerLetter"/>
+      <w:lvlText w:val="%8."/>
+      <w:lvlJc w:val="left"/>
+      <w:pPr>
+        <w:ind w:left="5760" w:hanging="360"/>
+      </w:pPr>
+    </w:lvl>
+    <w:lvl w:ilvl="8" w:tplc="0409001B" w:tentative="1">
+      <w:start w:val="1"/>
+      <w:numFmt w:val="lowerRoman"/>
+      <w:lvlText w:val="%9."/>
+      <w:lvlJc w:val="right"/>
+      <w:pPr>
+        <w:ind w:left="6480" w:hanging="180"/>
+      </w:pPr>
+    </w:lvl>
+  </w:abstractNum>
+  <w:abstractNum w:abstractNumId="4" w15:restartNumberingAfterBreak="0">
+    <w:nsid w:val="51D17E2A"/>
+    <w:multiLevelType w:val="multilevel"/>
+    <w:tmpl w:val="EDBE45C0"/>
+    <w:lvl w:ilvl="0">
+      <w:start w:val="3"/>
+      <w:numFmt w:val="decimal"/>
+      <w:lvlText w:val="%1."/>
+      <w:lvlJc w:val="left"/>
+      <w:pPr>
+        <w:tabs>
+          <w:tab w:val="num" w:pos="720"/>
+        </w:tabs>
+        <w:ind w:left="720" w:hanging="360"/>
+      </w:pPr>
+    </w:lvl>
+    <w:lvl w:ilvl="1" w:tentative="1">
+      <w:start w:val="1"/>
+      <w:numFmt w:val="decimal"/>
+      <w:lvlText w:val="%2."/>
+      <w:lvlJc w:val="left"/>
+      <w:pPr>
+        <w:tabs>
+          <w:tab w:val="num" w:pos="1440"/>
+        </w:tabs>
+        <w:ind w:left="1440" w:hanging="360"/>
+      </w:pPr>
+    </w:lvl>
+    <w:lvl w:ilvl="2" w:tentative="1">
+      <w:start w:val="1"/>
+      <w:numFmt w:val="decimal"/>
+      <w:lvlText w:val="%3."/>
+      <w:lvlJc w:val="left"/>
+      <w:pPr>
+        <w:tabs>
+          <w:tab w:val="num" w:pos="2160"/>
+        </w:tabs>
+        <w:ind w:left="2160" w:hanging="360"/>
+      </w:pPr>
+    </w:lvl>
+    <w:lvl w:ilvl="3" w:tentative="1">
+      <w:start w:val="1"/>
+      <w:numFmt w:val="decimal"/>
+      <w:lvlText w:val="%4."/>
+      <w:lvlJc w:val="left"/>
+      <w:pPr>
+        <w:tabs>
+          <w:tab w:val="num" w:pos="2880"/>
+        </w:tabs>
+        <w:ind w:left="2880" w:hanging="360"/>
+      </w:pPr>
+    </w:lvl>
+    <w:lvl w:ilvl="4" w:tentative="1">
+      <w:start w:val="1"/>
+      <w:numFmt w:val="decimal"/>
+      <w:lvlText w:val="%5."/>
+      <w:lvlJc w:val="left"/>
+      <w:pPr>
+        <w:tabs>
+          <w:tab w:val="num" w:pos="3600"/>
+        </w:tabs>
+        <w:ind w:left="3600" w:hanging="360"/>
+      </w:pPr>
+    </w:lvl>
+    <w:lvl w:ilvl="5" w:tentative="1">
+      <w:start w:val="1"/>
+      <w:numFmt w:val="decimal"/>
+      <w:lvlText w:val="%6."/>
+      <w:lvlJc w:val="left"/>
+      <w:pPr>
+        <w:tabs>
+          <w:tab w:val="num" w:pos="4320"/>
+        </w:tabs>
+        <w:ind w:left="4320" w:hanging="360"/>
+      </w:pPr>
+    </w:lvl>
+    <w:lvl w:ilvl="6" w:tentative="1">
+      <w:start w:val="1"/>
+      <w:numFmt w:val="decimal"/>
+      <w:lvlText w:val="%7."/>
+      <w:lvlJc w:val="left"/>
+      <w:pPr>
+        <w:tabs>
+          <w:tab w:val="num" w:pos="5040"/>
+        </w:tabs>
+        <w:ind w:left="5040" w:hanging="360"/>
+      </w:pPr>
+    </w:lvl>
+    <w:lvl w:ilvl="7" w:tentative="1">
+      <w:start w:val="1"/>
+      <w:numFmt w:val="decimal"/>
+      <w:lvlText w:val="%8."/>
+      <w:lvlJc w:val="left"/>
+      <w:pPr>
+        <w:tabs>
+          <w:tab w:val="num" w:pos="5760"/>
+        </w:tabs>
+        <w:ind w:left="5760" w:hanging="360"/>
+      </w:pPr>
+    </w:lvl>
+    <w:lvl w:ilvl="8" w:tentative="1">
+      <w:start w:val="1"/>
+      <w:numFmt w:val="decimal"/>
+      <w:lvlText w:val="%9."/>
+      <w:lvlJc w:val="left"/>
+      <w:pPr>
+        <w:tabs>
+          <w:tab w:val="num" w:pos="6480"/>
+        </w:tabs>
+        <w:ind w:left="6480" w:hanging="360"/>
+      </w:pPr>
+    </w:lvl>
+  </w:abstractNum>
+  <w:abstractNum w:abstractNumId="5" w15:restartNumberingAfterBreak="0">
+    <w:nsid w:val="5A5B29B9"/>
+    <w:multiLevelType w:val="hybridMultilevel"/>
+    <w:tmpl w:val="864ED132"/>
+    <w:lvl w:ilvl="0" w:tplc="0409000F">
+      <w:start w:val="1"/>
+      <w:numFmt w:val="decimal"/>
+      <w:lvlText w:val="%1."/>
+      <w:lvlJc w:val="left"/>
+      <w:pPr>
+        <w:ind w:left="720" w:hanging="360"/>
+      </w:pPr>
+      <w:rPr>
+        <w:rFonts w:hint="default"/>
+      </w:rPr>
+    </w:lvl>
+    <w:lvl w:ilvl="1" w:tplc="04090001">
+      <w:start w:val="1"/>
+      <w:numFmt w:val="bullet"/>
+      <w:lvlText w:val=""/>
+      <w:lvlJc w:val="left"/>
+      <w:pPr>
+        <w:ind w:left="1440" w:hanging="360"/>
+      </w:pPr>
+      <w:rPr>
+        <w:rFonts w:ascii="Symbol" w:hAnsi="Symbol" w:hint="default"/>
+      </w:rPr>
+    </w:lvl>
+    <w:lvl w:ilvl="2" w:tplc="0409001B" w:tentative="1">
+      <w:start w:val="1"/>
+      <w:numFmt w:val="lowerRoman"/>
+      <w:lvlText w:val="%3."/>
+      <w:lvlJc w:val="right"/>
+      <w:pPr>
+        <w:ind w:left="2160" w:hanging="180"/>
+      </w:pPr>
+    </w:lvl>
+    <w:lvl w:ilvl="3" w:tplc="0409000F" w:tentative="1">
+      <w:start w:val="1"/>
+      <w:numFmt w:val="decimal"/>
+      <w:lvlText w:val="%4."/>
+      <w:lvlJc w:val="left"/>
+      <w:pPr>
+        <w:ind w:left="2880" w:hanging="360"/>
+      </w:pPr>
+    </w:lvl>
+    <w:lvl w:ilvl="4" w:tplc="04090019" w:tentative="1">
+      <w:start w:val="1"/>
+      <w:numFmt w:val="lowerLetter"/>
+      <w:lvlText w:val="%5."/>
+      <w:lvlJc w:val="left"/>
+      <w:pPr>
+        <w:ind w:left="3600" w:hanging="360"/>
+      </w:pPr>
+    </w:lvl>
+    <w:lvl w:ilvl="5" w:tplc="0409001B" w:tentative="1">
+      <w:start w:val="1"/>
+      <w:numFmt w:val="lowerRoman"/>
+      <w:lvlText w:val="%6."/>
+      <w:lvlJc w:val="right"/>
+      <w:pPr>
+        <w:ind w:left="4320" w:hanging="180"/>
+      </w:pPr>
+    </w:lvl>
+    <w:lvl w:ilvl="6" w:tplc="0409000F" w:tentative="1">
+      <w:start w:val="1"/>
+      <w:numFmt w:val="decimal"/>
+      <w:lvlText w:val="%7."/>
+      <w:lvlJc w:val="left"/>
+      <w:pPr>
+        <w:ind w:left="5040" w:hanging="360"/>
+      </w:pPr>
+    </w:lvl>
+    <w:lvl w:ilvl="7" w:tplc="04090019" w:tentative="1">
+      <w:start w:val="1"/>
+      <w:numFmt w:val="lowerLetter"/>
+      <w:lvlText w:val="%8."/>
+      <w:lvlJc w:val="left"/>
+      <w:pPr>
+        <w:ind w:left="5760" w:hanging="360"/>
+      </w:pPr>
+    </w:lvl>
+    <w:lvl w:ilvl="8" w:tplc="0409001B" w:tentative="1">
+      <w:start w:val="1"/>
+      <w:numFmt w:val="lowerRoman"/>
+      <w:lvlText w:val="%9."/>
+      <w:lvlJc w:val="right"/>
+      <w:pPr>
+        <w:ind w:left="6480" w:hanging="180"/>
+      </w:pPr>
+    </w:lvl>
+  </w:abstractNum>
+  <w:abstractNum w:abstractNumId="6" w15:restartNumberingAfterBreak="0">
+    <w:nsid w:val="778A3592"/>
+    <w:multiLevelType w:val="multilevel"/>
+    <w:tmpl w:val="9A80904A"/>
+    <w:lvl w:ilvl="0">
+      <w:start w:val="4"/>
+      <w:numFmt w:val="decimal"/>
+      <w:lvlText w:val="%1."/>
+      <w:lvlJc w:val="left"/>
+      <w:pPr>
+        <w:tabs>
+          <w:tab w:val="num" w:pos="720"/>
+        </w:tabs>
+        <w:ind w:left="720" w:hanging="360"/>
+      </w:pPr>
+    </w:lvl>
+    <w:lvl w:ilvl="1" w:tentative="1">
+      <w:start w:val="1"/>
+      <w:numFmt w:val="decimal"/>
+      <w:lvlText w:val="%2."/>
+      <w:lvlJc w:val="left"/>
+      <w:pPr>
+        <w:tabs>
+          <w:tab w:val="num" w:pos="1440"/>
+        </w:tabs>
+        <w:ind w:left="1440" w:hanging="360"/>
+      </w:pPr>
+    </w:lvl>
+    <w:lvl w:ilvl="2" w:tentative="1">
+      <w:start w:val="1"/>
+      <w:numFmt w:val="decimal"/>
+      <w:lvlText w:val="%3."/>
+      <w:lvlJc w:val="left"/>
+      <w:pPr>
+        <w:tabs>
+          <w:tab w:val="num" w:pos="2160"/>
+        </w:tabs>
+        <w:ind w:left="2160" w:hanging="360"/>
+      </w:pPr>
+    </w:lvl>
+    <w:lvl w:ilvl="3" w:tentative="1">
+      <w:start w:val="1"/>
+      <w:numFmt w:val="decimal"/>
+      <w:lvlText w:val="%4."/>
+      <w:lvlJc w:val="left"/>
+      <w:pPr>
+        <w:tabs>
+          <w:tab w:val="num" w:pos="2880"/>
+        </w:tabs>
+        <w:ind w:left="2880" w:hanging="360"/>
+      </w:pPr>
+    </w:lvl>
+    <w:lvl w:ilvl="4" w:tentative="1">
+      <w:start w:val="1"/>
+      <w:numFmt w:val="decimal"/>
+      <w:lvlText w:val="%5."/>
+      <w:lvlJc w:val="left"/>
+      <w:pPr>
+        <w:tabs>
+          <w:tab w:val="num" w:pos="3600"/>
+        </w:tabs>
+        <w:ind w:left="3600" w:hanging="360"/>
+      </w:pPr>
+    </w:lvl>
+    <w:lvl w:ilvl="5" w:tentative="1">
+      <w:start w:val="1"/>
+      <w:numFmt w:val="decimal"/>
+      <w:lvlText w:val="%6."/>
+      <w:lvlJc w:val="left"/>
+      <w:pPr>
+        <w:tabs>
+          <w:tab w:val="num" w:pos="4320"/>
+        </w:tabs>
+        <w:ind w:left="4320" w:hanging="360"/>
+      </w:pPr>
+    </w:lvl>
+    <w:lvl w:ilvl="6" w:tentative="1">
+      <w:start w:val="1"/>
+      <w:numFmt w:val="decimal"/>
+      <w:lvlText w:val="%7."/>
+      <w:lvlJc w:val="left"/>
+      <w:pPr>
+        <w:tabs>
+          <w:tab w:val="num" w:pos="5040"/>
+        </w:tabs>
+        <w:ind w:left="5040" w:hanging="360"/>
+      </w:pPr>
+    </w:lvl>
+    <w:lvl w:ilvl="7" w:tentative="1">
+      <w:start w:val="1"/>
+      <w:numFmt w:val="decimal"/>
+      <w:lvlText w:val="%8."/>
+      <w:lvlJc w:val="left"/>
+      <w:pPr>
+        <w:tabs>
+          <w:tab w:val="num" w:pos="5760"/>
+        </w:tabs>
+        <w:ind w:left="5760" w:hanging="360"/>
+      </w:pPr>
+    </w:lvl>
+    <w:lvl w:ilvl="8" w:tentative="1">
+      <w:start w:val="1"/>
+      <w:numFmt w:val="decimal"/>
+      <w:lvlText w:val="%9."/>
+      <w:lvlJc w:val="left"/>
+      <w:pPr>
+        <w:tabs>
+          <w:tab w:val="num" w:pos="6480"/>
+        </w:tabs>
+        <w:ind w:left="6480" w:hanging="360"/>
+      </w:pPr>
+    </w:lvl>
+  </w:abstractNum>
   <w:num w:numId="1" w16cid:durableId="1415130275">
     <w:abstractNumId w:val="0"/>
+  </w:num>
+  <w:num w:numId="2" w16cid:durableId="500584028">
+    <w:abstractNumId w:val="2"/>
+  </w:num>
+  <w:num w:numId="3" w16cid:durableId="502471127">
+    <w:abstractNumId w:val="4"/>
+  </w:num>
+  <w:num w:numId="4" w16cid:durableId="1717464026">
+    <w:abstractNumId w:val="6"/>
+  </w:num>
+  <w:num w:numId="5" w16cid:durableId="1706830283">
+    <w:abstractNumId w:val="1"/>
+  </w:num>
+  <w:num w:numId="6" w16cid:durableId="1607957873">
+    <w:abstractNumId w:val="3"/>
+  </w:num>
+  <w:num w:numId="7" w16cid:durableId="1586721850">
+    <w:abstractNumId w:val="5"/>
   </w:num>
 </w:numbering>
 </file>
@@ -860,7 +3916,6 @@
   <w:style w:type="character" w:default="1" w:styleId="DefaultParagraphFont">
     <w:name w:val="Default Paragraph Font"/>
     <w:uiPriority w:val="1"/>
-    <w:semiHidden/>
     <w:unhideWhenUsed/>
   </w:style>
   <w:style w:type="table" w:default="1" w:styleId="TableNormal">
@@ -1174,6 +4229,63 @@
       <w:spacing w:val="5"/>
     </w:rPr>
   </w:style>
+  <w:style w:type="paragraph" w:customStyle="1" w:styleId="paragraph">
+    <w:name w:val="paragraph"/>
+    <w:basedOn w:val="Normal"/>
+    <w:rsid w:val="00753BB0"/>
+    <w:pPr>
+      <w:spacing w:before="100" w:beforeAutospacing="1" w:after="100" w:afterAutospacing="1" w:line="240" w:lineRule="auto"/>
+    </w:pPr>
+    <w:rPr>
+      <w:rFonts w:ascii="Times New Roman" w:eastAsia="Times New Roman" w:hAnsi="Times New Roman" w:cs="Times New Roman"/>
+      <w:kern w:val="0"/>
+      <w14:ligatures w14:val="none"/>
+    </w:rPr>
+  </w:style>
+  <w:style w:type="character" w:customStyle="1" w:styleId="normaltextrun">
+    <w:name w:val="normaltextrun"/>
+    <w:basedOn w:val="DefaultParagraphFont"/>
+    <w:rsid w:val="00753BB0"/>
+  </w:style>
+  <w:style w:type="character" w:customStyle="1" w:styleId="eop">
+    <w:name w:val="eop"/>
+    <w:basedOn w:val="DefaultParagraphFont"/>
+    <w:rsid w:val="00753BB0"/>
+  </w:style>
+  <w:style w:type="table" w:styleId="TableGrid">
+    <w:name w:val="Table Grid"/>
+    <w:basedOn w:val="TableNormal"/>
+    <w:uiPriority w:val="39"/>
+    <w:rsid w:val="008329AD"/>
+    <w:pPr>
+      <w:spacing w:after="0" w:line="240" w:lineRule="auto"/>
+    </w:pPr>
+    <w:tblPr>
+      <w:tblBorders>
+        <w:top w:val="single" w:sz="4" w:space="0" w:color="auto"/>
+        <w:left w:val="single" w:sz="4" w:space="0" w:color="auto"/>
+        <w:bottom w:val="single" w:sz="4" w:space="0" w:color="auto"/>
+        <w:right w:val="single" w:sz="4" w:space="0" w:color="auto"/>
+        <w:insideH w:val="single" w:sz="4" w:space="0" w:color="auto"/>
+        <w:insideV w:val="single" w:sz="4" w:space="0" w:color="auto"/>
+      </w:tblBorders>
+    </w:tblPr>
+  </w:style>
+  <w:style w:type="paragraph" w:styleId="NormalWeb">
+    <w:name w:val="Normal (Web)"/>
+    <w:basedOn w:val="Normal"/>
+    <w:uiPriority w:val="99"/>
+    <w:unhideWhenUsed/>
+    <w:rsid w:val="008329AD"/>
+    <w:pPr>
+      <w:spacing w:before="100" w:beforeAutospacing="1" w:after="100" w:afterAutospacing="1" w:line="240" w:lineRule="auto"/>
+    </w:pPr>
+    <w:rPr>
+      <w:rFonts w:ascii="Times New Roman" w:eastAsia="Times New Roman" w:hAnsi="Times New Roman" w:cs="Times New Roman"/>
+      <w:kern w:val="0"/>
+      <w14:ligatures w14:val="none"/>
+    </w:rPr>
+  </w:style>
 </w:styles>
 </file>
 
@@ -1470,4 +4582,16 @@
     </a:ext>
   </a:extLst>
 </a:theme>
+</file>
+
+<file path=customXml/item1.xml><?xml version="1.0" encoding="utf-8"?>
+<b:Sources xmlns:b="http://schemas.openxmlformats.org/officeDocument/2006/bibliography" xmlns="http://schemas.openxmlformats.org/officeDocument/2006/bibliography" SelectedStyle="/APASixthEditionOfficeOnline.xsl" StyleName="APA" Version="6"/>
+</file>
+
+<file path=customXml/itemProps1.xml><?xml version="1.0" encoding="utf-8"?>
+<ds:datastoreItem xmlns:ds="http://schemas.openxmlformats.org/officeDocument/2006/customXml" ds:itemID="{1B5D2FB3-1BB9-8749-8DEF-149992FE4E2C}">
+  <ds:schemaRefs>
+    <ds:schemaRef ds:uri="http://schemas.openxmlformats.org/officeDocument/2006/bibliography"/>
+  </ds:schemaRefs>
+</ds:datastoreItem>
 </file>
</xml_diff>

<commit_message>
updated tutorial and wsrc 2026 lab instructions
</commit_message>
<xml_diff>
--- a/2025_WSRC/2026 WSRC Tutorial Lab Instructions.docx
+++ b/2025_WSRC/2026 WSRC Tutorial Lab Instructions.docx
@@ -8,6 +8,8 @@
           <w:rFonts w:ascii="Montserrat" w:hAnsi="Montserrat"/>
           <w:b/>
           <w:bCs/>
+          <w:sz w:val="32"/>
+          <w:szCs w:val="32"/>
         </w:rPr>
       </w:pPr>
       <w:r>
@@ -15,6 +17,8 @@
           <w:rFonts w:ascii="Montserrat" w:hAnsi="Montserrat"/>
           <w:b/>
           <w:bCs/>
+          <w:sz w:val="32"/>
+          <w:szCs w:val="32"/>
         </w:rPr>
         <w:t>2026 WSRC Tutorial Lab Instructions</w:t>
       </w:r>
@@ -45,6 +49,14 @@
         <w:t>reqs</w:t>
       </w:r>
       <w:proofErr w:type="spellEnd"/>
+      <w:r>
+        <w:rPr>
+          <w:rFonts w:ascii="Montserrat" w:hAnsi="Montserrat"/>
+          <w:b/>
+          <w:bCs/>
+        </w:rPr>
+        <w:t>:</w:t>
+      </w:r>
     </w:p>
     <w:p>
       <w:pPr>
@@ -53,9 +65,21 @@
           <w:ilvl w:val="0"/>
           <w:numId w:val="1"/>
         </w:numPr>
-      </w:pPr>
-      <w:r>
+        <w:rPr>
+          <w:rFonts w:ascii="Montserrat" w:hAnsi="Montserrat" w:cs="Arabic Typesetting"/>
+        </w:rPr>
+      </w:pPr>
+      <w:r>
+        <w:rPr>
+          <w:rFonts w:ascii="Montserrat" w:hAnsi="Montserrat" w:cs="Arabic Typesetting"/>
+        </w:rPr>
         <w:t>Create an account at cloud.innoslate.com</w:t>
+      </w:r>
+      <w:r>
+        <w:rPr>
+          <w:rFonts w:ascii="Montserrat" w:hAnsi="Montserrat" w:cs="Arabic Typesetting"/>
+        </w:rPr>
+        <w:t>.</w:t>
       </w:r>
     </w:p>
     <w:p>
@@ -65,27 +89,57 @@
           <w:ilvl w:val="0"/>
           <w:numId w:val="1"/>
         </w:numPr>
-      </w:pPr>
-      <w:r>
+        <w:rPr>
+          <w:rFonts w:ascii="Montserrat" w:hAnsi="Montserrat" w:cs="Arabic Typesetting"/>
+        </w:rPr>
+      </w:pPr>
+      <w:r>
+        <w:rPr>
+          <w:rFonts w:ascii="Montserrat" w:hAnsi="Montserrat" w:cs="Arabic Typesetting"/>
+        </w:rPr>
         <w:t xml:space="preserve">Create a </w:t>
       </w:r>
       <w:r>
+        <w:rPr>
+          <w:rFonts w:ascii="Montserrat" w:hAnsi="Montserrat" w:cs="Arabic Typesetting"/>
+        </w:rPr>
         <w:t>N</w:t>
       </w:r>
       <w:r>
+        <w:rPr>
+          <w:rFonts w:ascii="Montserrat" w:hAnsi="Montserrat" w:cs="Arabic Typesetting"/>
+        </w:rPr>
         <w:t xml:space="preserve">ew </w:t>
       </w:r>
       <w:r>
+        <w:rPr>
+          <w:rFonts w:ascii="Montserrat" w:hAnsi="Montserrat" w:cs="Arabic Typesetting"/>
+        </w:rPr>
         <w:t>P</w:t>
       </w:r>
       <w:r>
+        <w:rPr>
+          <w:rFonts w:ascii="Montserrat" w:hAnsi="Montserrat" w:cs="Arabic Typesetting"/>
+        </w:rPr>
         <w:t>roject named “</w:t>
       </w:r>
       <w:r>
+        <w:rPr>
+          <w:rFonts w:ascii="Montserrat" w:hAnsi="Montserrat" w:cs="Arabic Typesetting"/>
+        </w:rPr>
         <w:t>Cell Phone Model</w:t>
       </w:r>
       <w:r>
+        <w:rPr>
+          <w:rFonts w:ascii="Montserrat" w:hAnsi="Montserrat" w:cs="Arabic Typesetting"/>
+        </w:rPr>
         <w:t>”</w:t>
+      </w:r>
+      <w:r>
+        <w:rPr>
+          <w:rFonts w:ascii="Montserrat" w:hAnsi="Montserrat" w:cs="Arabic Typesetting"/>
+        </w:rPr>
+        <w:t>.</w:t>
       </w:r>
     </w:p>
     <w:p>
@@ -102,7 +156,23 @@
           <w:b/>
           <w:bCs/>
         </w:rPr>
-        <w:t xml:space="preserve">Mod 4 - Requirements </w:t>
+        <w:t>Mod</w:t>
+      </w:r>
+      <w:r>
+        <w:rPr>
+          <w:rFonts w:ascii="Montserrat" w:hAnsi="Montserrat"/>
+          <w:b/>
+          <w:bCs/>
+        </w:rPr>
+        <w:t>ule</w:t>
+      </w:r>
+      <w:r>
+        <w:rPr>
+          <w:rFonts w:ascii="Montserrat" w:hAnsi="Montserrat"/>
+          <w:b/>
+          <w:bCs/>
+        </w:rPr>
+        <w:t xml:space="preserve"> 4 - Requirements </w:t>
       </w:r>
       <w:r>
         <w:rPr>
@@ -132,7 +202,7 @@
         <w:textAlignment w:val="baseline"/>
         <w:rPr>
           <w:rStyle w:val="eop"/>
-          <w:rFonts w:asciiTheme="minorHAnsi" w:hAnsiTheme="minorHAnsi" w:cs="Calibri"/>
+          <w:rFonts w:ascii="Montserrat" w:hAnsi="Montserrat" w:cs="Calibri"/>
           <w:sz w:val="22"/>
           <w:szCs w:val="22"/>
         </w:rPr>
@@ -140,7 +210,7 @@
       <w:r>
         <w:rPr>
           <w:rStyle w:val="normaltextrun"/>
-          <w:rFonts w:asciiTheme="minorHAnsi" w:eastAsiaTheme="majorEastAsia" w:hAnsiTheme="minorHAnsi" w:cs="Calibri"/>
+          <w:rFonts w:ascii="Montserrat" w:eastAsiaTheme="majorEastAsia" w:hAnsi="Montserrat" w:cs="Calibri"/>
           <w:sz w:val="22"/>
           <w:szCs w:val="22"/>
         </w:rPr>
@@ -149,7 +219,7 @@
       <w:r>
         <w:rPr>
           <w:rStyle w:val="normaltextrun"/>
-          <w:rFonts w:asciiTheme="minorHAnsi" w:eastAsiaTheme="majorEastAsia" w:hAnsiTheme="minorHAnsi" w:cs="Calibri"/>
+          <w:rFonts w:ascii="Montserrat" w:eastAsiaTheme="majorEastAsia" w:hAnsi="Montserrat" w:cs="Calibri"/>
           <w:i/>
           <w:iCs/>
           <w:sz w:val="22"/>
@@ -160,7 +230,7 @@
       <w:r>
         <w:rPr>
           <w:rStyle w:val="normaltextrun"/>
-          <w:rFonts w:asciiTheme="minorHAnsi" w:eastAsiaTheme="majorEastAsia" w:hAnsiTheme="minorHAnsi" w:cs="Calibri"/>
+          <w:rFonts w:ascii="Montserrat" w:eastAsiaTheme="majorEastAsia" w:hAnsi="Montserrat" w:cs="Calibri"/>
           <w:sz w:val="22"/>
           <w:szCs w:val="22"/>
         </w:rPr>
@@ -178,7 +248,7 @@
         <w:textAlignment w:val="baseline"/>
         <w:rPr>
           <w:rStyle w:val="eop"/>
-          <w:rFonts w:asciiTheme="minorHAnsi" w:hAnsiTheme="minorHAnsi" w:cs="Calibri"/>
+          <w:rFonts w:ascii="Montserrat" w:hAnsi="Montserrat" w:cs="Calibri"/>
           <w:sz w:val="22"/>
           <w:szCs w:val="22"/>
         </w:rPr>
@@ -186,7 +256,7 @@
       <w:r>
         <w:rPr>
           <w:rStyle w:val="eop"/>
-          <w:rFonts w:asciiTheme="minorHAnsi" w:eastAsiaTheme="majorEastAsia" w:hAnsiTheme="minorHAnsi" w:cs="Calibri"/>
+          <w:rFonts w:ascii="Montserrat" w:eastAsiaTheme="majorEastAsia" w:hAnsi="Montserrat" w:cs="Calibri"/>
           <w:sz w:val="22"/>
           <w:szCs w:val="22"/>
         </w:rPr>
@@ -215,14 +285,14 @@
               <w:spacing w:before="0" w:beforeAutospacing="0" w:after="0" w:afterAutospacing="0"/>
               <w:textAlignment w:val="baseline"/>
               <w:rPr>
-                <w:rFonts w:asciiTheme="minorHAnsi" w:hAnsiTheme="minorHAnsi" w:cs="Calibri"/>
+                <w:rFonts w:ascii="Montserrat" w:hAnsi="Montserrat" w:cs="Calibri"/>
                 <w:b/>
                 <w:bCs/>
               </w:rPr>
             </w:pPr>
             <w:r>
               <w:rPr>
-                <w:rFonts w:asciiTheme="minorHAnsi" w:hAnsiTheme="minorHAnsi" w:cs="Calibri"/>
+                <w:rFonts w:ascii="Montserrat" w:hAnsi="Montserrat" w:cs="Calibri"/>
                 <w:b/>
                 <w:bCs/>
               </w:rPr>
@@ -240,14 +310,14 @@
               <w:spacing w:before="0" w:beforeAutospacing="0" w:after="0" w:afterAutospacing="0"/>
               <w:textAlignment w:val="baseline"/>
               <w:rPr>
-                <w:rFonts w:asciiTheme="minorHAnsi" w:hAnsiTheme="minorHAnsi" w:cs="Calibri"/>
+                <w:rFonts w:ascii="Montserrat" w:hAnsi="Montserrat" w:cs="Calibri"/>
                 <w:b/>
                 <w:bCs/>
               </w:rPr>
             </w:pPr>
             <w:r>
               <w:rPr>
-                <w:rFonts w:asciiTheme="minorHAnsi" w:hAnsiTheme="minorHAnsi" w:cs="Calibri"/>
+                <w:rFonts w:ascii="Montserrat" w:hAnsi="Montserrat" w:cs="Calibri"/>
                 <w:b/>
                 <w:bCs/>
               </w:rPr>
@@ -265,14 +335,14 @@
               <w:spacing w:before="0" w:beforeAutospacing="0" w:after="0" w:afterAutospacing="0"/>
               <w:textAlignment w:val="baseline"/>
               <w:rPr>
-                <w:rFonts w:asciiTheme="minorHAnsi" w:hAnsiTheme="minorHAnsi" w:cs="Calibri"/>
+                <w:rFonts w:ascii="Montserrat" w:hAnsi="Montserrat" w:cs="Calibri"/>
                 <w:b/>
                 <w:bCs/>
               </w:rPr>
             </w:pPr>
             <w:r>
               <w:rPr>
-                <w:rFonts w:asciiTheme="minorHAnsi" w:hAnsiTheme="minorHAnsi" w:cs="Calibri"/>
+                <w:rFonts w:ascii="Montserrat" w:hAnsi="Montserrat" w:cs="Calibri"/>
                 <w:b/>
                 <w:bCs/>
               </w:rPr>
@@ -292,12 +362,12 @@
               <w:spacing w:before="0" w:beforeAutospacing="0" w:after="0" w:afterAutospacing="0"/>
               <w:textAlignment w:val="baseline"/>
               <w:rPr>
-                <w:rFonts w:asciiTheme="minorHAnsi" w:hAnsiTheme="minorHAnsi" w:cs="Calibri"/>
+                <w:rFonts w:ascii="Montserrat" w:hAnsi="Montserrat" w:cs="Calibri"/>
               </w:rPr>
             </w:pPr>
             <w:r>
               <w:rPr>
-                <w:rFonts w:asciiTheme="minorHAnsi" w:hAnsiTheme="minorHAnsi" w:cs="Calibri"/>
+                <w:rFonts w:ascii="Montserrat" w:hAnsi="Montserrat" w:cs="Calibri"/>
               </w:rPr>
               <w:t>SN-1</w:t>
             </w:r>
@@ -313,12 +383,12 @@
               <w:spacing w:before="0" w:beforeAutospacing="0" w:after="0" w:afterAutospacing="0"/>
               <w:textAlignment w:val="baseline"/>
               <w:rPr>
-                <w:rFonts w:asciiTheme="minorHAnsi" w:hAnsiTheme="minorHAnsi" w:cs="Calibri"/>
+                <w:rFonts w:ascii="Montserrat" w:hAnsi="Montserrat" w:cs="Calibri"/>
               </w:rPr>
             </w:pPr>
             <w:r>
               <w:rPr>
-                <w:rFonts w:asciiTheme="minorHAnsi" w:hAnsiTheme="minorHAnsi" w:cs="Calibri"/>
+                <w:rFonts w:ascii="Montserrat" w:hAnsi="Montserrat" w:cs="Calibri"/>
               </w:rPr>
               <w:t>Voice Communications</w:t>
             </w:r>
@@ -332,12 +402,12 @@
             <w:pPr>
               <w:pStyle w:val="NormalWeb"/>
               <w:rPr>
-                <w:rFonts w:asciiTheme="minorHAnsi" w:hAnsiTheme="minorHAnsi"/>
+                <w:rFonts w:ascii="Montserrat" w:hAnsi="Montserrat"/>
               </w:rPr>
             </w:pPr>
             <w:r>
               <w:rPr>
-                <w:rFonts w:asciiTheme="minorHAnsi" w:hAnsiTheme="minorHAnsi"/>
+                <w:rFonts w:ascii="Montserrat" w:hAnsi="Montserrat"/>
               </w:rPr>
               <w:t>The cellphone will enable the user to engage in voice communication with someone else.</w:t>
             </w:r>
@@ -355,12 +425,12 @@
               <w:spacing w:before="0" w:beforeAutospacing="0" w:after="0" w:afterAutospacing="0"/>
               <w:textAlignment w:val="baseline"/>
               <w:rPr>
-                <w:rFonts w:asciiTheme="minorHAnsi" w:hAnsiTheme="minorHAnsi" w:cs="Calibri"/>
+                <w:rFonts w:ascii="Montserrat" w:hAnsi="Montserrat" w:cs="Calibri"/>
               </w:rPr>
             </w:pPr>
             <w:r>
               <w:rPr>
-                <w:rFonts w:asciiTheme="minorHAnsi" w:hAnsiTheme="minorHAnsi" w:cs="Calibri"/>
+                <w:rFonts w:ascii="Montserrat" w:hAnsi="Montserrat" w:cs="Calibri"/>
               </w:rPr>
               <w:t>SN-2</w:t>
             </w:r>
@@ -376,12 +446,12 @@
               <w:spacing w:before="0" w:beforeAutospacing="0" w:after="0" w:afterAutospacing="0"/>
               <w:textAlignment w:val="baseline"/>
               <w:rPr>
-                <w:rFonts w:asciiTheme="minorHAnsi" w:hAnsiTheme="minorHAnsi" w:cs="Calibri"/>
+                <w:rFonts w:ascii="Montserrat" w:hAnsi="Montserrat" w:cs="Calibri"/>
               </w:rPr>
             </w:pPr>
             <w:r>
               <w:rPr>
-                <w:rFonts w:asciiTheme="minorHAnsi" w:hAnsiTheme="minorHAnsi" w:cs="Calibri"/>
+                <w:rFonts w:ascii="Montserrat" w:hAnsi="Montserrat" w:cs="Calibri"/>
               </w:rPr>
               <w:t>Text Communications</w:t>
             </w:r>
@@ -397,12 +467,12 @@
               <w:spacing w:before="0" w:beforeAutospacing="0" w:after="0" w:afterAutospacing="0"/>
               <w:textAlignment w:val="baseline"/>
               <w:rPr>
-                <w:rFonts w:asciiTheme="minorHAnsi" w:hAnsiTheme="minorHAnsi" w:cs="Calibri"/>
+                <w:rFonts w:ascii="Montserrat" w:hAnsi="Montserrat" w:cs="Calibri"/>
               </w:rPr>
             </w:pPr>
             <w:r>
               <w:rPr>
-                <w:rFonts w:asciiTheme="minorHAnsi" w:hAnsiTheme="minorHAnsi" w:cs="Arial"/>
+                <w:rFonts w:ascii="Montserrat" w:hAnsi="Montserrat" w:cs="Arial"/>
                 <w:color w:val="2B2B3A"/>
                 <w:shd w:val="clear" w:color="auto" w:fill="FFFFFF"/>
               </w:rPr>
@@ -422,12 +492,12 @@
               <w:spacing w:before="0" w:beforeAutospacing="0" w:after="0" w:afterAutospacing="0"/>
               <w:textAlignment w:val="baseline"/>
               <w:rPr>
-                <w:rFonts w:asciiTheme="minorHAnsi" w:hAnsiTheme="minorHAnsi" w:cs="Calibri"/>
+                <w:rFonts w:ascii="Montserrat" w:hAnsi="Montserrat" w:cs="Calibri"/>
               </w:rPr>
             </w:pPr>
             <w:r>
               <w:rPr>
-                <w:rFonts w:asciiTheme="minorHAnsi" w:hAnsiTheme="minorHAnsi" w:cs="Calibri"/>
+                <w:rFonts w:ascii="Montserrat" w:hAnsi="Montserrat" w:cs="Calibri"/>
               </w:rPr>
               <w:t>SN-3</w:t>
             </w:r>
@@ -443,12 +513,12 @@
               <w:spacing w:before="0" w:beforeAutospacing="0" w:after="0" w:afterAutospacing="0"/>
               <w:textAlignment w:val="baseline"/>
               <w:rPr>
-                <w:rFonts w:asciiTheme="minorHAnsi" w:hAnsiTheme="minorHAnsi" w:cs="Calibri"/>
+                <w:rFonts w:ascii="Montserrat" w:hAnsi="Montserrat" w:cs="Calibri"/>
               </w:rPr>
             </w:pPr>
             <w:r>
               <w:rPr>
-                <w:rFonts w:asciiTheme="minorHAnsi" w:hAnsiTheme="minorHAnsi" w:cs="Calibri"/>
+                <w:rFonts w:ascii="Montserrat" w:hAnsi="Montserrat" w:cs="Calibri"/>
               </w:rPr>
               <w:t>Play Videos</w:t>
             </w:r>
@@ -464,12 +534,12 @@
               <w:spacing w:before="0" w:beforeAutospacing="0" w:after="0" w:afterAutospacing="0"/>
               <w:textAlignment w:val="baseline"/>
               <w:rPr>
-                <w:rFonts w:asciiTheme="minorHAnsi" w:hAnsiTheme="minorHAnsi" w:cs="Calibri"/>
+                <w:rFonts w:ascii="Montserrat" w:hAnsi="Montserrat" w:cs="Calibri"/>
               </w:rPr>
             </w:pPr>
             <w:r>
               <w:rPr>
-                <w:rFonts w:asciiTheme="minorHAnsi" w:hAnsiTheme="minorHAnsi" w:cs="Arial"/>
+                <w:rFonts w:ascii="Montserrat" w:hAnsi="Montserrat" w:cs="Arial"/>
                 <w:color w:val="2B2B3A"/>
                 <w:shd w:val="clear" w:color="auto" w:fill="FFFFFF"/>
               </w:rPr>
@@ -489,12 +559,12 @@
               <w:spacing w:before="0" w:beforeAutospacing="0" w:after="0" w:afterAutospacing="0"/>
               <w:textAlignment w:val="baseline"/>
               <w:rPr>
-                <w:rFonts w:asciiTheme="minorHAnsi" w:hAnsiTheme="minorHAnsi" w:cs="Calibri"/>
+                <w:rFonts w:ascii="Montserrat" w:hAnsi="Montserrat" w:cs="Calibri"/>
               </w:rPr>
             </w:pPr>
             <w:r>
               <w:rPr>
-                <w:rFonts w:asciiTheme="minorHAnsi" w:hAnsiTheme="minorHAnsi" w:cs="Calibri"/>
+                <w:rFonts w:ascii="Montserrat" w:hAnsi="Montserrat" w:cs="Calibri"/>
               </w:rPr>
               <w:t>SN-4</w:t>
             </w:r>
@@ -510,12 +580,12 @@
               <w:spacing w:before="0" w:beforeAutospacing="0" w:after="0" w:afterAutospacing="0"/>
               <w:textAlignment w:val="baseline"/>
               <w:rPr>
-                <w:rFonts w:asciiTheme="minorHAnsi" w:hAnsiTheme="minorHAnsi" w:cs="Calibri"/>
+                <w:rFonts w:ascii="Montserrat" w:hAnsi="Montserrat" w:cs="Calibri"/>
               </w:rPr>
             </w:pPr>
             <w:r>
               <w:rPr>
-                <w:rFonts w:asciiTheme="minorHAnsi" w:hAnsiTheme="minorHAnsi" w:cs="Calibri"/>
+                <w:rFonts w:ascii="Montserrat" w:hAnsi="Montserrat" w:cs="Calibri"/>
               </w:rPr>
               <w:t>Listen to Music</w:t>
             </w:r>
@@ -531,12 +601,12 @@
               <w:spacing w:before="0" w:beforeAutospacing="0" w:after="0" w:afterAutospacing="0"/>
               <w:textAlignment w:val="baseline"/>
               <w:rPr>
-                <w:rFonts w:asciiTheme="minorHAnsi" w:hAnsiTheme="minorHAnsi" w:cs="Calibri"/>
+                <w:rFonts w:ascii="Montserrat" w:hAnsi="Montserrat" w:cs="Calibri"/>
               </w:rPr>
             </w:pPr>
             <w:r>
               <w:rPr>
-                <w:rFonts w:asciiTheme="minorHAnsi" w:hAnsiTheme="minorHAnsi" w:cs="Arial"/>
+                <w:rFonts w:ascii="Montserrat" w:hAnsi="Montserrat" w:cs="Arial"/>
                 <w:color w:val="2B2B3A"/>
                 <w:shd w:val="clear" w:color="auto" w:fill="FFFFFF"/>
               </w:rPr>
@@ -556,12 +626,12 @@
               <w:spacing w:before="0" w:beforeAutospacing="0" w:after="0" w:afterAutospacing="0"/>
               <w:textAlignment w:val="baseline"/>
               <w:rPr>
-                <w:rFonts w:asciiTheme="minorHAnsi" w:hAnsiTheme="minorHAnsi" w:cs="Calibri"/>
+                <w:rFonts w:ascii="Montserrat" w:hAnsi="Montserrat" w:cs="Calibri"/>
               </w:rPr>
             </w:pPr>
             <w:r>
               <w:rPr>
-                <w:rFonts w:asciiTheme="minorHAnsi" w:hAnsiTheme="minorHAnsi" w:cs="Calibri"/>
+                <w:rFonts w:ascii="Montserrat" w:hAnsi="Montserrat" w:cs="Calibri"/>
               </w:rPr>
               <w:t>SN-5</w:t>
             </w:r>
@@ -577,12 +647,12 @@
               <w:spacing w:before="0" w:beforeAutospacing="0" w:after="0" w:afterAutospacing="0"/>
               <w:textAlignment w:val="baseline"/>
               <w:rPr>
-                <w:rFonts w:asciiTheme="minorHAnsi" w:hAnsiTheme="minorHAnsi" w:cs="Calibri"/>
+                <w:rFonts w:ascii="Montserrat" w:hAnsi="Montserrat" w:cs="Calibri"/>
               </w:rPr>
             </w:pPr>
             <w:r>
               <w:rPr>
-                <w:rFonts w:asciiTheme="minorHAnsi" w:hAnsiTheme="minorHAnsi" w:cs="Calibri"/>
+                <w:rFonts w:ascii="Montserrat" w:hAnsi="Montserrat" w:cs="Calibri"/>
               </w:rPr>
               <w:t>Access Internet</w:t>
             </w:r>
@@ -598,12 +668,12 @@
               <w:spacing w:before="0" w:beforeAutospacing="0" w:after="0" w:afterAutospacing="0"/>
               <w:textAlignment w:val="baseline"/>
               <w:rPr>
-                <w:rFonts w:asciiTheme="minorHAnsi" w:hAnsiTheme="minorHAnsi" w:cs="Calibri"/>
+                <w:rFonts w:ascii="Montserrat" w:hAnsi="Montserrat" w:cs="Calibri"/>
               </w:rPr>
             </w:pPr>
             <w:r>
               <w:rPr>
-                <w:rFonts w:asciiTheme="minorHAnsi" w:hAnsiTheme="minorHAnsi" w:cs="Arial"/>
+                <w:rFonts w:ascii="Montserrat" w:hAnsi="Montserrat" w:cs="Arial"/>
                 <w:color w:val="2B2B3A"/>
                 <w:shd w:val="clear" w:color="auto" w:fill="FFFFFF"/>
               </w:rPr>
@@ -619,7 +689,7 @@
         <w:spacing w:before="0" w:beforeAutospacing="0" w:after="0" w:afterAutospacing="0"/>
         <w:textAlignment w:val="baseline"/>
         <w:rPr>
-          <w:rFonts w:asciiTheme="minorHAnsi" w:hAnsiTheme="minorHAnsi" w:cs="Calibri"/>
+          <w:rFonts w:ascii="Montserrat" w:hAnsi="Montserrat" w:cs="Calibri"/>
           <w:sz w:val="22"/>
           <w:szCs w:val="22"/>
         </w:rPr>
@@ -636,7 +706,7 @@
         <w:textAlignment w:val="baseline"/>
         <w:rPr>
           <w:rStyle w:val="normaltextrun"/>
-          <w:rFonts w:asciiTheme="minorHAnsi" w:hAnsiTheme="minorHAnsi" w:cs="Calibri"/>
+          <w:rFonts w:ascii="Montserrat" w:hAnsi="Montserrat" w:cs="Calibri"/>
           <w:sz w:val="22"/>
           <w:szCs w:val="22"/>
         </w:rPr>
@@ -644,7 +714,7 @@
       <w:r>
         <w:rPr>
           <w:rStyle w:val="normaltextrun"/>
-          <w:rFonts w:asciiTheme="minorHAnsi" w:hAnsiTheme="minorHAnsi" w:cs="Calibri"/>
+          <w:rFonts w:ascii="Montserrat" w:hAnsi="Montserrat" w:cs="Calibri"/>
           <w:sz w:val="22"/>
           <w:szCs w:val="22"/>
         </w:rPr>
@@ -660,7 +730,7 @@
         <w:textAlignment w:val="baseline"/>
         <w:rPr>
           <w:rStyle w:val="normaltextrun"/>
-          <w:rFonts w:asciiTheme="minorHAnsi" w:hAnsiTheme="minorHAnsi" w:cs="Calibri"/>
+          <w:rFonts w:ascii="Montserrat" w:hAnsi="Montserrat" w:cs="Calibri"/>
           <w:sz w:val="22"/>
           <w:szCs w:val="22"/>
         </w:rPr>
@@ -668,7 +738,8 @@
       <w:r>
         <w:rPr>
           <w:rStyle w:val="normaltextrun"/>
-          <w:rFonts w:asciiTheme="minorHAnsi" w:hAnsiTheme="minorHAnsi" w:cs="Calibri"/>
+          <w:rFonts w:ascii="Montserrat" w:hAnsi="Montserrat" w:cs="Calibri"/>
+          <w:noProof/>
           <w:sz w:val="22"/>
           <w:szCs w:val="22"/>
         </w:rPr>
@@ -720,7 +791,7 @@
         <w:textAlignment w:val="baseline"/>
         <w:rPr>
           <w:rStyle w:val="normaltextrun"/>
-          <w:rFonts w:asciiTheme="minorHAnsi" w:hAnsiTheme="minorHAnsi" w:cs="Calibri"/>
+          <w:rFonts w:ascii="Montserrat" w:hAnsi="Montserrat" w:cs="Calibri"/>
           <w:sz w:val="22"/>
           <w:szCs w:val="22"/>
         </w:rPr>
@@ -728,10 +799,11 @@
       <w:r>
         <w:rPr>
           <w:rStyle w:val="normaltextrun"/>
-          <w:rFonts w:asciiTheme="minorHAnsi" w:hAnsiTheme="minorHAnsi" w:cs="Calibri"/>
-          <w:sz w:val="22"/>
-          <w:szCs w:val="22"/>
-        </w:rPr>
+          <w:rFonts w:ascii="Montserrat" w:hAnsi="Montserrat" w:cs="Calibri"/>
+          <w:sz w:val="22"/>
+          <w:szCs w:val="22"/>
+        </w:rPr>
+        <w:lastRenderedPageBreak/>
         <w:t>Add a new Label named “Stakeholder Need”.</w:t>
       </w:r>
     </w:p>
@@ -744,7 +816,7 @@
         <w:textAlignment w:val="baseline"/>
         <w:rPr>
           <w:rStyle w:val="normaltextrun"/>
-          <w:rFonts w:asciiTheme="minorHAnsi" w:hAnsiTheme="minorHAnsi" w:cs="Calibri"/>
+          <w:rFonts w:ascii="Montserrat" w:hAnsi="Montserrat" w:cs="Calibri"/>
           <w:sz w:val="22"/>
           <w:szCs w:val="22"/>
         </w:rPr>
@@ -752,11 +824,11 @@
       <w:r>
         <w:rPr>
           <w:rStyle w:val="normaltextrun"/>
-          <w:rFonts w:asciiTheme="minorHAnsi" w:hAnsiTheme="minorHAnsi" w:cs="Calibri"/>
-          <w:sz w:val="22"/>
-          <w:szCs w:val="22"/>
-        </w:rPr>
-        <w:lastRenderedPageBreak/>
+          <w:rFonts w:ascii="Montserrat" w:hAnsi="Montserrat" w:cs="Calibri"/>
+          <w:noProof/>
+          <w:sz w:val="22"/>
+          <w:szCs w:val="22"/>
+        </w:rPr>
         <w:drawing>
           <wp:inline distT="0" distB="0" distL="0" distR="0" wp14:anchorId="7DCE7178" wp14:editId="5685279D">
             <wp:extent cx="4201200" cy="1293126"/>
@@ -810,7 +882,7 @@
         <w:textAlignment w:val="baseline"/>
         <w:rPr>
           <w:rStyle w:val="normaltextrun"/>
-          <w:rFonts w:asciiTheme="minorHAnsi" w:hAnsiTheme="minorHAnsi" w:cs="Calibri"/>
+          <w:rFonts w:ascii="Montserrat" w:hAnsi="Montserrat" w:cs="Calibri"/>
           <w:sz w:val="22"/>
           <w:szCs w:val="22"/>
         </w:rPr>
@@ -818,7 +890,7 @@
       <w:r>
         <w:rPr>
           <w:rStyle w:val="normaltextrun"/>
-          <w:rFonts w:asciiTheme="minorHAnsi" w:hAnsiTheme="minorHAnsi" w:cs="Calibri"/>
+          <w:rFonts w:ascii="Montserrat" w:hAnsi="Montserrat" w:cs="Calibri"/>
           <w:sz w:val="22"/>
           <w:szCs w:val="22"/>
         </w:rPr>
@@ -834,7 +906,7 @@
         <w:textAlignment w:val="baseline"/>
         <w:rPr>
           <w:rStyle w:val="normaltextrun"/>
-          <w:rFonts w:asciiTheme="minorHAnsi" w:hAnsiTheme="minorHAnsi" w:cs="Calibri"/>
+          <w:rFonts w:ascii="Montserrat" w:hAnsi="Montserrat" w:cs="Calibri"/>
           <w:sz w:val="22"/>
           <w:szCs w:val="22"/>
         </w:rPr>
@@ -842,7 +914,8 @@
       <w:r>
         <w:rPr>
           <w:rStyle w:val="normaltextrun"/>
-          <w:rFonts w:asciiTheme="minorHAnsi" w:hAnsiTheme="minorHAnsi" w:cs="Calibri"/>
+          <w:rFonts w:ascii="Montserrat" w:hAnsi="Montserrat" w:cs="Calibri"/>
+          <w:noProof/>
           <w:sz w:val="22"/>
           <w:szCs w:val="22"/>
         </w:rPr>
@@ -899,7 +972,7 @@
         <w:textAlignment w:val="baseline"/>
         <w:rPr>
           <w:rStyle w:val="normaltextrun"/>
-          <w:rFonts w:asciiTheme="minorHAnsi" w:hAnsiTheme="minorHAnsi" w:cs="Calibri"/>
+          <w:rFonts w:ascii="Montserrat" w:hAnsi="Montserrat" w:cs="Calibri"/>
           <w:sz w:val="22"/>
           <w:szCs w:val="22"/>
         </w:rPr>
@@ -907,7 +980,7 @@
       <w:r>
         <w:rPr>
           <w:rStyle w:val="normaltextrun"/>
-          <w:rFonts w:asciiTheme="minorHAnsi" w:hAnsiTheme="minorHAnsi" w:cs="Calibri"/>
+          <w:rFonts w:ascii="Montserrat" w:hAnsi="Montserrat" w:cs="Calibri"/>
           <w:sz w:val="22"/>
           <w:szCs w:val="22"/>
         </w:rPr>
@@ -916,7 +989,7 @@
       <w:r>
         <w:rPr>
           <w:rStyle w:val="normaltextrun"/>
-          <w:rFonts w:asciiTheme="minorHAnsi" w:hAnsiTheme="minorHAnsi" w:cs="Calibri"/>
+          <w:rFonts w:ascii="Montserrat" w:hAnsi="Montserrat" w:cs="Calibri"/>
           <w:sz w:val="22"/>
           <w:szCs w:val="22"/>
         </w:rPr>
@@ -934,7 +1007,7 @@
         <w:textAlignment w:val="baseline"/>
         <w:rPr>
           <w:rStyle w:val="normaltextrun"/>
-          <w:rFonts w:asciiTheme="minorHAnsi" w:hAnsiTheme="minorHAnsi" w:cs="Calibri"/>
+          <w:rFonts w:ascii="Montserrat" w:hAnsi="Montserrat" w:cs="Calibri"/>
           <w:sz w:val="22"/>
           <w:szCs w:val="22"/>
         </w:rPr>
@@ -942,11 +1015,31 @@
       <w:r>
         <w:rPr>
           <w:rStyle w:val="normaltextrun"/>
-          <w:rFonts w:asciiTheme="minorHAnsi" w:hAnsiTheme="minorHAnsi" w:cs="Calibri"/>
-          <w:sz w:val="22"/>
-          <w:szCs w:val="22"/>
-        </w:rPr>
-        <w:t>Return to the “Cell Phone Stakeholder Needs” Requirements Diagram and select the wrench in the top-right. From the drop-down select “Display Options”.</w:t>
+          <w:rFonts w:ascii="Montserrat" w:hAnsi="Montserrat" w:cs="Calibri"/>
+          <w:sz w:val="22"/>
+          <w:szCs w:val="22"/>
+        </w:rPr>
+        <w:t xml:space="preserve">Return to the “Cell Phone Stakeholder Needs” </w:t>
+      </w:r>
+      <w:r>
+        <w:rPr>
+          <w:rStyle w:val="normaltextrun"/>
+          <w:rFonts w:ascii="Montserrat" w:hAnsi="Montserrat" w:cs="Calibri"/>
+          <w:i/>
+          <w:iCs/>
+          <w:sz w:val="22"/>
+          <w:szCs w:val="22"/>
+        </w:rPr>
+        <w:t>Requirements Diagram</w:t>
+      </w:r>
+      <w:r>
+        <w:rPr>
+          <w:rStyle w:val="normaltextrun"/>
+          <w:rFonts w:ascii="Montserrat" w:hAnsi="Montserrat" w:cs="Calibri"/>
+          <w:sz w:val="22"/>
+          <w:szCs w:val="22"/>
+        </w:rPr>
+        <w:t xml:space="preserve"> and select the wrench in the top-right. From the drop-down select “Display Options”.</w:t>
       </w:r>
     </w:p>
     <w:p>
@@ -960,7 +1053,7 @@
         <w:textAlignment w:val="baseline"/>
         <w:rPr>
           <w:rStyle w:val="normaltextrun"/>
-          <w:rFonts w:asciiTheme="minorHAnsi" w:hAnsiTheme="minorHAnsi" w:cs="Calibri"/>
+          <w:rFonts w:ascii="Montserrat" w:hAnsi="Montserrat" w:cs="Calibri"/>
           <w:sz w:val="22"/>
           <w:szCs w:val="22"/>
         </w:rPr>
@@ -968,7 +1061,7 @@
       <w:r>
         <w:rPr>
           <w:rStyle w:val="normaltextrun"/>
-          <w:rFonts w:asciiTheme="minorHAnsi" w:hAnsiTheme="minorHAnsi" w:cs="Calibri"/>
+          <w:rFonts w:ascii="Montserrat" w:hAnsi="Montserrat" w:cs="Calibri"/>
           <w:sz w:val="22"/>
           <w:szCs w:val="22"/>
         </w:rPr>
@@ -983,7 +1076,7 @@
         <w:textAlignment w:val="baseline"/>
         <w:rPr>
           <w:rStyle w:val="normaltextrun"/>
-          <w:rFonts w:asciiTheme="minorHAnsi" w:hAnsiTheme="minorHAnsi" w:cs="Calibri"/>
+          <w:rFonts w:ascii="Montserrat" w:hAnsi="Montserrat" w:cs="Calibri"/>
           <w:sz w:val="22"/>
           <w:szCs w:val="22"/>
         </w:rPr>
@@ -997,7 +1090,7 @@
         <w:textAlignment w:val="baseline"/>
         <w:rPr>
           <w:rStyle w:val="normaltextrun"/>
-          <w:rFonts w:asciiTheme="minorHAnsi" w:hAnsiTheme="minorHAnsi" w:cs="Calibri"/>
+          <w:rFonts w:ascii="Montserrat" w:hAnsi="Montserrat" w:cs="Calibri"/>
           <w:sz w:val="22"/>
           <w:szCs w:val="22"/>
         </w:rPr>
@@ -1005,7 +1098,8 @@
       <w:r>
         <w:rPr>
           <w:rStyle w:val="normaltextrun"/>
-          <w:rFonts w:asciiTheme="minorHAnsi" w:hAnsiTheme="minorHAnsi" w:cs="Calibri"/>
+          <w:rFonts w:ascii="Montserrat" w:hAnsi="Montserrat" w:cs="Calibri"/>
+          <w:noProof/>
           <w:sz w:val="22"/>
           <w:szCs w:val="22"/>
         </w:rPr>
@@ -1058,7 +1152,7 @@
         <w:textAlignment w:val="baseline"/>
         <w:rPr>
           <w:rStyle w:val="normaltextrun"/>
-          <w:rFonts w:asciiTheme="minorHAnsi" w:hAnsiTheme="minorHAnsi" w:cs="Calibri"/>
+          <w:rFonts w:ascii="Montserrat" w:hAnsi="Montserrat" w:cs="Calibri"/>
           <w:sz w:val="22"/>
           <w:szCs w:val="22"/>
         </w:rPr>
@@ -1075,7 +1169,7 @@
         <w:textAlignment w:val="baseline"/>
         <w:rPr>
           <w:rStyle w:val="normaltextrun"/>
-          <w:rFonts w:asciiTheme="minorHAnsi" w:hAnsiTheme="minorHAnsi" w:cs="Calibri"/>
+          <w:rFonts w:ascii="Montserrat" w:hAnsi="Montserrat" w:cs="Calibri"/>
           <w:sz w:val="22"/>
           <w:szCs w:val="22"/>
         </w:rPr>
@@ -1083,7 +1177,7 @@
       <w:r>
         <w:rPr>
           <w:rStyle w:val="normaltextrun"/>
-          <w:rFonts w:asciiTheme="minorHAnsi" w:hAnsiTheme="minorHAnsi" w:cs="Calibri"/>
+          <w:rFonts w:ascii="Montserrat" w:hAnsi="Montserrat" w:cs="Calibri"/>
           <w:sz w:val="22"/>
           <w:szCs w:val="22"/>
         </w:rPr>
@@ -1099,7 +1193,7 @@
         <w:textAlignment w:val="baseline"/>
         <w:rPr>
           <w:rStyle w:val="normaltextrun"/>
-          <w:rFonts w:asciiTheme="minorHAnsi" w:hAnsiTheme="minorHAnsi" w:cs="Calibri"/>
+          <w:rFonts w:ascii="Montserrat" w:hAnsi="Montserrat" w:cs="Calibri"/>
           <w:sz w:val="22"/>
           <w:szCs w:val="22"/>
         </w:rPr>
@@ -1107,7 +1201,8 @@
       <w:r>
         <w:rPr>
           <w:rStyle w:val="normaltextrun"/>
-          <w:rFonts w:asciiTheme="minorHAnsi" w:hAnsiTheme="minorHAnsi" w:cs="Calibri"/>
+          <w:rFonts w:ascii="Montserrat" w:hAnsi="Montserrat" w:cs="Calibri"/>
+          <w:noProof/>
           <w:sz w:val="22"/>
           <w:szCs w:val="22"/>
         </w:rPr>
@@ -1162,7 +1257,7 @@
         <w:textAlignment w:val="baseline"/>
         <w:rPr>
           <w:rStyle w:val="normaltextrun"/>
-          <w:rFonts w:asciiTheme="minorHAnsi" w:hAnsiTheme="minorHAnsi" w:cs="Calibri"/>
+          <w:rFonts w:ascii="Montserrat" w:hAnsi="Montserrat" w:cs="Calibri"/>
           <w:sz w:val="22"/>
           <w:szCs w:val="22"/>
         </w:rPr>
@@ -1179,7 +1274,7 @@
         <w:textAlignment w:val="baseline"/>
         <w:rPr>
           <w:rStyle w:val="eop"/>
-          <w:rFonts w:asciiTheme="minorHAnsi" w:hAnsiTheme="minorHAnsi" w:cs="Calibri"/>
+          <w:rFonts w:ascii="Montserrat" w:hAnsi="Montserrat" w:cs="Calibri"/>
           <w:sz w:val="22"/>
           <w:szCs w:val="22"/>
         </w:rPr>
@@ -1187,25 +1282,16 @@
       <w:r>
         <w:rPr>
           <w:rStyle w:val="normaltextrun"/>
-          <w:rFonts w:asciiTheme="minorHAnsi" w:eastAsiaTheme="majorEastAsia" w:hAnsiTheme="minorHAnsi" w:cs="Calibri"/>
-          <w:sz w:val="22"/>
-          <w:szCs w:val="22"/>
-        </w:rPr>
-        <w:t>Perform Quality Check</w:t>
-      </w:r>
-      <w:r>
-        <w:rPr>
-          <w:rStyle w:val="normaltextrun"/>
-          <w:rFonts w:asciiTheme="minorHAnsi" w:eastAsiaTheme="majorEastAsia" w:hAnsiTheme="minorHAnsi" w:cs="Calibri"/>
-          <w:sz w:val="22"/>
-          <w:szCs w:val="22"/>
-        </w:rPr>
-        <w:t>.</w:t>
+          <w:rFonts w:ascii="Montserrat" w:eastAsiaTheme="majorEastAsia" w:hAnsi="Montserrat" w:cs="Calibri"/>
+          <w:sz w:val="22"/>
+          <w:szCs w:val="22"/>
+        </w:rPr>
+        <w:t>Perform Quality Check.</w:t>
       </w:r>
       <w:r>
         <w:rPr>
           <w:rStyle w:val="eop"/>
-          <w:rFonts w:asciiTheme="minorHAnsi" w:eastAsiaTheme="majorEastAsia" w:hAnsiTheme="minorHAnsi" w:cs="Calibri"/>
+          <w:rFonts w:ascii="Montserrat" w:eastAsiaTheme="majorEastAsia" w:hAnsi="Montserrat" w:cs="Calibri"/>
           <w:sz w:val="22"/>
           <w:szCs w:val="22"/>
         </w:rPr>
@@ -1220,7 +1306,7 @@
         <w:textAlignment w:val="baseline"/>
         <w:rPr>
           <w:rStyle w:val="eop"/>
-          <w:rFonts w:asciiTheme="minorHAnsi" w:hAnsiTheme="minorHAnsi" w:cs="Calibri"/>
+          <w:rFonts w:ascii="Montserrat" w:hAnsi="Montserrat" w:cs="Calibri"/>
           <w:sz w:val="22"/>
           <w:szCs w:val="22"/>
         </w:rPr>
@@ -1234,14 +1320,15 @@
         <w:jc w:val="center"/>
         <w:textAlignment w:val="baseline"/>
         <w:rPr>
-          <w:rFonts w:asciiTheme="minorHAnsi" w:hAnsiTheme="minorHAnsi" w:cs="Calibri"/>
-          <w:sz w:val="22"/>
-          <w:szCs w:val="22"/>
-        </w:rPr>
-      </w:pPr>
-      <w:r>
-        <w:rPr>
-          <w:rFonts w:asciiTheme="minorHAnsi" w:hAnsiTheme="minorHAnsi" w:cs="Calibri"/>
+          <w:rFonts w:ascii="Montserrat" w:hAnsi="Montserrat" w:cs="Calibri"/>
+          <w:sz w:val="22"/>
+          <w:szCs w:val="22"/>
+        </w:rPr>
+      </w:pPr>
+      <w:r>
+        <w:rPr>
+          <w:rFonts w:ascii="Montserrat" w:hAnsi="Montserrat" w:cs="Calibri"/>
+          <w:noProof/>
           <w:sz w:val="22"/>
           <w:szCs w:val="22"/>
         </w:rPr>
@@ -1305,12 +1392,13 @@
         </w:numPr>
         <w:rPr>
           <w:rStyle w:val="normaltextrun"/>
+          <w:rFonts w:ascii="Montserrat" w:hAnsi="Montserrat"/>
         </w:rPr>
       </w:pPr>
       <w:r>
         <w:rPr>
           <w:rStyle w:val="normaltextrun"/>
-          <w:rFonts w:cs="Calibri"/>
+          <w:rFonts w:ascii="Montserrat" w:hAnsi="Montserrat" w:cs="Calibri"/>
           <w:color w:val="000000"/>
           <w:sz w:val="22"/>
           <w:szCs w:val="22"/>
@@ -1321,7 +1409,7 @@
       <w:r>
         <w:rPr>
           <w:rStyle w:val="normaltextrun"/>
-          <w:rFonts w:cs="Calibri"/>
+          <w:rFonts w:ascii="Montserrat" w:hAnsi="Montserrat" w:cs="Calibri"/>
           <w:color w:val="000000"/>
           <w:sz w:val="22"/>
           <w:szCs w:val="22"/>
@@ -1332,7 +1420,7 @@
       <w:r>
         <w:rPr>
           <w:rStyle w:val="normaltextrun"/>
-          <w:rFonts w:cs="Calibri"/>
+          <w:rFonts w:ascii="Montserrat" w:hAnsi="Montserrat" w:cs="Calibri"/>
           <w:color w:val="000000"/>
           <w:sz w:val="22"/>
           <w:szCs w:val="22"/>
@@ -1343,7 +1431,7 @@
       <w:r>
         <w:rPr>
           <w:rStyle w:val="normaltextrun"/>
-          <w:rFonts w:cs="Calibri"/>
+          <w:rFonts w:ascii="Montserrat" w:hAnsi="Montserrat" w:cs="Calibri"/>
           <w:b/>
           <w:bCs/>
           <w:color w:val="000000"/>
@@ -1356,7 +1444,7 @@
       <w:r>
         <w:rPr>
           <w:rStyle w:val="normaltextrun"/>
-          <w:rFonts w:cs="Calibri"/>
+          <w:rFonts w:ascii="Montserrat" w:hAnsi="Montserrat" w:cs="Calibri"/>
           <w:b/>
           <w:bCs/>
           <w:color w:val="000000"/>
@@ -1369,7 +1457,7 @@
       <w:r>
         <w:rPr>
           <w:rStyle w:val="normaltextrun"/>
-          <w:rFonts w:cs="Calibri"/>
+          <w:rFonts w:ascii="Montserrat" w:hAnsi="Montserrat" w:cs="Calibri"/>
           <w:b/>
           <w:bCs/>
           <w:color w:val="000000"/>
@@ -1382,7 +1470,7 @@
       <w:r>
         <w:rPr>
           <w:rStyle w:val="normaltextrun"/>
-          <w:rFonts w:cs="Calibri"/>
+          <w:rFonts w:ascii="Montserrat" w:hAnsi="Montserrat" w:cs="Calibri"/>
           <w:b/>
           <w:bCs/>
           <w:color w:val="000000"/>
@@ -1395,7 +1483,7 @@
       <w:r>
         <w:rPr>
           <w:rStyle w:val="normaltextrun"/>
-          <w:rFonts w:cs="Calibri"/>
+          <w:rFonts w:ascii="Montserrat" w:hAnsi="Montserrat" w:cs="Calibri"/>
           <w:color w:val="000000"/>
           <w:sz w:val="22"/>
           <w:szCs w:val="22"/>
@@ -1406,7 +1494,7 @@
       <w:r>
         <w:rPr>
           <w:rStyle w:val="normaltextrun"/>
-          <w:rFonts w:cs="Calibri"/>
+          <w:rFonts w:ascii="Montserrat" w:hAnsi="Montserrat" w:cs="Calibri"/>
           <w:color w:val="000000"/>
           <w:sz w:val="22"/>
           <w:szCs w:val="22"/>
@@ -1417,7 +1505,7 @@
       <w:r>
         <w:rPr>
           <w:rStyle w:val="normaltextrun"/>
-          <w:rFonts w:cs="Calibri"/>
+          <w:rFonts w:ascii="Montserrat" w:hAnsi="Montserrat" w:cs="Calibri"/>
           <w:b/>
           <w:bCs/>
           <w:color w:val="000000"/>
@@ -1430,7 +1518,7 @@
       <w:r>
         <w:rPr>
           <w:rStyle w:val="normaltextrun"/>
-          <w:rFonts w:cs="Calibri"/>
+          <w:rFonts w:ascii="Montserrat" w:hAnsi="Montserrat" w:cs="Calibri"/>
           <w:color w:val="000000"/>
           <w:sz w:val="22"/>
           <w:szCs w:val="22"/>
@@ -1441,23 +1529,160 @@
       <w:r>
         <w:rPr>
           <w:rStyle w:val="normaltextrun"/>
-          <w:rFonts w:cs="Calibri"/>
+          <w:rFonts w:ascii="Montserrat" w:hAnsi="Montserrat" w:cs="Calibri"/>
           <w:color w:val="000000"/>
           <w:sz w:val="22"/>
           <w:szCs w:val="22"/>
           <w:shd w:val="clear" w:color="auto" w:fill="FFFFFF"/>
         </w:rPr>
-        <w:t>. Review the Description, Expected Result, and Verification Method fields. Update as necessary and select “Create”.</w:t>
+        <w:t xml:space="preserve">. Review the </w:t>
+      </w:r>
+      <w:r>
+        <w:rPr>
+          <w:rStyle w:val="normaltextrun"/>
+          <w:rFonts w:ascii="Montserrat" w:hAnsi="Montserrat" w:cs="Calibri"/>
+          <w:color w:val="000000"/>
+          <w:sz w:val="22"/>
+          <w:szCs w:val="22"/>
+          <w:shd w:val="clear" w:color="auto" w:fill="FFFFFF"/>
+        </w:rPr>
+        <w:t>“</w:t>
+      </w:r>
+      <w:r>
+        <w:rPr>
+          <w:rStyle w:val="normaltextrun"/>
+          <w:rFonts w:ascii="Montserrat" w:hAnsi="Montserrat" w:cs="Calibri"/>
+          <w:color w:val="000000"/>
+          <w:sz w:val="22"/>
+          <w:szCs w:val="22"/>
+          <w:shd w:val="clear" w:color="auto" w:fill="FFFFFF"/>
+        </w:rPr>
+        <w:t>Description</w:t>
+      </w:r>
+      <w:r>
+        <w:rPr>
+          <w:rStyle w:val="normaltextrun"/>
+          <w:rFonts w:ascii="Montserrat" w:hAnsi="Montserrat" w:cs="Calibri"/>
+          <w:color w:val="000000"/>
+          <w:sz w:val="22"/>
+          <w:szCs w:val="22"/>
+          <w:shd w:val="clear" w:color="auto" w:fill="FFFFFF"/>
+        </w:rPr>
+        <w:t>”</w:t>
+      </w:r>
+      <w:r>
+        <w:rPr>
+          <w:rStyle w:val="normaltextrun"/>
+          <w:rFonts w:ascii="Montserrat" w:hAnsi="Montserrat" w:cs="Calibri"/>
+          <w:color w:val="000000"/>
+          <w:sz w:val="22"/>
+          <w:szCs w:val="22"/>
+          <w:shd w:val="clear" w:color="auto" w:fill="FFFFFF"/>
+        </w:rPr>
+        <w:t xml:space="preserve">, </w:t>
+      </w:r>
+      <w:r>
+        <w:rPr>
+          <w:rStyle w:val="normaltextrun"/>
+          <w:rFonts w:ascii="Montserrat" w:hAnsi="Montserrat" w:cs="Calibri"/>
+          <w:color w:val="000000"/>
+          <w:sz w:val="22"/>
+          <w:szCs w:val="22"/>
+          <w:shd w:val="clear" w:color="auto" w:fill="FFFFFF"/>
+        </w:rPr>
+        <w:t>“</w:t>
+      </w:r>
+      <w:r>
+        <w:rPr>
+          <w:rStyle w:val="normaltextrun"/>
+          <w:rFonts w:ascii="Montserrat" w:hAnsi="Montserrat" w:cs="Calibri"/>
+          <w:color w:val="000000"/>
+          <w:sz w:val="22"/>
+          <w:szCs w:val="22"/>
+          <w:shd w:val="clear" w:color="auto" w:fill="FFFFFF"/>
+        </w:rPr>
+        <w:t>Expected Result</w:t>
+      </w:r>
+      <w:r>
+        <w:rPr>
+          <w:rStyle w:val="normaltextrun"/>
+          <w:rFonts w:ascii="Montserrat" w:hAnsi="Montserrat" w:cs="Calibri"/>
+          <w:color w:val="000000"/>
+          <w:sz w:val="22"/>
+          <w:szCs w:val="22"/>
+          <w:shd w:val="clear" w:color="auto" w:fill="FFFFFF"/>
+        </w:rPr>
+        <w:t>”</w:t>
+      </w:r>
+      <w:r>
+        <w:rPr>
+          <w:rStyle w:val="normaltextrun"/>
+          <w:rFonts w:ascii="Montserrat" w:hAnsi="Montserrat" w:cs="Calibri"/>
+          <w:color w:val="000000"/>
+          <w:sz w:val="22"/>
+          <w:szCs w:val="22"/>
+          <w:shd w:val="clear" w:color="auto" w:fill="FFFFFF"/>
+        </w:rPr>
+        <w:t xml:space="preserve">, and </w:t>
+      </w:r>
+      <w:r>
+        <w:rPr>
+          <w:rStyle w:val="normaltextrun"/>
+          <w:rFonts w:ascii="Montserrat" w:hAnsi="Montserrat" w:cs="Calibri"/>
+          <w:color w:val="000000"/>
+          <w:sz w:val="22"/>
+          <w:szCs w:val="22"/>
+          <w:shd w:val="clear" w:color="auto" w:fill="FFFFFF"/>
+        </w:rPr>
+        <w:t>“</w:t>
+      </w:r>
+      <w:r>
+        <w:rPr>
+          <w:rStyle w:val="normaltextrun"/>
+          <w:rFonts w:ascii="Montserrat" w:hAnsi="Montserrat" w:cs="Calibri"/>
+          <w:color w:val="000000"/>
+          <w:sz w:val="22"/>
+          <w:szCs w:val="22"/>
+          <w:shd w:val="clear" w:color="auto" w:fill="FFFFFF"/>
+        </w:rPr>
+        <w:t>Verification Method</w:t>
+      </w:r>
+      <w:r>
+        <w:rPr>
+          <w:rStyle w:val="normaltextrun"/>
+          <w:rFonts w:ascii="Montserrat" w:hAnsi="Montserrat" w:cs="Calibri"/>
+          <w:color w:val="000000"/>
+          <w:sz w:val="22"/>
+          <w:szCs w:val="22"/>
+          <w:shd w:val="clear" w:color="auto" w:fill="FFFFFF"/>
+        </w:rPr>
+        <w:t>”</w:t>
+      </w:r>
+      <w:r>
+        <w:rPr>
+          <w:rStyle w:val="normaltextrun"/>
+          <w:rFonts w:ascii="Montserrat" w:hAnsi="Montserrat" w:cs="Calibri"/>
+          <w:color w:val="000000"/>
+          <w:sz w:val="22"/>
+          <w:szCs w:val="22"/>
+          <w:shd w:val="clear" w:color="auto" w:fill="FFFFFF"/>
+        </w:rPr>
+        <w:t xml:space="preserve"> fields. Update as necessary and select “Create”.</w:t>
       </w:r>
     </w:p>
     <w:p>
       <w:pPr>
         <w:pStyle w:val="ListParagraph"/>
         <w:jc w:val="center"/>
+        <w:rPr>
+          <w:rFonts w:ascii="Montserrat" w:hAnsi="Montserrat"/>
+        </w:rPr>
       </w:pPr>
       <w:r>
         <w:rPr>
           <w:rStyle w:val="normaltextrun"/>
+          <w:rFonts w:ascii="Montserrat" w:hAnsi="Montserrat"/>
+          <w:noProof/>
         </w:rPr>
         <w:lastRenderedPageBreak/>
         <w:drawing>
@@ -1505,6 +1730,9 @@
     <w:p>
       <w:pPr>
         <w:pStyle w:val="ListParagraph"/>
+        <w:rPr>
+          <w:rFonts w:ascii="Montserrat" w:hAnsi="Montserrat"/>
+        </w:rPr>
       </w:pPr>
     </w:p>
     <w:p>
@@ -1514,22 +1742,33 @@
           <w:ilvl w:val="0"/>
           <w:numId w:val="6"/>
         </w:numPr>
-      </w:pPr>
-      <w:r>
+        <w:rPr>
+          <w:rFonts w:ascii="Montserrat" w:hAnsi="Montserrat"/>
+        </w:rPr>
+      </w:pPr>
+      <w:r>
+        <w:rPr>
+          <w:rFonts w:ascii="Montserrat" w:hAnsi="Montserrat"/>
+        </w:rPr>
         <w:t xml:space="preserve">Generate a </w:t>
       </w:r>
       <w:r>
         <w:rPr>
+          <w:rFonts w:ascii="Montserrat" w:hAnsi="Montserrat"/>
           <w:b/>
           <w:bCs/>
         </w:rPr>
         <w:t>Risk</w:t>
       </w:r>
       <w:r>
+        <w:rPr>
+          <w:rFonts w:ascii="Montserrat" w:hAnsi="Montserrat"/>
+        </w:rPr>
         <w:t xml:space="preserve"> for the same </w:t>
       </w:r>
       <w:r>
         <w:rPr>
+          <w:rFonts w:ascii="Montserrat" w:hAnsi="Montserrat"/>
           <w:b/>
           <w:bCs/>
         </w:rPr>
@@ -1537,21 +1776,29 @@
       </w:r>
       <w:r>
         <w:rPr>
+          <w:rFonts w:ascii="Montserrat" w:hAnsi="Montserrat"/>
           <w:b/>
           <w:bCs/>
         </w:rPr>
         <w:t>equirement</w:t>
       </w:r>
       <w:r>
+        <w:rPr>
+          <w:rFonts w:ascii="Montserrat" w:hAnsi="Montserrat"/>
+        </w:rPr>
         <w:t xml:space="preserve">. </w:t>
       </w:r>
     </w:p>
     <w:p>
       <w:pPr>
         <w:pStyle w:val="ListParagraph"/>
-      </w:pPr>
-      <w:r>
-        <w:rPr>
+        <w:rPr>
+          <w:rFonts w:ascii="Montserrat" w:hAnsi="Montserrat"/>
+        </w:rPr>
+      </w:pPr>
+      <w:r>
+        <w:rPr>
+          <w:rFonts w:ascii="Montserrat" w:hAnsi="Montserrat"/>
           <w:b/>
           <w:bCs/>
         </w:rPr>
@@ -1559,6 +1806,7 @@
       </w:r>
       <w:r>
         <w:rPr>
+          <w:rFonts w:ascii="Montserrat" w:hAnsi="Montserrat"/>
           <w:b/>
           <w:bCs/>
         </w:rPr>
@@ -1566,6 +1814,7 @@
       </w:r>
       <w:r>
         <w:rPr>
+          <w:rFonts w:ascii="Montserrat" w:hAnsi="Montserrat"/>
           <w:b/>
           <w:bCs/>
         </w:rPr>
@@ -1579,22 +1828,159 @@
           <w:ilvl w:val="0"/>
           <w:numId w:val="6"/>
         </w:numPr>
-      </w:pPr>
-      <w:r>
-        <w:t>Review the Description, Consequence Description, Consequence, Probability, and Risk Label fields and update as necessary. Select “Create”.</w:t>
+        <w:rPr>
+          <w:rFonts w:ascii="Montserrat" w:hAnsi="Montserrat"/>
+        </w:rPr>
+      </w:pPr>
+      <w:r>
+        <w:rPr>
+          <w:rFonts w:ascii="Montserrat" w:hAnsi="Montserrat"/>
+        </w:rPr>
+        <w:t xml:space="preserve">Review the </w:t>
+      </w:r>
+      <w:r>
+        <w:rPr>
+          <w:rFonts w:ascii="Montserrat" w:hAnsi="Montserrat"/>
+        </w:rPr>
+        <w:t>“</w:t>
+      </w:r>
+      <w:r>
+        <w:rPr>
+          <w:rFonts w:ascii="Montserrat" w:hAnsi="Montserrat"/>
+        </w:rPr>
+        <w:t>Description</w:t>
+      </w:r>
+      <w:r>
+        <w:rPr>
+          <w:rFonts w:ascii="Montserrat" w:hAnsi="Montserrat"/>
+        </w:rPr>
+        <w:t>”</w:t>
+      </w:r>
+      <w:r>
+        <w:rPr>
+          <w:rFonts w:ascii="Montserrat" w:hAnsi="Montserrat"/>
+        </w:rPr>
+        <w:t xml:space="preserve">, </w:t>
+      </w:r>
+      <w:r>
+        <w:rPr>
+          <w:rFonts w:ascii="Montserrat" w:hAnsi="Montserrat"/>
+        </w:rPr>
+        <w:t>“</w:t>
+      </w:r>
+      <w:r>
+        <w:rPr>
+          <w:rFonts w:ascii="Montserrat" w:hAnsi="Montserrat"/>
+        </w:rPr>
+        <w:t>Consequence Description</w:t>
+      </w:r>
+      <w:r>
+        <w:rPr>
+          <w:rFonts w:ascii="Montserrat" w:hAnsi="Montserrat"/>
+        </w:rPr>
+        <w:t>”</w:t>
+      </w:r>
+      <w:r>
+        <w:rPr>
+          <w:rFonts w:ascii="Montserrat" w:hAnsi="Montserrat"/>
+        </w:rPr>
+        <w:t xml:space="preserve">, </w:t>
+      </w:r>
+      <w:r>
+        <w:rPr>
+          <w:rFonts w:ascii="Montserrat" w:hAnsi="Montserrat"/>
+        </w:rPr>
+        <w:t>“</w:t>
+      </w:r>
+      <w:r>
+        <w:rPr>
+          <w:rFonts w:ascii="Montserrat" w:hAnsi="Montserrat"/>
+        </w:rPr>
+        <w:t>Consequence</w:t>
+      </w:r>
+      <w:r>
+        <w:rPr>
+          <w:rFonts w:ascii="Montserrat" w:hAnsi="Montserrat"/>
+        </w:rPr>
+        <w:t>”</w:t>
+      </w:r>
+      <w:r>
+        <w:rPr>
+          <w:rFonts w:ascii="Montserrat" w:hAnsi="Montserrat"/>
+        </w:rPr>
+        <w:t xml:space="preserve">, </w:t>
+      </w:r>
+      <w:r>
+        <w:rPr>
+          <w:rFonts w:ascii="Montserrat" w:hAnsi="Montserrat"/>
+        </w:rPr>
+        <w:t>“</w:t>
+      </w:r>
+      <w:r>
+        <w:rPr>
+          <w:rFonts w:ascii="Montserrat" w:hAnsi="Montserrat"/>
+        </w:rPr>
+        <w:t>Probability</w:t>
+      </w:r>
+      <w:r>
+        <w:rPr>
+          <w:rFonts w:ascii="Montserrat" w:hAnsi="Montserrat"/>
+        </w:rPr>
+        <w:t>”</w:t>
+      </w:r>
+      <w:r>
+        <w:rPr>
+          <w:rFonts w:ascii="Montserrat" w:hAnsi="Montserrat"/>
+        </w:rPr>
+        <w:t xml:space="preserve">, and </w:t>
+      </w:r>
+      <w:r>
+        <w:rPr>
+          <w:rFonts w:ascii="Montserrat" w:hAnsi="Montserrat"/>
+        </w:rPr>
+        <w:t>“</w:t>
+      </w:r>
+      <w:r>
+        <w:rPr>
+          <w:rFonts w:ascii="Montserrat" w:hAnsi="Montserrat"/>
+        </w:rPr>
+        <w:t>Risk Label</w:t>
+      </w:r>
+      <w:r>
+        <w:rPr>
+          <w:rFonts w:ascii="Montserrat" w:hAnsi="Montserrat"/>
+        </w:rPr>
+        <w:t>”</w:t>
+      </w:r>
+      <w:r>
+        <w:rPr>
+          <w:rFonts w:ascii="Montserrat" w:hAnsi="Montserrat"/>
+        </w:rPr>
+        <w:t xml:space="preserve"> fields and update as necessary. Select “Create”.</w:t>
       </w:r>
     </w:p>
     <w:p>
       <w:pPr>
         <w:pStyle w:val="ListParagraph"/>
+        <w:rPr>
+          <w:rFonts w:ascii="Montserrat" w:hAnsi="Montserrat"/>
+        </w:rPr>
       </w:pPr>
     </w:p>
     <w:p>
       <w:pPr>
         <w:pStyle w:val="ListParagraph"/>
         <w:jc w:val="center"/>
-      </w:pPr>
-      <w:r>
+        <w:rPr>
+          <w:rFonts w:ascii="Montserrat" w:hAnsi="Montserrat"/>
+        </w:rPr>
+      </w:pPr>
+      <w:r>
+        <w:rPr>
+          <w:rFonts w:ascii="Montserrat" w:hAnsi="Montserrat"/>
+          <w:noProof/>
+        </w:rPr>
+        <w:lastRenderedPageBreak/>
         <w:drawing>
           <wp:inline distT="0" distB="0" distL="0" distR="0" wp14:anchorId="2521C695" wp14:editId="778F49C9">
             <wp:extent cx="4140214" cy="3348000"/>
@@ -1644,57 +2030,89 @@
           <w:ilvl w:val="0"/>
           <w:numId w:val="6"/>
         </w:numPr>
-      </w:pPr>
-      <w:r>
-        <w:lastRenderedPageBreak/>
+        <w:rPr>
+          <w:rFonts w:ascii="Montserrat" w:hAnsi="Montserrat"/>
+        </w:rPr>
+      </w:pPr>
+      <w:r>
+        <w:rPr>
+          <w:rFonts w:ascii="Montserrat" w:hAnsi="Montserrat"/>
+        </w:rPr>
         <w:t xml:space="preserve">Inspect the “Relationship” tab of the </w:t>
       </w:r>
       <w:r>
         <w:rPr>
+          <w:rFonts w:ascii="Montserrat" w:hAnsi="Montserrat"/>
           <w:b/>
           <w:bCs/>
         </w:rPr>
         <w:t>Requirement</w:t>
       </w:r>
       <w:r>
+        <w:rPr>
+          <w:rFonts w:ascii="Montserrat" w:hAnsi="Montserrat"/>
+        </w:rPr>
         <w:t xml:space="preserve"> and there should now be a “causes” relationship with the newly </w:t>
       </w:r>
       <w:r>
+        <w:rPr>
+          <w:rFonts w:ascii="Montserrat" w:hAnsi="Montserrat"/>
+        </w:rPr>
         <w:t>generated</w:t>
       </w:r>
       <w:r>
+        <w:rPr>
+          <w:rFonts w:ascii="Montserrat" w:hAnsi="Montserrat"/>
+        </w:rPr>
         <w:t xml:space="preserve"> </w:t>
       </w:r>
       <w:r>
         <w:rPr>
+          <w:rFonts w:ascii="Montserrat" w:hAnsi="Montserrat"/>
           <w:b/>
           <w:bCs/>
         </w:rPr>
         <w:t>Risk</w:t>
       </w:r>
       <w:r>
+        <w:rPr>
+          <w:rFonts w:ascii="Montserrat" w:hAnsi="Montserrat"/>
+        </w:rPr>
         <w:t xml:space="preserve"> and a “verified by” relationship with the newly </w:t>
       </w:r>
       <w:r>
+        <w:rPr>
+          <w:rFonts w:ascii="Montserrat" w:hAnsi="Montserrat"/>
+        </w:rPr>
         <w:t>generated</w:t>
       </w:r>
       <w:r>
+        <w:rPr>
+          <w:rFonts w:ascii="Montserrat" w:hAnsi="Montserrat"/>
+        </w:rPr>
         <w:t xml:space="preserve"> </w:t>
       </w:r>
       <w:r>
         <w:rPr>
+          <w:rFonts w:ascii="Montserrat" w:hAnsi="Montserrat"/>
           <w:b/>
           <w:bCs/>
         </w:rPr>
         <w:t>Test Case</w:t>
       </w:r>
       <w:r>
+        <w:rPr>
+          <w:rFonts w:ascii="Montserrat" w:hAnsi="Montserrat"/>
+        </w:rPr>
         <w:t>.</w:t>
       </w:r>
     </w:p>
     <w:p>
       <w:pPr>
         <w:pStyle w:val="ListParagraph"/>
+        <w:rPr>
+          <w:rFonts w:ascii="Montserrat" w:hAnsi="Montserrat"/>
+        </w:rPr>
       </w:pPr>
     </w:p>
     <w:p>
@@ -1729,7 +2147,23 @@
           <w:bCs/>
         </w:rPr>
         <w:lastRenderedPageBreak/>
-        <w:t>Mod 6 – Structural Architecture Lab</w:t>
+        <w:t>Mod</w:t>
+      </w:r>
+      <w:r>
+        <w:rPr>
+          <w:rFonts w:ascii="Montserrat" w:hAnsi="Montserrat"/>
+          <w:b/>
+          <w:bCs/>
+        </w:rPr>
+        <w:t>ule</w:t>
+      </w:r>
+      <w:r>
+        <w:rPr>
+          <w:rFonts w:ascii="Montserrat" w:hAnsi="Montserrat"/>
+          <w:b/>
+          <w:bCs/>
+        </w:rPr>
+        <w:t xml:space="preserve"> 6 – Structural Architecture Lab</w:t>
       </w:r>
     </w:p>
     <w:p>
@@ -1739,27 +2173,46 @@
           <w:ilvl w:val="0"/>
           <w:numId w:val="5"/>
         </w:numPr>
-      </w:pPr>
-      <w:r>
+        <w:rPr>
+          <w:rFonts w:ascii="Montserrat" w:hAnsi="Montserrat"/>
+        </w:rPr>
+      </w:pPr>
+      <w:r>
+        <w:rPr>
+          <w:rFonts w:ascii="Montserrat" w:hAnsi="Montserrat"/>
+        </w:rPr>
         <w:t xml:space="preserve">Create </w:t>
       </w:r>
       <w:r>
+        <w:rPr>
+          <w:rFonts w:ascii="Montserrat" w:hAnsi="Montserrat"/>
+        </w:rPr>
         <w:t xml:space="preserve">an </w:t>
       </w:r>
       <w:r>
         <w:rPr>
+          <w:rFonts w:ascii="Montserrat" w:hAnsi="Montserrat"/>
           <w:b/>
           <w:bCs/>
         </w:rPr>
         <w:t>Asset</w:t>
       </w:r>
       <w:r>
+        <w:rPr>
+          <w:rFonts w:ascii="Montserrat" w:hAnsi="Montserrat"/>
+        </w:rPr>
         <w:t xml:space="preserve"> named “</w:t>
       </w:r>
       <w:r>
+        <w:rPr>
+          <w:rFonts w:ascii="Montserrat" w:hAnsi="Montserrat"/>
+        </w:rPr>
         <w:t>Cell Phone</w:t>
       </w:r>
       <w:r>
+        <w:rPr>
+          <w:rFonts w:ascii="Montserrat" w:hAnsi="Montserrat"/>
+        </w:rPr>
         <w:t>”.</w:t>
       </w:r>
     </w:p>
@@ -1770,27 +2223,60 @@
           <w:ilvl w:val="0"/>
           <w:numId w:val="5"/>
         </w:numPr>
-      </w:pPr>
-      <w:r>
-        <w:t xml:space="preserve">Create an Asset Diagram for the </w:t>
-      </w:r>
-      <w:r>
+        <w:rPr>
+          <w:rFonts w:ascii="Montserrat" w:hAnsi="Montserrat"/>
+        </w:rPr>
+      </w:pPr>
+      <w:r>
+        <w:rPr>
+          <w:rFonts w:ascii="Montserrat" w:hAnsi="Montserrat"/>
+        </w:rPr>
+        <w:t xml:space="preserve">Create an </w:t>
+      </w:r>
+      <w:r>
+        <w:rPr>
+          <w:rFonts w:ascii="Montserrat" w:hAnsi="Montserrat"/>
+          <w:i/>
+          <w:iCs/>
+        </w:rPr>
+        <w:t>Asset Diagram</w:t>
+      </w:r>
+      <w:r>
+        <w:rPr>
+          <w:rFonts w:ascii="Montserrat" w:hAnsi="Montserrat"/>
+        </w:rPr>
+        <w:t xml:space="preserve"> for the </w:t>
+      </w:r>
+      <w:r>
+        <w:rPr>
+          <w:rFonts w:ascii="Montserrat" w:hAnsi="Montserrat"/>
+        </w:rPr>
         <w:t>“</w:t>
       </w:r>
       <w:r>
+        <w:rPr>
+          <w:rFonts w:ascii="Montserrat" w:hAnsi="Montserrat"/>
+        </w:rPr>
         <w:t>Cell Phone</w:t>
       </w:r>
       <w:r>
+        <w:rPr>
+          <w:rFonts w:ascii="Montserrat" w:hAnsi="Montserrat"/>
+        </w:rPr>
         <w:t xml:space="preserve">” and add the following </w:t>
       </w:r>
       <w:r>
         <w:rPr>
+          <w:rFonts w:ascii="Montserrat" w:hAnsi="Montserrat"/>
           <w:b/>
           <w:bCs/>
         </w:rPr>
         <w:t>Assets</w:t>
       </w:r>
       <w:r>
+        <w:rPr>
+          <w:rFonts w:ascii="Montserrat" w:hAnsi="Montserrat"/>
+        </w:rPr>
         <w:t>:</w:t>
       </w:r>
     </w:p>
@@ -1801,8 +2287,14 @@
           <w:ilvl w:val="1"/>
           <w:numId w:val="5"/>
         </w:numPr>
-      </w:pPr>
-      <w:r>
+        <w:rPr>
+          <w:rFonts w:ascii="Montserrat" w:hAnsi="Montserrat"/>
+        </w:rPr>
+      </w:pPr>
+      <w:r>
+        <w:rPr>
+          <w:rFonts w:ascii="Montserrat" w:hAnsi="Montserrat"/>
+        </w:rPr>
         <w:t>Battery</w:t>
       </w:r>
     </w:p>
@@ -1813,8 +2305,14 @@
           <w:ilvl w:val="1"/>
           <w:numId w:val="5"/>
         </w:numPr>
-      </w:pPr>
-      <w:r>
+        <w:rPr>
+          <w:rFonts w:ascii="Montserrat" w:hAnsi="Montserrat"/>
+        </w:rPr>
+      </w:pPr>
+      <w:r>
+        <w:rPr>
+          <w:rFonts w:ascii="Montserrat" w:hAnsi="Montserrat"/>
+        </w:rPr>
         <w:t>CPU</w:t>
       </w:r>
     </w:p>
@@ -1825,8 +2323,14 @@
           <w:ilvl w:val="1"/>
           <w:numId w:val="5"/>
         </w:numPr>
-      </w:pPr>
-      <w:r>
+        <w:rPr>
+          <w:rFonts w:ascii="Montserrat" w:hAnsi="Montserrat"/>
+        </w:rPr>
+      </w:pPr>
+      <w:r>
+        <w:rPr>
+          <w:rFonts w:ascii="Montserrat" w:hAnsi="Montserrat"/>
+        </w:rPr>
         <w:t>Communication Subsystem</w:t>
       </w:r>
     </w:p>
@@ -1837,16 +2341,29 @@
           <w:ilvl w:val="1"/>
           <w:numId w:val="5"/>
         </w:numPr>
-      </w:pPr>
-      <w:r>
+        <w:rPr>
+          <w:rFonts w:ascii="Montserrat" w:hAnsi="Montserrat"/>
+        </w:rPr>
+      </w:pPr>
+      <w:r>
+        <w:rPr>
+          <w:rFonts w:ascii="Montserrat" w:hAnsi="Montserrat"/>
+        </w:rPr>
         <w:t>Camera Subsystem</w:t>
       </w:r>
     </w:p>
     <w:p>
       <w:pPr>
         <w:jc w:val="center"/>
-      </w:pPr>
-      <w:r>
+        <w:rPr>
+          <w:rFonts w:ascii="Montserrat" w:hAnsi="Montserrat"/>
+        </w:rPr>
+      </w:pPr>
+      <w:r>
+        <w:rPr>
+          <w:rFonts w:ascii="Montserrat" w:hAnsi="Montserrat"/>
+          <w:noProof/>
+        </w:rPr>
         <w:drawing>
           <wp:inline distT="0" distB="0" distL="0" distR="0" wp14:anchorId="33007D25" wp14:editId="153808D4">
             <wp:extent cx="2457792" cy="1924100"/>
@@ -1906,12 +2423,14 @@
     <w:p>
       <w:pPr>
         <w:rPr>
+          <w:rFonts w:ascii="Montserrat" w:hAnsi="Montserrat"/>
           <w:b/>
           <w:bCs/>
         </w:rPr>
       </w:pPr>
       <w:r>
         <w:rPr>
+          <w:rFonts w:ascii="Montserrat" w:hAnsi="Montserrat"/>
           <w:b/>
           <w:bCs/>
         </w:rPr>
@@ -1925,21 +2444,86 @@
           <w:ilvl w:val="0"/>
           <w:numId w:val="5"/>
         </w:numPr>
-      </w:pPr>
-      <w:r>
-        <w:t>Create an Asset Diagram for the Camera Subsystem and add the following</w:t>
-      </w:r>
-      <w:r>
+        <w:rPr>
+          <w:rFonts w:ascii="Montserrat" w:hAnsi="Montserrat"/>
+        </w:rPr>
+      </w:pPr>
+      <w:r>
+        <w:rPr>
+          <w:rFonts w:ascii="Montserrat" w:hAnsi="Montserrat"/>
+        </w:rPr>
+        <w:t xml:space="preserve">Create an </w:t>
+      </w:r>
+      <w:r>
+        <w:rPr>
+          <w:rFonts w:ascii="Montserrat" w:hAnsi="Montserrat"/>
+          <w:i/>
+          <w:iCs/>
+        </w:rPr>
+        <w:t>Asset Diagram</w:t>
+      </w:r>
+      <w:r>
+        <w:rPr>
+          <w:rFonts w:ascii="Montserrat" w:hAnsi="Montserrat"/>
+        </w:rPr>
+        <w:t xml:space="preserve"> for the </w:t>
+      </w:r>
+      <w:r>
+        <w:rPr>
+          <w:rFonts w:ascii="Montserrat" w:hAnsi="Montserrat"/>
+        </w:rPr>
+        <w:t>“</w:t>
+      </w:r>
+      <w:r>
+        <w:rPr>
+          <w:rFonts w:ascii="Montserrat" w:hAnsi="Montserrat"/>
+        </w:rPr>
+        <w:t>Camera</w:t>
+      </w:r>
+      <w:r>
+        <w:rPr>
+          <w:rFonts w:ascii="Montserrat" w:hAnsi="Montserrat"/>
+        </w:rPr>
+        <w:t>”</w:t>
+      </w:r>
+      <w:r>
+        <w:rPr>
+          <w:rFonts w:ascii="Montserrat" w:hAnsi="Montserrat"/>
+        </w:rPr>
         <w:t xml:space="preserve"> </w:t>
       </w:r>
       <w:r>
         <w:rPr>
+          <w:rFonts w:ascii="Montserrat" w:hAnsi="Montserrat"/>
           <w:b/>
           <w:bCs/>
         </w:rPr>
+        <w:t xml:space="preserve">Subsystem </w:t>
+      </w:r>
+      <w:r>
+        <w:rPr>
+          <w:rFonts w:ascii="Montserrat" w:hAnsi="Montserrat"/>
+        </w:rPr>
+        <w:t>and add the following</w:t>
+      </w:r>
+      <w:r>
+        <w:rPr>
+          <w:rFonts w:ascii="Montserrat" w:hAnsi="Montserrat"/>
+        </w:rPr>
+        <w:t xml:space="preserve"> </w:t>
+      </w:r>
+      <w:r>
+        <w:rPr>
+          <w:rFonts w:ascii="Montserrat" w:hAnsi="Montserrat"/>
+          <w:b/>
+          <w:bCs/>
+        </w:rPr>
         <w:t>Assets</w:t>
       </w:r>
       <w:r>
+        <w:rPr>
+          <w:rFonts w:ascii="Montserrat" w:hAnsi="Montserrat"/>
+        </w:rPr>
         <w:t>:</w:t>
       </w:r>
     </w:p>
@@ -1947,8 +2531,15 @@
       <w:pPr>
         <w:pStyle w:val="ListParagraph"/>
         <w:jc w:val="center"/>
-      </w:pPr>
-      <w:r>
+        <w:rPr>
+          <w:rFonts w:ascii="Montserrat" w:hAnsi="Montserrat"/>
+        </w:rPr>
+      </w:pPr>
+      <w:r>
+        <w:rPr>
+          <w:rFonts w:ascii="Montserrat" w:hAnsi="Montserrat"/>
+          <w:noProof/>
+        </w:rPr>
         <w:drawing>
           <wp:inline distT="0" distB="0" distL="0" distR="0" wp14:anchorId="21347D37" wp14:editId="51951ED6">
             <wp:extent cx="2908800" cy="811033"/>
@@ -1998,26 +2589,81 @@
           <w:ilvl w:val="0"/>
           <w:numId w:val="5"/>
         </w:numPr>
-      </w:pPr>
-      <w:r>
-        <w:t xml:space="preserve">Navigate to the Cell Phone </w:t>
-      </w:r>
-      <w:r>
-        <w:rPr>
+        <w:rPr>
+          <w:rFonts w:ascii="Montserrat" w:hAnsi="Montserrat"/>
+        </w:rPr>
+      </w:pPr>
+      <w:r>
+        <w:rPr>
+          <w:rFonts w:ascii="Montserrat" w:hAnsi="Montserrat"/>
+        </w:rPr>
+        <w:t xml:space="preserve">Navigate to the </w:t>
+      </w:r>
+      <w:r>
+        <w:rPr>
+          <w:rFonts w:ascii="Montserrat" w:hAnsi="Montserrat"/>
+        </w:rPr>
+        <w:t>“</w:t>
+      </w:r>
+      <w:r>
+        <w:rPr>
+          <w:rFonts w:ascii="Montserrat" w:hAnsi="Montserrat"/>
+        </w:rPr>
+        <w:t>Cell Phone</w:t>
+      </w:r>
+      <w:r>
+        <w:rPr>
+          <w:rFonts w:ascii="Montserrat" w:hAnsi="Montserrat"/>
+        </w:rPr>
+        <w:t>”</w:t>
+      </w:r>
+      <w:r>
+        <w:rPr>
+          <w:rFonts w:ascii="Montserrat" w:hAnsi="Montserrat"/>
+        </w:rPr>
+        <w:t xml:space="preserve"> </w:t>
+      </w:r>
+      <w:r>
+        <w:rPr>
+          <w:rFonts w:ascii="Montserrat" w:hAnsi="Montserrat"/>
           <w:b/>
           <w:bCs/>
         </w:rPr>
         <w:t>Asset</w:t>
       </w:r>
       <w:r>
-        <w:t>. Open the Class Diagram.</w:t>
+        <w:rPr>
+          <w:rFonts w:ascii="Montserrat" w:hAnsi="Montserrat"/>
+        </w:rPr>
+        <w:t xml:space="preserve">. Open the </w:t>
+      </w:r>
+      <w:r>
+        <w:rPr>
+          <w:rFonts w:ascii="Montserrat" w:hAnsi="Montserrat"/>
+          <w:i/>
+          <w:iCs/>
+        </w:rPr>
+        <w:t>Class Diagram</w:t>
+      </w:r>
+      <w:r>
+        <w:rPr>
+          <w:rFonts w:ascii="Montserrat" w:hAnsi="Montserrat"/>
+        </w:rPr>
+        <w:t>.</w:t>
       </w:r>
     </w:p>
     <w:p>
       <w:pPr>
         <w:jc w:val="center"/>
-      </w:pPr>
-      <w:r>
+        <w:rPr>
+          <w:rFonts w:ascii="Montserrat" w:hAnsi="Montserrat"/>
+        </w:rPr>
+      </w:pPr>
+      <w:r>
+        <w:rPr>
+          <w:rFonts w:ascii="Montserrat" w:hAnsi="Montserrat"/>
+          <w:noProof/>
+        </w:rPr>
         <w:drawing>
           <wp:inline distT="0" distB="0" distL="0" distR="0" wp14:anchorId="52A0B835" wp14:editId="0EE77B23">
             <wp:extent cx="4442400" cy="1579045"/>
@@ -2063,15 +2709,18 @@
     <w:p>
       <w:pPr>
         <w:rPr>
+          <w:rFonts w:ascii="Montserrat" w:hAnsi="Montserrat"/>
           <w:b/>
           <w:bCs/>
         </w:rPr>
       </w:pPr>
       <w:r>
         <w:rPr>
+          <w:rFonts w:ascii="Montserrat" w:hAnsi="Montserrat"/>
           <w:b/>
           <w:bCs/>
         </w:rPr>
+        <w:lastRenderedPageBreak/>
         <w:t>NOTE: We have not added Attributes to the Battery or Camera Subsystem Asset.</w:t>
       </w:r>
     </w:p>
@@ -2082,18 +2731,44 @@
           <w:ilvl w:val="0"/>
           <w:numId w:val="5"/>
         </w:numPr>
-      </w:pPr>
-      <w:r>
-        <w:t>Open the Hierarchy Diagram.</w:t>
+        <w:rPr>
+          <w:rFonts w:ascii="Montserrat" w:hAnsi="Montserrat"/>
+        </w:rPr>
+      </w:pPr>
+      <w:r>
+        <w:rPr>
+          <w:rFonts w:ascii="Montserrat" w:hAnsi="Montserrat"/>
+        </w:rPr>
+        <w:t xml:space="preserve">Open the </w:t>
+      </w:r>
+      <w:r>
+        <w:rPr>
+          <w:rFonts w:ascii="Montserrat" w:hAnsi="Montserrat"/>
+          <w:i/>
+          <w:iCs/>
+        </w:rPr>
+        <w:t>Hierarchy Diagram</w:t>
+      </w:r>
+      <w:r>
+        <w:rPr>
+          <w:rFonts w:ascii="Montserrat" w:hAnsi="Montserrat"/>
+        </w:rPr>
+        <w:t>.</w:t>
       </w:r>
     </w:p>
     <w:p>
       <w:pPr>
         <w:pStyle w:val="ListParagraph"/>
         <w:jc w:val="center"/>
-      </w:pPr>
-      <w:r>
-        <w:lastRenderedPageBreak/>
+        <w:rPr>
+          <w:rFonts w:ascii="Montserrat" w:hAnsi="Montserrat"/>
+        </w:rPr>
+      </w:pPr>
+      <w:r>
+        <w:rPr>
+          <w:rFonts w:ascii="Montserrat" w:hAnsi="Montserrat"/>
+          <w:noProof/>
+        </w:rPr>
         <w:drawing>
           <wp:inline distT="0" distB="0" distL="0" distR="0" wp14:anchorId="20E6CAD8" wp14:editId="795235E8">
             <wp:extent cx="2829209" cy="1720800"/>
@@ -2139,6 +2814,9 @@
     <w:p>
       <w:pPr>
         <w:pStyle w:val="ListParagraph"/>
+        <w:rPr>
+          <w:rFonts w:ascii="Montserrat" w:hAnsi="Montserrat"/>
+        </w:rPr>
       </w:pPr>
     </w:p>
     <w:p>
@@ -2148,22 +2826,52 @@
           <w:ilvl w:val="0"/>
           <w:numId w:val="5"/>
         </w:numPr>
-      </w:pPr>
-      <w:r>
-        <w:t>Open the Layer Diagram.</w:t>
+        <w:rPr>
+          <w:rFonts w:ascii="Montserrat" w:hAnsi="Montserrat"/>
+        </w:rPr>
+      </w:pPr>
+      <w:r>
+        <w:rPr>
+          <w:rFonts w:ascii="Montserrat" w:hAnsi="Montserrat"/>
+        </w:rPr>
+        <w:t xml:space="preserve">Open the </w:t>
+      </w:r>
+      <w:r>
+        <w:rPr>
+          <w:rFonts w:ascii="Montserrat" w:hAnsi="Montserrat"/>
+          <w:i/>
+          <w:iCs/>
+        </w:rPr>
+        <w:t>Layer Diagram</w:t>
+      </w:r>
+      <w:r>
+        <w:rPr>
+          <w:rFonts w:ascii="Montserrat" w:hAnsi="Montserrat"/>
+        </w:rPr>
+        <w:t>.</w:t>
       </w:r>
     </w:p>
     <w:p>
       <w:pPr>
         <w:pStyle w:val="ListParagraph"/>
+        <w:rPr>
+          <w:rFonts w:ascii="Montserrat" w:hAnsi="Montserrat"/>
+        </w:rPr>
       </w:pPr>
     </w:p>
     <w:p>
       <w:pPr>
         <w:pStyle w:val="ListParagraph"/>
         <w:jc w:val="center"/>
-      </w:pPr>
-      <w:r>
+        <w:rPr>
+          <w:rFonts w:ascii="Montserrat" w:hAnsi="Montserrat"/>
+        </w:rPr>
+      </w:pPr>
+      <w:r>
+        <w:rPr>
+          <w:rFonts w:ascii="Montserrat" w:hAnsi="Montserrat"/>
+          <w:noProof/>
+        </w:rPr>
         <w:drawing>
           <wp:inline distT="0" distB="0" distL="0" distR="0" wp14:anchorId="24397CA7" wp14:editId="29F7A148">
             <wp:extent cx="1842625" cy="2599200"/>
@@ -2213,17 +2921,59 @@
           <w:ilvl w:val="0"/>
           <w:numId w:val="5"/>
         </w:numPr>
-      </w:pPr>
-      <w:r>
-        <w:t xml:space="preserve">Open the Risk Diagram. Drag and drop the generated Risk onto the matrix. </w:t>
+        <w:rPr>
+          <w:rFonts w:ascii="Montserrat" w:hAnsi="Montserrat"/>
+        </w:rPr>
+      </w:pPr>
+      <w:r>
+        <w:rPr>
+          <w:rFonts w:ascii="Montserrat" w:hAnsi="Montserrat"/>
+        </w:rPr>
+        <w:t xml:space="preserve">Open the </w:t>
+      </w:r>
+      <w:r>
+        <w:rPr>
+          <w:rFonts w:ascii="Montserrat" w:hAnsi="Montserrat"/>
+          <w:i/>
+          <w:iCs/>
+        </w:rPr>
+        <w:t>Risk Diagram</w:t>
+      </w:r>
+      <w:r>
+        <w:rPr>
+          <w:rFonts w:ascii="Montserrat" w:hAnsi="Montserrat"/>
+        </w:rPr>
+        <w:t xml:space="preserve">. Drag and drop the generated </w:t>
+      </w:r>
+      <w:r>
+        <w:rPr>
+          <w:rFonts w:ascii="Montserrat" w:hAnsi="Montserrat"/>
+          <w:b/>
+          <w:bCs/>
+        </w:rPr>
+        <w:t xml:space="preserve">Risk </w:t>
+      </w:r>
+      <w:r>
+        <w:rPr>
+          <w:rFonts w:ascii="Montserrat" w:hAnsi="Montserrat"/>
+        </w:rPr>
+        <w:t xml:space="preserve">onto the matrix. </w:t>
       </w:r>
     </w:p>
     <w:p>
       <w:pPr>
         <w:pStyle w:val="ListParagraph"/>
         <w:jc w:val="center"/>
-      </w:pPr>
-      <w:r>
+        <w:rPr>
+          <w:rFonts w:ascii="Montserrat" w:hAnsi="Montserrat"/>
+        </w:rPr>
+      </w:pPr>
+      <w:r>
+        <w:rPr>
+          <w:rFonts w:ascii="Montserrat" w:hAnsi="Montserrat"/>
+          <w:noProof/>
+        </w:rPr>
+        <w:lastRenderedPageBreak/>
         <w:drawing>
           <wp:inline distT="0" distB="0" distL="0" distR="0" wp14:anchorId="5B8F4FFF" wp14:editId="35656BDF">
             <wp:extent cx="4094729" cy="1965120"/>
@@ -2265,28 +3015,99 @@
           </wp:inline>
         </w:drawing>
       </w:r>
-      <w:r>
+    </w:p>
+    <w:p>
+      <w:pPr>
+        <w:pStyle w:val="ListParagraph"/>
+        <w:rPr>
+          <w:rFonts w:ascii="Montserrat" w:hAnsi="Montserrat"/>
+        </w:rPr>
+      </w:pPr>
+      <w:r>
+        <w:rPr>
+          <w:rFonts w:ascii="Montserrat" w:hAnsi="Montserrat"/>
+        </w:rPr>
         <w:br/>
       </w:r>
       <w:r>
+        <w:rPr>
+          <w:rFonts w:ascii="Montserrat" w:hAnsi="Montserrat"/>
+        </w:rPr>
         <w:t xml:space="preserve">8. </w:t>
       </w:r>
       <w:r>
-        <w:t>Open the SysML BDD. Select the wrench in the top left and select “Layout Diagram” from the drop-down.</w:t>
+        <w:rPr>
+          <w:rFonts w:ascii="Montserrat" w:hAnsi="Montserrat"/>
+        </w:rPr>
+        <w:t xml:space="preserve">Open the </w:t>
+      </w:r>
+      <w:r>
+        <w:rPr>
+          <w:rFonts w:ascii="Montserrat" w:hAnsi="Montserrat"/>
+          <w:i/>
+          <w:iCs/>
+        </w:rPr>
+        <w:t>SysML BDD</w:t>
+      </w:r>
+      <w:r>
+        <w:rPr>
+          <w:rFonts w:ascii="Montserrat" w:hAnsi="Montserrat"/>
+        </w:rPr>
+        <w:t>. Select the wrench in the top left and select “Layout Diagram” from the drop-down.</w:t>
       </w:r>
     </w:p>
     <w:p>
       <w:pPr>
         <w:pStyle w:val="ListParagraph"/>
-      </w:pPr>
-      <w:r>
-        <w:t xml:space="preserve">9. Open the SysML IBD and </w:t>
-      </w:r>
-      <w:r>
+        <w:rPr>
+          <w:rFonts w:ascii="Montserrat" w:hAnsi="Montserrat"/>
+        </w:rPr>
+      </w:pPr>
+      <w:r>
+        <w:rPr>
+          <w:rFonts w:ascii="Montserrat" w:hAnsi="Montserrat"/>
+        </w:rPr>
+        <w:t xml:space="preserve">9. Open the </w:t>
+      </w:r>
+      <w:r>
+        <w:rPr>
+          <w:rFonts w:ascii="Montserrat" w:hAnsi="Montserrat"/>
+          <w:i/>
+          <w:iCs/>
+        </w:rPr>
+        <w:t>SysML IBD</w:t>
+      </w:r>
+      <w:r>
+        <w:rPr>
+          <w:rFonts w:ascii="Montserrat" w:hAnsi="Montserrat"/>
+        </w:rPr>
+        <w:t xml:space="preserve"> and </w:t>
+      </w:r>
+      <w:r>
+        <w:rPr>
+          <w:rFonts w:ascii="Montserrat" w:hAnsi="Montserrat"/>
+        </w:rPr>
         <w:t xml:space="preserve">notice </w:t>
       </w:r>
       <w:r>
-        <w:t>it should look just like the Layer Diagram.</w:t>
+        <w:rPr>
+          <w:rFonts w:ascii="Montserrat" w:hAnsi="Montserrat"/>
+        </w:rPr>
+        <w:t xml:space="preserve">it should look just like the </w:t>
+      </w:r>
+      <w:r>
+        <w:rPr>
+          <w:rFonts w:ascii="Montserrat" w:hAnsi="Montserrat"/>
+          <w:i/>
+          <w:iCs/>
+        </w:rPr>
+        <w:t>Layer Diagram</w:t>
+      </w:r>
+      <w:r>
+        <w:rPr>
+          <w:rFonts w:ascii="Montserrat" w:hAnsi="Montserrat"/>
+        </w:rPr>
+        <w:t>.</w:t>
       </w:r>
     </w:p>
     <w:p>
@@ -2303,8 +3124,23 @@
           <w:b/>
           <w:bCs/>
         </w:rPr>
-        <w:lastRenderedPageBreak/>
-        <w:t>Mod 7 – Functional Architecture Lab</w:t>
+        <w:t>Mod</w:t>
+      </w:r>
+      <w:r>
+        <w:rPr>
+          <w:rFonts w:ascii="Montserrat" w:hAnsi="Montserrat"/>
+          <w:b/>
+          <w:bCs/>
+        </w:rPr>
+        <w:t>ule</w:t>
+      </w:r>
+      <w:r>
+        <w:rPr>
+          <w:rFonts w:ascii="Montserrat" w:hAnsi="Montserrat"/>
+          <w:b/>
+          <w:bCs/>
+        </w:rPr>
+        <w:t xml:space="preserve"> 7 – Functional Architecture Lab</w:t>
       </w:r>
     </w:p>
     <w:p>
@@ -2314,19 +3150,43 @@
           <w:ilvl w:val="0"/>
           <w:numId w:val="7"/>
         </w:numPr>
-      </w:pPr>
-      <w:r>
+        <w:rPr>
+          <w:rFonts w:ascii="Montserrat" w:hAnsi="Montserrat"/>
+        </w:rPr>
+      </w:pPr>
+      <w:r>
+        <w:rPr>
+          <w:rFonts w:ascii="Montserrat" w:hAnsi="Montserrat"/>
+        </w:rPr>
         <w:t xml:space="preserve">Create an </w:t>
       </w:r>
       <w:r>
         <w:rPr>
+          <w:rFonts w:ascii="Montserrat" w:hAnsi="Montserrat"/>
           <w:b/>
           <w:bCs/>
         </w:rPr>
         <w:t>Action</w:t>
       </w:r>
       <w:r>
-        <w:t xml:space="preserve"> named “Make Phone Call”. Open the LML Action Diagram from this entity.</w:t>
+        <w:rPr>
+          <w:rFonts w:ascii="Montserrat" w:hAnsi="Montserrat"/>
+        </w:rPr>
+        <w:t xml:space="preserve"> named “Make Phone Call”. Open the </w:t>
+      </w:r>
+      <w:r>
+        <w:rPr>
+          <w:rFonts w:ascii="Montserrat" w:hAnsi="Montserrat"/>
+          <w:i/>
+          <w:iCs/>
+        </w:rPr>
+        <w:t>LML Action Diagram</w:t>
+      </w:r>
+      <w:r>
+        <w:rPr>
+          <w:rFonts w:ascii="Montserrat" w:hAnsi="Montserrat"/>
+        </w:rPr>
+        <w:t xml:space="preserve"> from this entity.</w:t>
       </w:r>
     </w:p>
     <w:p>
@@ -2336,17 +3196,44 @@
           <w:ilvl w:val="0"/>
           <w:numId w:val="7"/>
         </w:numPr>
-      </w:pPr>
-      <w:r>
-        <w:t>Create the following LML Action Diagram:</w:t>
+        <w:rPr>
+          <w:rFonts w:ascii="Montserrat" w:hAnsi="Montserrat"/>
+        </w:rPr>
+      </w:pPr>
+      <w:r>
+        <w:rPr>
+          <w:rFonts w:ascii="Montserrat" w:hAnsi="Montserrat"/>
+        </w:rPr>
+        <w:t xml:space="preserve">Create the following </w:t>
+      </w:r>
+      <w:r>
+        <w:rPr>
+          <w:rFonts w:ascii="Montserrat" w:hAnsi="Montserrat"/>
+          <w:i/>
+          <w:iCs/>
+        </w:rPr>
+        <w:t>LML Action Diagram</w:t>
+      </w:r>
+      <w:r>
+        <w:rPr>
+          <w:rFonts w:ascii="Montserrat" w:hAnsi="Montserrat"/>
+        </w:rPr>
+        <w:t>:</w:t>
       </w:r>
     </w:p>
     <w:p>
       <w:pPr>
         <w:pStyle w:val="ListParagraph"/>
         <w:jc w:val="center"/>
-      </w:pPr>
-      <w:r>
+        <w:rPr>
+          <w:rFonts w:ascii="Montserrat" w:hAnsi="Montserrat"/>
+        </w:rPr>
+      </w:pPr>
+      <w:r>
+        <w:rPr>
+          <w:rFonts w:ascii="Montserrat" w:hAnsi="Montserrat"/>
+          <w:noProof/>
+        </w:rPr>
         <w:drawing>
           <wp:inline distT="0" distB="0" distL="0" distR="0" wp14:anchorId="732CE4C1" wp14:editId="76DBC0BE">
             <wp:extent cx="5943600" cy="2023745"/>
@@ -2396,21 +3283,48 @@
           <w:ilvl w:val="0"/>
           <w:numId w:val="7"/>
         </w:numPr>
-      </w:pPr>
-      <w:r>
-        <w:t xml:space="preserve">Create an LML Action Diagram from the </w:t>
-      </w:r>
-      <w:r>
-        <w:rPr>
+        <w:rPr>
+          <w:rFonts w:ascii="Montserrat" w:hAnsi="Montserrat"/>
+        </w:rPr>
+      </w:pPr>
+      <w:r>
+        <w:rPr>
+          <w:rFonts w:ascii="Montserrat" w:hAnsi="Montserrat"/>
+        </w:rPr>
+        <w:t xml:space="preserve">Create an </w:t>
+      </w:r>
+      <w:r>
+        <w:rPr>
+          <w:rFonts w:ascii="Montserrat" w:hAnsi="Montserrat"/>
+          <w:i/>
+          <w:iCs/>
+        </w:rPr>
+        <w:t>LML Action Diagram</w:t>
+      </w:r>
+      <w:r>
+        <w:rPr>
+          <w:rFonts w:ascii="Montserrat" w:hAnsi="Montserrat"/>
+        </w:rPr>
+        <w:t xml:space="preserve"> from the </w:t>
+      </w:r>
+      <w:r>
+        <w:rPr>
+          <w:rFonts w:ascii="Montserrat" w:hAnsi="Montserrat"/>
           <w:b/>
           <w:bCs/>
         </w:rPr>
         <w:t>Test Case</w:t>
       </w:r>
       <w:r>
+        <w:rPr>
+          <w:rFonts w:ascii="Montserrat" w:hAnsi="Montserrat"/>
+        </w:rPr>
         <w:t xml:space="preserve"> generated in Module 4.</w:t>
       </w:r>
       <w:r>
+        <w:rPr>
+          <w:rFonts w:ascii="Montserrat" w:hAnsi="Montserrat"/>
+        </w:rPr>
         <w:t xml:space="preserve"> </w:t>
       </w:r>
     </w:p>
@@ -2418,12 +3332,14 @@
       <w:pPr>
         <w:pStyle w:val="ListParagraph"/>
         <w:rPr>
+          <w:rFonts w:ascii="Montserrat" w:hAnsi="Montserrat"/>
           <w:b/>
           <w:bCs/>
         </w:rPr>
       </w:pPr>
       <w:r>
         <w:rPr>
+          <w:rFonts w:ascii="Montserrat" w:hAnsi="Montserrat"/>
           <w:b/>
           <w:bCs/>
         </w:rPr>
@@ -2437,35 +3353,158 @@
           <w:ilvl w:val="0"/>
           <w:numId w:val="7"/>
         </w:numPr>
-      </w:pPr>
-      <w:r>
-        <w:t xml:space="preserve">Create a traceability matrix that assigns </w:t>
-      </w:r>
-      <w:r>
-        <w:rPr>
+        <w:rPr>
+          <w:rFonts w:ascii="Montserrat" w:hAnsi="Montserrat"/>
+        </w:rPr>
+      </w:pPr>
+      <w:r>
+        <w:rPr>
+          <w:rFonts w:ascii="Montserrat" w:hAnsi="Montserrat"/>
+        </w:rPr>
+        <w:t xml:space="preserve">Open the </w:t>
+      </w:r>
+      <w:r>
+        <w:rPr>
+          <w:rFonts w:ascii="Montserrat" w:hAnsi="Montserrat"/>
+          <w:i/>
+          <w:iCs/>
+        </w:rPr>
+        <w:t>N2 Diagram</w:t>
+      </w:r>
+      <w:r>
+        <w:rPr>
+          <w:rFonts w:ascii="Montserrat" w:hAnsi="Montserrat"/>
+        </w:rPr>
+        <w:t xml:space="preserve"> for the “Make Call” </w:t>
+      </w:r>
+      <w:r>
+        <w:rPr>
+          <w:rFonts w:ascii="Montserrat" w:hAnsi="Montserrat"/>
           <w:b/>
           <w:bCs/>
         </w:rPr>
-        <w:t>Assets</w:t>
-      </w:r>
-      <w:r>
-        <w:t xml:space="preserve"> to the </w:t>
-      </w:r>
-      <w:r>
-        <w:rPr>
+        <w:t>Action</w:t>
+      </w:r>
+      <w:r>
+        <w:rPr>
+          <w:rFonts w:ascii="Montserrat" w:hAnsi="Montserrat"/>
+        </w:rPr>
+        <w:t>:</w:t>
+      </w:r>
+    </w:p>
+    <w:p>
+      <w:pPr>
+        <w:pStyle w:val="ListParagraph"/>
+        <w:jc w:val="center"/>
+        <w:rPr>
+          <w:rFonts w:ascii="Montserrat" w:hAnsi="Montserrat"/>
+        </w:rPr>
+      </w:pPr>
+      <w:r>
+        <w:rPr>
+          <w:rFonts w:ascii="Montserrat" w:hAnsi="Montserrat"/>
+          <w:noProof/>
+        </w:rPr>
+        <w:lastRenderedPageBreak/>
+        <w:drawing>
+          <wp:inline distT="0" distB="0" distL="0" distR="0" wp14:anchorId="7033748A" wp14:editId="08366FA5">
+            <wp:extent cx="3410857" cy="3410857"/>
+            <wp:effectExtent l="12700" t="12700" r="18415" b="18415"/>
+            <wp:docPr id="1530740619" name="Picture 2"/>
+            <wp:cNvGraphicFramePr>
+              <a:graphicFrameLocks xmlns:a="http://schemas.openxmlformats.org/drawingml/2006/main" noChangeAspect="1"/>
+            </wp:cNvGraphicFramePr>
+            <a:graphic xmlns:a="http://schemas.openxmlformats.org/drawingml/2006/main">
+              <a:graphicData uri="http://schemas.openxmlformats.org/drawingml/2006/picture">
+                <pic:pic xmlns:pic="http://schemas.openxmlformats.org/drawingml/2006/picture">
+                  <pic:nvPicPr>
+                    <pic:cNvPr id="1530740619" name="Picture 1530740619"/>
+                    <pic:cNvPicPr/>
+                  </pic:nvPicPr>
+                  <pic:blipFill>
+                    <a:blip r:embed="rId21" cstate="print">
+                      <a:extLst>
+                        <a:ext uri="{28A0092B-C50C-407E-A947-70E740481C1C}">
+                          <a14:useLocalDpi xmlns:a14="http://schemas.microsoft.com/office/drawing/2010/main" val="0"/>
+                        </a:ext>
+                      </a:extLst>
+                    </a:blip>
+                    <a:stretch>
+                      <a:fillRect/>
+                    </a:stretch>
+                  </pic:blipFill>
+                  <pic:spPr>
+                    <a:xfrm>
+                      <a:off x="0" y="0"/>
+                      <a:ext cx="3413558" cy="3413558"/>
+                    </a:xfrm>
+                    <a:prstGeom prst="rect">
+                      <a:avLst/>
+                    </a:prstGeom>
+                    <a:ln>
+                      <a:solidFill>
+                        <a:schemeClr val="tx1"/>
+                      </a:solidFill>
+                    </a:ln>
+                  </pic:spPr>
+                </pic:pic>
+              </a:graphicData>
+            </a:graphic>
+          </wp:inline>
+        </w:drawing>
+      </w:r>
+    </w:p>
+    <w:p>
+      <w:pPr>
+        <w:pStyle w:val="ListParagraph"/>
+        <w:numPr>
+          <w:ilvl w:val="0"/>
+          <w:numId w:val="7"/>
+        </w:numPr>
+        <w:rPr>
+          <w:rFonts w:ascii="Montserrat" w:hAnsi="Montserrat"/>
+        </w:rPr>
+      </w:pPr>
+      <w:r>
+        <w:rPr>
+          <w:rFonts w:ascii="Montserrat" w:hAnsi="Montserrat"/>
+        </w:rPr>
+        <w:t xml:space="preserve">Create a traceability matrix that assigns </w:t>
+      </w:r>
+      <w:r>
+        <w:rPr>
+          <w:rFonts w:ascii="Montserrat" w:hAnsi="Montserrat"/>
           <w:b/>
           <w:bCs/>
         </w:rPr>
-        <w:t>Actions</w:t>
-      </w:r>
-      <w:r>
-        <w:rPr>
+        <w:t>Assets</w:t>
+      </w:r>
+      <w:r>
+        <w:rPr>
+          <w:rFonts w:ascii="Montserrat" w:hAnsi="Montserrat"/>
+        </w:rPr>
+        <w:t xml:space="preserve"> to the </w:t>
+      </w:r>
+      <w:r>
+        <w:rPr>
+          <w:rFonts w:ascii="Montserrat" w:hAnsi="Montserrat"/>
           <w:b/>
           <w:bCs/>
         </w:rPr>
+        <w:t>Actions</w:t>
+      </w:r>
+      <w:r>
+        <w:rPr>
+          <w:rFonts w:ascii="Montserrat" w:hAnsi="Montserrat"/>
+          <w:b/>
+          <w:bCs/>
+        </w:rPr>
         <w:t xml:space="preserve"> </w:t>
       </w:r>
       <w:r>
+        <w:rPr>
+          <w:rFonts w:ascii="Montserrat" w:hAnsi="Montserrat"/>
+        </w:rPr>
         <w:t>that each performs:</w:t>
       </w:r>
     </w:p>
@@ -2473,8 +3512,15 @@
       <w:pPr>
         <w:pStyle w:val="ListParagraph"/>
         <w:jc w:val="center"/>
-      </w:pPr>
-      <w:r>
+        <w:rPr>
+          <w:rFonts w:ascii="Montserrat" w:hAnsi="Montserrat"/>
+        </w:rPr>
+      </w:pPr>
+      <w:r>
+        <w:rPr>
+          <w:rFonts w:ascii="Montserrat" w:hAnsi="Montserrat"/>
+          <w:noProof/>
+        </w:rPr>
         <w:drawing>
           <wp:inline distT="0" distB="0" distL="0" distR="0" wp14:anchorId="417C89DD" wp14:editId="5C1D4DEE">
             <wp:extent cx="3969823" cy="2519735"/>
@@ -2491,7 +3537,7 @@
                     <pic:cNvPicPr/>
                   </pic:nvPicPr>
                   <pic:blipFill>
-                    <a:blip r:embed="rId21"/>
+                    <a:blip r:embed="rId22"/>
                     <a:stretch>
                       <a:fillRect/>
                     </a:stretch>
@@ -2521,6 +3567,9 @@
       <w:pPr>
         <w:pStyle w:val="ListParagraph"/>
         <w:jc w:val="center"/>
+        <w:rPr>
+          <w:rFonts w:ascii="Montserrat" w:hAnsi="Montserrat"/>
+        </w:rPr>
       </w:pPr>
     </w:p>
     <w:p>
@@ -2530,21 +3579,271 @@
           <w:ilvl w:val="0"/>
           <w:numId w:val="7"/>
         </w:numPr>
-      </w:pPr>
-      <w:r>
-        <w:t xml:space="preserve">Open the LML Spider Diagram for </w:t>
-      </w:r>
-      <w:r>
-        <w:t>the “Cell Phone” Asset.</w:t>
+        <w:rPr>
+          <w:rFonts w:ascii="Montserrat" w:hAnsi="Montserrat"/>
+        </w:rPr>
+      </w:pPr>
+      <w:r>
+        <w:rPr>
+          <w:rFonts w:ascii="Montserrat" w:hAnsi="Montserrat"/>
+        </w:rPr>
+        <w:t xml:space="preserve">Open the </w:t>
+      </w:r>
+      <w:r>
+        <w:rPr>
+          <w:rFonts w:ascii="Montserrat" w:hAnsi="Montserrat"/>
+          <w:i/>
+          <w:iCs/>
+        </w:rPr>
+        <w:t>I</w:t>
+      </w:r>
+      <w:r>
+        <w:rPr>
+          <w:rFonts w:ascii="Montserrat" w:hAnsi="Montserrat"/>
+          <w:i/>
+          <w:iCs/>
+        </w:rPr>
+        <w:t>DEF(A0)</w:t>
+      </w:r>
+      <w:r>
+        <w:rPr>
+          <w:rFonts w:ascii="Montserrat" w:hAnsi="Montserrat"/>
+          <w:i/>
+          <w:iCs/>
+        </w:rPr>
+        <w:t xml:space="preserve"> Diagram</w:t>
+      </w:r>
+      <w:r>
+        <w:rPr>
+          <w:rFonts w:ascii="Montserrat" w:hAnsi="Montserrat"/>
+        </w:rPr>
+        <w:t xml:space="preserve"> for the “Make Call” </w:t>
+      </w:r>
+      <w:r>
+        <w:rPr>
+          <w:rFonts w:ascii="Montserrat" w:hAnsi="Montserrat"/>
+          <w:b/>
+          <w:bCs/>
+        </w:rPr>
+        <w:t>Action</w:t>
+      </w:r>
+      <w:r>
+        <w:rPr>
+          <w:rFonts w:ascii="Montserrat" w:hAnsi="Montserrat"/>
+        </w:rPr>
+        <w:t>:</w:t>
       </w:r>
     </w:p>
     <w:p>
       <w:pPr>
         <w:pStyle w:val="ListParagraph"/>
         <w:jc w:val="center"/>
-      </w:pPr>
-      <w:r>
-        <w:rPr>
+        <w:rPr>
+          <w:rFonts w:ascii="Montserrat" w:hAnsi="Montserrat"/>
+        </w:rPr>
+      </w:pPr>
+      <w:r>
+        <w:rPr>
+          <w:rFonts w:ascii="Montserrat" w:hAnsi="Montserrat"/>
+          <w:noProof/>
+        </w:rPr>
+        <w:lastRenderedPageBreak/>
+        <w:drawing>
+          <wp:inline distT="0" distB="0" distL="0" distR="0" wp14:anchorId="7068BD40" wp14:editId="08C85375">
+            <wp:extent cx="3874348" cy="3084163"/>
+            <wp:effectExtent l="12700" t="12700" r="12065" b="15240"/>
+            <wp:docPr id="1204487131" name="Picture 3"/>
+            <wp:cNvGraphicFramePr>
+              <a:graphicFrameLocks xmlns:a="http://schemas.openxmlformats.org/drawingml/2006/main" noChangeAspect="1"/>
+            </wp:cNvGraphicFramePr>
+            <a:graphic xmlns:a="http://schemas.openxmlformats.org/drawingml/2006/main">
+              <a:graphicData uri="http://schemas.openxmlformats.org/drawingml/2006/picture">
+                <pic:pic xmlns:pic="http://schemas.openxmlformats.org/drawingml/2006/picture">
+                  <pic:nvPicPr>
+                    <pic:cNvPr id="1204487131" name="Picture 1204487131"/>
+                    <pic:cNvPicPr/>
+                  </pic:nvPicPr>
+                  <pic:blipFill>
+                    <a:blip r:embed="rId23" cstate="print">
+                      <a:extLst>
+                        <a:ext uri="{28A0092B-C50C-407E-A947-70E740481C1C}">
+                          <a14:useLocalDpi xmlns:a14="http://schemas.microsoft.com/office/drawing/2010/main" val="0"/>
+                        </a:ext>
+                      </a:extLst>
+                    </a:blip>
+                    <a:stretch>
+                      <a:fillRect/>
+                    </a:stretch>
+                  </pic:blipFill>
+                  <pic:spPr>
+                    <a:xfrm>
+                      <a:off x="0" y="0"/>
+                      <a:ext cx="3884472" cy="3092223"/>
+                    </a:xfrm>
+                    <a:prstGeom prst="rect">
+                      <a:avLst/>
+                    </a:prstGeom>
+                    <a:ln>
+                      <a:solidFill>
+                        <a:schemeClr val="tx1"/>
+                      </a:solidFill>
+                    </a:ln>
+                  </pic:spPr>
+                </pic:pic>
+              </a:graphicData>
+            </a:graphic>
+          </wp:inline>
+        </w:drawing>
+      </w:r>
+    </w:p>
+    <w:p>
+      <w:pPr>
+        <w:pStyle w:val="ListParagraph"/>
+        <w:numPr>
+          <w:ilvl w:val="0"/>
+          <w:numId w:val="7"/>
+        </w:numPr>
+        <w:rPr>
+          <w:rFonts w:ascii="Montserrat" w:hAnsi="Montserrat"/>
+        </w:rPr>
+      </w:pPr>
+      <w:r>
+        <w:rPr>
+          <w:rFonts w:ascii="Montserrat" w:hAnsi="Montserrat"/>
+        </w:rPr>
+        <w:t xml:space="preserve">Open the </w:t>
+      </w:r>
+      <w:r>
+        <w:rPr>
+          <w:rFonts w:ascii="Montserrat" w:hAnsi="Montserrat"/>
+          <w:i/>
+          <w:iCs/>
+        </w:rPr>
+        <w:t>ICOM Diagram</w:t>
+      </w:r>
+      <w:r>
+        <w:rPr>
+          <w:rFonts w:ascii="Montserrat" w:hAnsi="Montserrat"/>
+        </w:rPr>
+        <w:t xml:space="preserve"> for the “Make Call” Action:</w:t>
+      </w:r>
+    </w:p>
+    <w:p>
+      <w:pPr>
+        <w:jc w:val="center"/>
+        <w:rPr>
+          <w:rFonts w:ascii="Montserrat" w:hAnsi="Montserrat"/>
+        </w:rPr>
+      </w:pPr>
+      <w:r>
+        <w:rPr>
+          <w:rFonts w:ascii="Montserrat" w:hAnsi="Montserrat"/>
+        </w:rPr>
+        <w:drawing>
+          <wp:inline distT="0" distB="0" distL="0" distR="0" wp14:anchorId="2D3DD19C" wp14:editId="6ABB9AC7">
+            <wp:extent cx="978528" cy="1694697"/>
+            <wp:effectExtent l="12700" t="12700" r="12700" b="7620"/>
+            <wp:docPr id="2129180159" name="Picture 1"/>
+            <wp:cNvGraphicFramePr>
+              <a:graphicFrameLocks xmlns:a="http://schemas.openxmlformats.org/drawingml/2006/main" noChangeAspect="1"/>
+            </wp:cNvGraphicFramePr>
+            <a:graphic xmlns:a="http://schemas.openxmlformats.org/drawingml/2006/main">
+              <a:graphicData uri="http://schemas.openxmlformats.org/drawingml/2006/picture">
+                <pic:pic xmlns:pic="http://schemas.openxmlformats.org/drawingml/2006/picture">
+                  <pic:nvPicPr>
+                    <pic:cNvPr id="2129180159" name=""/>
+                    <pic:cNvPicPr/>
+                  </pic:nvPicPr>
+                  <pic:blipFill>
+                    <a:blip r:embed="rId24"/>
+                    <a:stretch>
+                      <a:fillRect/>
+                    </a:stretch>
+                  </pic:blipFill>
+                  <pic:spPr>
+                    <a:xfrm>
+                      <a:off x="0" y="0"/>
+                      <a:ext cx="982456" cy="1701499"/>
+                    </a:xfrm>
+                    <a:prstGeom prst="rect">
+                      <a:avLst/>
+                    </a:prstGeom>
+                    <a:ln>
+                      <a:solidFill>
+                        <a:schemeClr val="tx1"/>
+                      </a:solidFill>
+                    </a:ln>
+                  </pic:spPr>
+                </pic:pic>
+              </a:graphicData>
+            </a:graphic>
+          </wp:inline>
+        </w:drawing>
+      </w:r>
+    </w:p>
+    <w:p>
+      <w:pPr>
+        <w:pStyle w:val="ListParagraph"/>
+        <w:numPr>
+          <w:ilvl w:val="0"/>
+          <w:numId w:val="7"/>
+        </w:numPr>
+        <w:rPr>
+          <w:rFonts w:ascii="Montserrat" w:hAnsi="Montserrat"/>
+        </w:rPr>
+      </w:pPr>
+      <w:r>
+        <w:rPr>
+          <w:rFonts w:ascii="Montserrat" w:hAnsi="Montserrat"/>
+        </w:rPr>
+        <w:t xml:space="preserve">Open the </w:t>
+      </w:r>
+      <w:r>
+        <w:rPr>
+          <w:rFonts w:ascii="Montserrat" w:hAnsi="Montserrat"/>
+          <w:i/>
+          <w:iCs/>
+        </w:rPr>
+        <w:t>LML Spider Diagram</w:t>
+      </w:r>
+      <w:r>
+        <w:rPr>
+          <w:rFonts w:ascii="Montserrat" w:hAnsi="Montserrat"/>
+        </w:rPr>
+        <w:t xml:space="preserve"> for </w:t>
+      </w:r>
+      <w:r>
+        <w:rPr>
+          <w:rFonts w:ascii="Montserrat" w:hAnsi="Montserrat"/>
+        </w:rPr>
+        <w:t xml:space="preserve">the “Cell Phone” </w:t>
+      </w:r>
+      <w:r>
+        <w:rPr>
+          <w:rFonts w:ascii="Montserrat" w:hAnsi="Montserrat"/>
+          <w:b/>
+          <w:bCs/>
+        </w:rPr>
+        <w:t>Asset</w:t>
+      </w:r>
+      <w:r>
+        <w:rPr>
+          <w:rFonts w:ascii="Montserrat" w:hAnsi="Montserrat"/>
+        </w:rPr>
+        <w:t>:</w:t>
+      </w:r>
+    </w:p>
+    <w:p>
+      <w:pPr>
+        <w:pStyle w:val="ListParagraph"/>
+        <w:jc w:val="center"/>
+        <w:rPr>
+          <w:rFonts w:ascii="Montserrat" w:hAnsi="Montserrat"/>
+        </w:rPr>
+      </w:pPr>
+      <w:r>
+        <w:rPr>
+          <w:rFonts w:ascii="Montserrat" w:hAnsi="Montserrat"/>
           <w:noProof/>
         </w:rPr>
         <w:lastRenderedPageBreak/>
@@ -2564,7 +3863,7 @@
                     <pic:cNvPicPr/>
                   </pic:nvPicPr>
                   <pic:blipFill>
-                    <a:blip r:embed="rId22" cstate="print">
+                    <a:blip r:embed="rId25" cstate="print">
                       <a:extLst>
                         <a:ext uri="{28A0092B-C50C-407E-A947-70E740481C1C}">
                           <a14:useLocalDpi xmlns:a14="http://schemas.microsoft.com/office/drawing/2010/main" val="0"/>
@@ -2596,8 +3895,368 @@
         </w:drawing>
       </w:r>
     </w:p>
-    <w:p/>
-    <w:p/>
+    <w:p>
+      <w:pPr>
+        <w:rPr>
+          <w:rFonts w:ascii="Montserrat" w:hAnsi="Montserrat"/>
+        </w:rPr>
+      </w:pPr>
+    </w:p>
+    <w:p>
+      <w:pPr>
+        <w:rPr>
+          <w:rFonts w:ascii="Montserrat" w:hAnsi="Montserrat"/>
+        </w:rPr>
+      </w:pPr>
+      <w:r>
+        <w:rPr>
+          <w:rFonts w:ascii="Montserrat" w:hAnsi="Montserrat"/>
+        </w:rPr>
+        <w:br w:type="page"/>
+      </w:r>
+    </w:p>
+    <w:p>
+      <w:pPr>
+        <w:rPr>
+          <w:rFonts w:ascii="Montserrat" w:hAnsi="Montserrat"/>
+          <w:b/>
+          <w:bCs/>
+        </w:rPr>
+      </w:pPr>
+      <w:r>
+        <w:rPr>
+          <w:rFonts w:ascii="Montserrat" w:hAnsi="Montserrat"/>
+          <w:b/>
+          <w:bCs/>
+        </w:rPr>
+        <w:lastRenderedPageBreak/>
+        <w:t>Module 8 – Project Management</w:t>
+      </w:r>
+    </w:p>
+    <w:p>
+      <w:pPr>
+        <w:pStyle w:val="ListParagraph"/>
+        <w:numPr>
+          <w:ilvl w:val="0"/>
+          <w:numId w:val="10"/>
+        </w:numPr>
+        <w:rPr>
+          <w:rFonts w:ascii="Montserrat" w:hAnsi="Montserrat"/>
+        </w:rPr>
+      </w:pPr>
+      <w:r>
+        <w:rPr>
+          <w:rFonts w:ascii="Montserrat" w:hAnsi="Montserrat"/>
+        </w:rPr>
+        <w:t>Navigate to the “Project Management” view.</w:t>
+      </w:r>
+    </w:p>
+    <w:p>
+      <w:pPr>
+        <w:pStyle w:val="ListParagraph"/>
+        <w:numPr>
+          <w:ilvl w:val="0"/>
+          <w:numId w:val="10"/>
+        </w:numPr>
+        <w:rPr>
+          <w:rFonts w:ascii="Montserrat" w:hAnsi="Montserrat"/>
+        </w:rPr>
+      </w:pPr>
+      <w:r>
+        <w:rPr>
+          <w:rFonts w:ascii="Montserrat" w:hAnsi="Montserrat"/>
+        </w:rPr>
+        <w:t>Select “Create Kanban Board”.</w:t>
+      </w:r>
+    </w:p>
+    <w:p>
+      <w:pPr>
+        <w:pStyle w:val="ListParagraph"/>
+        <w:numPr>
+          <w:ilvl w:val="0"/>
+          <w:numId w:val="10"/>
+        </w:numPr>
+        <w:rPr>
+          <w:rFonts w:ascii="Montserrat" w:hAnsi="Montserrat"/>
+        </w:rPr>
+      </w:pPr>
+      <w:r>
+        <w:rPr>
+          <w:rFonts w:ascii="Montserrat" w:hAnsi="Montserrat"/>
+        </w:rPr>
+        <w:t>Select the “Project Workflow Board” template and click “Next”.</w:t>
+      </w:r>
+    </w:p>
+    <w:p>
+      <w:pPr>
+        <w:pStyle w:val="ListParagraph"/>
+        <w:numPr>
+          <w:ilvl w:val="0"/>
+          <w:numId w:val="10"/>
+        </w:numPr>
+        <w:rPr>
+          <w:rFonts w:ascii="Montserrat" w:hAnsi="Montserrat"/>
+        </w:rPr>
+      </w:pPr>
+      <w:r>
+        <w:rPr>
+          <w:rFonts w:ascii="Montserrat" w:hAnsi="Montserrat"/>
+        </w:rPr>
+        <w:t>Name the Kanban Board “Touchscreen Kanban”.</w:t>
+      </w:r>
+    </w:p>
+    <w:p>
+      <w:pPr>
+        <w:pStyle w:val="ListParagraph"/>
+        <w:numPr>
+          <w:ilvl w:val="0"/>
+          <w:numId w:val="10"/>
+        </w:numPr>
+        <w:rPr>
+          <w:rFonts w:ascii="Montserrat" w:hAnsi="Montserrat"/>
+        </w:rPr>
+      </w:pPr>
+      <w:r>
+        <w:rPr>
+          <w:rFonts w:ascii="Montserrat" w:hAnsi="Montserrat"/>
+        </w:rPr>
+        <w:t xml:space="preserve">Select “New” </w:t>
+      </w:r>
+      <w:r>
+        <w:rPr>
+          <w:rFonts w:ascii="Montserrat" w:hAnsi="Montserrat"/>
+        </w:rPr>
+        <w:sym w:font="Wingdings" w:char="F0E0"/>
+      </w:r>
+      <w:r>
+        <w:rPr>
+          <w:rFonts w:ascii="Montserrat" w:hAnsi="Montserrat"/>
+        </w:rPr>
+        <w:t xml:space="preserve"> “New Task.</w:t>
+      </w:r>
+    </w:p>
+    <w:p>
+      <w:pPr>
+        <w:pStyle w:val="ListParagraph"/>
+        <w:numPr>
+          <w:ilvl w:val="0"/>
+          <w:numId w:val="10"/>
+        </w:numPr>
+        <w:rPr>
+          <w:rFonts w:ascii="Montserrat" w:hAnsi="Montserrat"/>
+        </w:rPr>
+      </w:pPr>
+      <w:r>
+        <w:rPr>
+          <w:rFonts w:ascii="Montserrat" w:hAnsi="Montserrat"/>
+        </w:rPr>
+        <w:t xml:space="preserve">Add </w:t>
+      </w:r>
+      <w:r>
+        <w:rPr>
+          <w:rFonts w:ascii="Montserrat" w:hAnsi="Montserrat"/>
+        </w:rPr>
+        <w:t>3-5 tasks to the Kanban board such as:</w:t>
+      </w:r>
+    </w:p>
+    <w:p>
+      <w:pPr>
+        <w:pStyle w:val="ListParagraph"/>
+        <w:rPr>
+          <w:rFonts w:ascii="Montserrat" w:hAnsi="Montserrat"/>
+        </w:rPr>
+      </w:pPr>
+    </w:p>
+    <w:p>
+      <w:pPr>
+        <w:pStyle w:val="ListParagraph"/>
+        <w:jc w:val="center"/>
+        <w:rPr>
+          <w:rFonts w:ascii="Montserrat" w:hAnsi="Montserrat"/>
+        </w:rPr>
+      </w:pPr>
+      <w:r>
+        <w:rPr>
+          <w:rFonts w:ascii="Montserrat" w:hAnsi="Montserrat"/>
+        </w:rPr>
+        <w:drawing>
+          <wp:inline distT="0" distB="0" distL="0" distR="0" wp14:anchorId="267BC729" wp14:editId="41D9240B">
+            <wp:extent cx="5943600" cy="1908175"/>
+            <wp:effectExtent l="12700" t="12700" r="12700" b="9525"/>
+            <wp:docPr id="1328825569" name="Picture 1"/>
+            <wp:cNvGraphicFramePr>
+              <a:graphicFrameLocks xmlns:a="http://schemas.openxmlformats.org/drawingml/2006/main" noChangeAspect="1"/>
+            </wp:cNvGraphicFramePr>
+            <a:graphic xmlns:a="http://schemas.openxmlformats.org/drawingml/2006/main">
+              <a:graphicData uri="http://schemas.openxmlformats.org/drawingml/2006/picture">
+                <pic:pic xmlns:pic="http://schemas.openxmlformats.org/drawingml/2006/picture">
+                  <pic:nvPicPr>
+                    <pic:cNvPr id="1328825569" name=""/>
+                    <pic:cNvPicPr/>
+                  </pic:nvPicPr>
+                  <pic:blipFill>
+                    <a:blip r:embed="rId26"/>
+                    <a:stretch>
+                      <a:fillRect/>
+                    </a:stretch>
+                  </pic:blipFill>
+                  <pic:spPr>
+                    <a:xfrm>
+                      <a:off x="0" y="0"/>
+                      <a:ext cx="5943600" cy="1908175"/>
+                    </a:xfrm>
+                    <a:prstGeom prst="rect">
+                      <a:avLst/>
+                    </a:prstGeom>
+                    <a:ln>
+                      <a:solidFill>
+                        <a:schemeClr val="tx1"/>
+                      </a:solidFill>
+                    </a:ln>
+                  </pic:spPr>
+                </pic:pic>
+              </a:graphicData>
+            </a:graphic>
+          </wp:inline>
+        </w:drawing>
+      </w:r>
+    </w:p>
+    <w:p>
+      <w:pPr>
+        <w:pStyle w:val="ListParagraph"/>
+        <w:rPr>
+          <w:rFonts w:ascii="Montserrat" w:hAnsi="Montserrat"/>
+          <w:b/>
+          <w:bCs/>
+        </w:rPr>
+      </w:pPr>
+      <w:r>
+        <w:rPr>
+          <w:rFonts w:ascii="Montserrat" w:hAnsi="Montserrat"/>
+          <w:b/>
+          <w:bCs/>
+        </w:rPr>
+        <w:t>Note: Investigate the various fields instead of copying these examples.</w:t>
+      </w:r>
+    </w:p>
+    <w:p>
+      <w:pPr>
+        <w:pStyle w:val="ListParagraph"/>
+        <w:rPr>
+          <w:rFonts w:ascii="Montserrat" w:hAnsi="Montserrat"/>
+          <w:b/>
+          <w:bCs/>
+        </w:rPr>
+      </w:pPr>
+    </w:p>
+    <w:p>
+      <w:pPr>
+        <w:pStyle w:val="ListParagraph"/>
+        <w:numPr>
+          <w:ilvl w:val="0"/>
+          <w:numId w:val="10"/>
+        </w:numPr>
+        <w:rPr>
+          <w:rFonts w:ascii="Montserrat" w:hAnsi="Montserrat"/>
+        </w:rPr>
+      </w:pPr>
+      <w:r>
+        <w:rPr>
+          <w:rFonts w:ascii="Montserrat" w:hAnsi="Montserrat"/>
+        </w:rPr>
+        <w:t xml:space="preserve">Open the </w:t>
+      </w:r>
+      <w:r>
+        <w:rPr>
+          <w:rFonts w:ascii="Montserrat" w:hAnsi="Montserrat"/>
+          <w:i/>
+          <w:iCs/>
+        </w:rPr>
+        <w:t>Gantt Chart</w:t>
+      </w:r>
+      <w:r>
+        <w:rPr>
+          <w:rFonts w:ascii="Montserrat" w:hAnsi="Montserrat"/>
+        </w:rPr>
+        <w:t xml:space="preserve"> view:</w:t>
+      </w:r>
+    </w:p>
+    <w:p>
+      <w:pPr>
+        <w:jc w:val="center"/>
+        <w:rPr>
+          <w:rFonts w:ascii="Montserrat" w:hAnsi="Montserrat"/>
+        </w:rPr>
+      </w:pPr>
+      <w:r>
+        <w:rPr>
+          <w:rFonts w:ascii="Montserrat" w:hAnsi="Montserrat"/>
+        </w:rPr>
+        <w:drawing>
+          <wp:inline distT="0" distB="0" distL="0" distR="0" wp14:anchorId="46BB90B9" wp14:editId="0921CA0C">
+            <wp:extent cx="5943600" cy="1246505"/>
+            <wp:effectExtent l="0" t="0" r="0" b="0"/>
+            <wp:docPr id="1014851342" name="Picture 1"/>
+            <wp:cNvGraphicFramePr>
+              <a:graphicFrameLocks xmlns:a="http://schemas.openxmlformats.org/drawingml/2006/main" noChangeAspect="1"/>
+            </wp:cNvGraphicFramePr>
+            <a:graphic xmlns:a="http://schemas.openxmlformats.org/drawingml/2006/main">
+              <a:graphicData uri="http://schemas.openxmlformats.org/drawingml/2006/picture">
+                <pic:pic xmlns:pic="http://schemas.openxmlformats.org/drawingml/2006/picture">
+                  <pic:nvPicPr>
+                    <pic:cNvPr id="1014851342" name=""/>
+                    <pic:cNvPicPr/>
+                  </pic:nvPicPr>
+                  <pic:blipFill>
+                    <a:blip r:embed="rId27"/>
+                    <a:stretch>
+                      <a:fillRect/>
+                    </a:stretch>
+                  </pic:blipFill>
+                  <pic:spPr>
+                    <a:xfrm>
+                      <a:off x="0" y="0"/>
+                      <a:ext cx="5943600" cy="1246505"/>
+                    </a:xfrm>
+                    <a:prstGeom prst="rect">
+                      <a:avLst/>
+                    </a:prstGeom>
+                  </pic:spPr>
+                </pic:pic>
+              </a:graphicData>
+            </a:graphic>
+          </wp:inline>
+        </w:drawing>
+      </w:r>
+    </w:p>
+    <w:p>
+      <w:pPr>
+        <w:pStyle w:val="ListParagraph"/>
+        <w:jc w:val="center"/>
+        <w:rPr>
+          <w:rFonts w:ascii="Montserrat" w:hAnsi="Montserrat"/>
+        </w:rPr>
+      </w:pPr>
+    </w:p>
+    <w:p>
+      <w:pPr>
+        <w:pStyle w:val="ListParagraph"/>
+        <w:jc w:val="center"/>
+        <w:rPr>
+          <w:rFonts w:ascii="Montserrat" w:hAnsi="Montserrat"/>
+          <w:b/>
+          <w:bCs/>
+        </w:rPr>
+      </w:pPr>
+      <w:r>
+        <w:rPr>
+          <w:rFonts w:ascii="Montserrat" w:hAnsi="Montserrat"/>
+          <w:b/>
+          <w:bCs/>
+        </w:rPr>
+        <w:t>Lab Complete</w:t>
+      </w:r>
+    </w:p>
     <w:sectPr>
       <w:pgSz w:w="12240" w:h="15840"/>
       <w:pgMar w:top="1440" w:right="1440" w:bottom="1440" w:left="1440" w:header="720" w:footer="720" w:gutter="0"/>
@@ -2702,6 +4361,95 @@
     </w:lvl>
   </w:abstractNum>
   <w:abstractNum w:abstractNumId="1" w15:restartNumberingAfterBreak="0">
+    <w:nsid w:val="05C17B22"/>
+    <w:multiLevelType w:val="hybridMultilevel"/>
+    <w:tmpl w:val="F2A41462"/>
+    <w:lvl w:ilvl="0" w:tplc="0409000F">
+      <w:start w:val="1"/>
+      <w:numFmt w:val="decimal"/>
+      <w:lvlText w:val="%1."/>
+      <w:lvlJc w:val="left"/>
+      <w:pPr>
+        <w:ind w:left="720" w:hanging="360"/>
+      </w:pPr>
+      <w:rPr>
+        <w:rFonts w:hint="default"/>
+      </w:rPr>
+    </w:lvl>
+    <w:lvl w:ilvl="1" w:tplc="04090019" w:tentative="1">
+      <w:start w:val="1"/>
+      <w:numFmt w:val="lowerLetter"/>
+      <w:lvlText w:val="%2."/>
+      <w:lvlJc w:val="left"/>
+      <w:pPr>
+        <w:ind w:left="1440" w:hanging="360"/>
+      </w:pPr>
+    </w:lvl>
+    <w:lvl w:ilvl="2" w:tplc="0409001B" w:tentative="1">
+      <w:start w:val="1"/>
+      <w:numFmt w:val="lowerRoman"/>
+      <w:lvlText w:val="%3."/>
+      <w:lvlJc w:val="right"/>
+      <w:pPr>
+        <w:ind w:left="2160" w:hanging="180"/>
+      </w:pPr>
+    </w:lvl>
+    <w:lvl w:ilvl="3" w:tplc="0409000F" w:tentative="1">
+      <w:start w:val="1"/>
+      <w:numFmt w:val="decimal"/>
+      <w:lvlText w:val="%4."/>
+      <w:lvlJc w:val="left"/>
+      <w:pPr>
+        <w:ind w:left="2880" w:hanging="360"/>
+      </w:pPr>
+    </w:lvl>
+    <w:lvl w:ilvl="4" w:tplc="04090019" w:tentative="1">
+      <w:start w:val="1"/>
+      <w:numFmt w:val="lowerLetter"/>
+      <w:lvlText w:val="%5."/>
+      <w:lvlJc w:val="left"/>
+      <w:pPr>
+        <w:ind w:left="3600" w:hanging="360"/>
+      </w:pPr>
+    </w:lvl>
+    <w:lvl w:ilvl="5" w:tplc="0409001B" w:tentative="1">
+      <w:start w:val="1"/>
+      <w:numFmt w:val="lowerRoman"/>
+      <w:lvlText w:val="%6."/>
+      <w:lvlJc w:val="right"/>
+      <w:pPr>
+        <w:ind w:left="4320" w:hanging="180"/>
+      </w:pPr>
+    </w:lvl>
+    <w:lvl w:ilvl="6" w:tplc="0409000F" w:tentative="1">
+      <w:start w:val="1"/>
+      <w:numFmt w:val="decimal"/>
+      <w:lvlText w:val="%7."/>
+      <w:lvlJc w:val="left"/>
+      <w:pPr>
+        <w:ind w:left="5040" w:hanging="360"/>
+      </w:pPr>
+    </w:lvl>
+    <w:lvl w:ilvl="7" w:tplc="04090019" w:tentative="1">
+      <w:start w:val="1"/>
+      <w:numFmt w:val="lowerLetter"/>
+      <w:lvlText w:val="%8."/>
+      <w:lvlJc w:val="left"/>
+      <w:pPr>
+        <w:ind w:left="5760" w:hanging="360"/>
+      </w:pPr>
+    </w:lvl>
+    <w:lvl w:ilvl="8" w:tplc="0409001B" w:tentative="1">
+      <w:start w:val="1"/>
+      <w:numFmt w:val="lowerRoman"/>
+      <w:lvlText w:val="%9."/>
+      <w:lvlJc w:val="right"/>
+      <w:pPr>
+        <w:ind w:left="6480" w:hanging="180"/>
+      </w:pPr>
+    </w:lvl>
+  </w:abstractNum>
+  <w:abstractNum w:abstractNumId="2" w15:restartNumberingAfterBreak="0">
     <w:nsid w:val="0C3B6BFF"/>
     <w:multiLevelType w:val="hybridMultilevel"/>
     <w:tmpl w:val="3DA09894"/>
@@ -2793,7 +4541,7 @@
       </w:pPr>
     </w:lvl>
   </w:abstractNum>
-  <w:abstractNum w:abstractNumId="2" w15:restartNumberingAfterBreak="0">
+  <w:abstractNum w:abstractNumId="3" w15:restartNumberingAfterBreak="0">
     <w:nsid w:val="21586A94"/>
     <w:multiLevelType w:val="hybridMultilevel"/>
     <w:tmpl w:val="D4566E76"/>
@@ -2882,7 +4630,96 @@
       </w:pPr>
     </w:lvl>
   </w:abstractNum>
-  <w:abstractNum w:abstractNumId="3" w15:restartNumberingAfterBreak="0">
+  <w:abstractNum w:abstractNumId="4" w15:restartNumberingAfterBreak="0">
+    <w:nsid w:val="242D1B56"/>
+    <w:multiLevelType w:val="hybridMultilevel"/>
+    <w:tmpl w:val="2654E4E0"/>
+    <w:lvl w:ilvl="0" w:tplc="0409000F">
+      <w:start w:val="1"/>
+      <w:numFmt w:val="decimal"/>
+      <w:lvlText w:val="%1."/>
+      <w:lvlJc w:val="left"/>
+      <w:pPr>
+        <w:ind w:left="720" w:hanging="360"/>
+      </w:pPr>
+      <w:rPr>
+        <w:rFonts w:hint="default"/>
+      </w:rPr>
+    </w:lvl>
+    <w:lvl w:ilvl="1" w:tplc="04090019" w:tentative="1">
+      <w:start w:val="1"/>
+      <w:numFmt w:val="lowerLetter"/>
+      <w:lvlText w:val="%2."/>
+      <w:lvlJc w:val="left"/>
+      <w:pPr>
+        <w:ind w:left="1440" w:hanging="360"/>
+      </w:pPr>
+    </w:lvl>
+    <w:lvl w:ilvl="2" w:tplc="0409001B" w:tentative="1">
+      <w:start w:val="1"/>
+      <w:numFmt w:val="lowerRoman"/>
+      <w:lvlText w:val="%3."/>
+      <w:lvlJc w:val="right"/>
+      <w:pPr>
+        <w:ind w:left="2160" w:hanging="180"/>
+      </w:pPr>
+    </w:lvl>
+    <w:lvl w:ilvl="3" w:tplc="0409000F" w:tentative="1">
+      <w:start w:val="1"/>
+      <w:numFmt w:val="decimal"/>
+      <w:lvlText w:val="%4."/>
+      <w:lvlJc w:val="left"/>
+      <w:pPr>
+        <w:ind w:left="2880" w:hanging="360"/>
+      </w:pPr>
+    </w:lvl>
+    <w:lvl w:ilvl="4" w:tplc="04090019" w:tentative="1">
+      <w:start w:val="1"/>
+      <w:numFmt w:val="lowerLetter"/>
+      <w:lvlText w:val="%5."/>
+      <w:lvlJc w:val="left"/>
+      <w:pPr>
+        <w:ind w:left="3600" w:hanging="360"/>
+      </w:pPr>
+    </w:lvl>
+    <w:lvl w:ilvl="5" w:tplc="0409001B" w:tentative="1">
+      <w:start w:val="1"/>
+      <w:numFmt w:val="lowerRoman"/>
+      <w:lvlText w:val="%6."/>
+      <w:lvlJc w:val="right"/>
+      <w:pPr>
+        <w:ind w:left="4320" w:hanging="180"/>
+      </w:pPr>
+    </w:lvl>
+    <w:lvl w:ilvl="6" w:tplc="0409000F" w:tentative="1">
+      <w:start w:val="1"/>
+      <w:numFmt w:val="decimal"/>
+      <w:lvlText w:val="%7."/>
+      <w:lvlJc w:val="left"/>
+      <w:pPr>
+        <w:ind w:left="5040" w:hanging="360"/>
+      </w:pPr>
+    </w:lvl>
+    <w:lvl w:ilvl="7" w:tplc="04090019" w:tentative="1">
+      <w:start w:val="1"/>
+      <w:numFmt w:val="lowerLetter"/>
+      <w:lvlText w:val="%8."/>
+      <w:lvlJc w:val="left"/>
+      <w:pPr>
+        <w:ind w:left="5760" w:hanging="360"/>
+      </w:pPr>
+    </w:lvl>
+    <w:lvl w:ilvl="8" w:tplc="0409001B" w:tentative="1">
+      <w:start w:val="1"/>
+      <w:numFmt w:val="lowerRoman"/>
+      <w:lvlText w:val="%9."/>
+      <w:lvlJc w:val="right"/>
+      <w:pPr>
+        <w:ind w:left="6480" w:hanging="180"/>
+      </w:pPr>
+    </w:lvl>
+  </w:abstractNum>
+  <w:abstractNum w:abstractNumId="5" w15:restartNumberingAfterBreak="0">
     <w:nsid w:val="4A781677"/>
     <w:multiLevelType w:val="hybridMultilevel"/>
     <w:tmpl w:val="8906188C"/>
@@ -2971,7 +4808,7 @@
       </w:pPr>
     </w:lvl>
   </w:abstractNum>
-  <w:abstractNum w:abstractNumId="4" w15:restartNumberingAfterBreak="0">
+  <w:abstractNum w:abstractNumId="6" w15:restartNumberingAfterBreak="0">
     <w:nsid w:val="51D17E2A"/>
     <w:multiLevelType w:val="multilevel"/>
     <w:tmpl w:val="EDBE45C0"/>
@@ -3084,7 +4921,7 @@
       </w:pPr>
     </w:lvl>
   </w:abstractNum>
-  <w:abstractNum w:abstractNumId="5" w15:restartNumberingAfterBreak="0">
+  <w:abstractNum w:abstractNumId="7" w15:restartNumberingAfterBreak="0">
     <w:nsid w:val="5A5B29B9"/>
     <w:multiLevelType w:val="hybridMultilevel"/>
     <w:tmpl w:val="864ED132"/>
@@ -3176,7 +5013,96 @@
       </w:pPr>
     </w:lvl>
   </w:abstractNum>
-  <w:abstractNum w:abstractNumId="6" w15:restartNumberingAfterBreak="0">
+  <w:abstractNum w:abstractNumId="8" w15:restartNumberingAfterBreak="0">
+    <w:nsid w:val="767941C3"/>
+    <w:multiLevelType w:val="hybridMultilevel"/>
+    <w:tmpl w:val="FCD8927E"/>
+    <w:lvl w:ilvl="0" w:tplc="0409000F">
+      <w:start w:val="1"/>
+      <w:numFmt w:val="decimal"/>
+      <w:lvlText w:val="%1."/>
+      <w:lvlJc w:val="left"/>
+      <w:pPr>
+        <w:ind w:left="720" w:hanging="360"/>
+      </w:pPr>
+      <w:rPr>
+        <w:rFonts w:hint="default"/>
+      </w:rPr>
+    </w:lvl>
+    <w:lvl w:ilvl="1" w:tplc="04090019" w:tentative="1">
+      <w:start w:val="1"/>
+      <w:numFmt w:val="lowerLetter"/>
+      <w:lvlText w:val="%2."/>
+      <w:lvlJc w:val="left"/>
+      <w:pPr>
+        <w:ind w:left="1440" w:hanging="360"/>
+      </w:pPr>
+    </w:lvl>
+    <w:lvl w:ilvl="2" w:tplc="0409001B" w:tentative="1">
+      <w:start w:val="1"/>
+      <w:numFmt w:val="lowerRoman"/>
+      <w:lvlText w:val="%3."/>
+      <w:lvlJc w:val="right"/>
+      <w:pPr>
+        <w:ind w:left="2160" w:hanging="180"/>
+      </w:pPr>
+    </w:lvl>
+    <w:lvl w:ilvl="3" w:tplc="0409000F" w:tentative="1">
+      <w:start w:val="1"/>
+      <w:numFmt w:val="decimal"/>
+      <w:lvlText w:val="%4."/>
+      <w:lvlJc w:val="left"/>
+      <w:pPr>
+        <w:ind w:left="2880" w:hanging="360"/>
+      </w:pPr>
+    </w:lvl>
+    <w:lvl w:ilvl="4" w:tplc="04090019" w:tentative="1">
+      <w:start w:val="1"/>
+      <w:numFmt w:val="lowerLetter"/>
+      <w:lvlText w:val="%5."/>
+      <w:lvlJc w:val="left"/>
+      <w:pPr>
+        <w:ind w:left="3600" w:hanging="360"/>
+      </w:pPr>
+    </w:lvl>
+    <w:lvl w:ilvl="5" w:tplc="0409001B" w:tentative="1">
+      <w:start w:val="1"/>
+      <w:numFmt w:val="lowerRoman"/>
+      <w:lvlText w:val="%6."/>
+      <w:lvlJc w:val="right"/>
+      <w:pPr>
+        <w:ind w:left="4320" w:hanging="180"/>
+      </w:pPr>
+    </w:lvl>
+    <w:lvl w:ilvl="6" w:tplc="0409000F" w:tentative="1">
+      <w:start w:val="1"/>
+      <w:numFmt w:val="decimal"/>
+      <w:lvlText w:val="%7."/>
+      <w:lvlJc w:val="left"/>
+      <w:pPr>
+        <w:ind w:left="5040" w:hanging="360"/>
+      </w:pPr>
+    </w:lvl>
+    <w:lvl w:ilvl="7" w:tplc="04090019" w:tentative="1">
+      <w:start w:val="1"/>
+      <w:numFmt w:val="lowerLetter"/>
+      <w:lvlText w:val="%8."/>
+      <w:lvlJc w:val="left"/>
+      <w:pPr>
+        <w:ind w:left="5760" w:hanging="360"/>
+      </w:pPr>
+    </w:lvl>
+    <w:lvl w:ilvl="8" w:tplc="0409001B" w:tentative="1">
+      <w:start w:val="1"/>
+      <w:numFmt w:val="lowerRoman"/>
+      <w:lvlText w:val="%9."/>
+      <w:lvlJc w:val="right"/>
+      <w:pPr>
+        <w:ind w:left="6480" w:hanging="180"/>
+      </w:pPr>
+    </w:lvl>
+  </w:abstractNum>
+  <w:abstractNum w:abstractNumId="9" w15:restartNumberingAfterBreak="0">
     <w:nsid w:val="778A3592"/>
     <w:multiLevelType w:val="multilevel"/>
     <w:tmpl w:val="9A80904A"/>
@@ -3293,22 +5219,31 @@
     <w:abstractNumId w:val="0"/>
   </w:num>
   <w:num w:numId="2" w16cid:durableId="500584028">
+    <w:abstractNumId w:val="3"/>
+  </w:num>
+  <w:num w:numId="3" w16cid:durableId="502471127">
+    <w:abstractNumId w:val="6"/>
+  </w:num>
+  <w:num w:numId="4" w16cid:durableId="1717464026">
+    <w:abstractNumId w:val="9"/>
+  </w:num>
+  <w:num w:numId="5" w16cid:durableId="1706830283">
     <w:abstractNumId w:val="2"/>
   </w:num>
-  <w:num w:numId="3" w16cid:durableId="502471127">
+  <w:num w:numId="6" w16cid:durableId="1607957873">
+    <w:abstractNumId w:val="5"/>
+  </w:num>
+  <w:num w:numId="7" w16cid:durableId="1586721850">
+    <w:abstractNumId w:val="7"/>
+  </w:num>
+  <w:num w:numId="8" w16cid:durableId="421950741">
+    <w:abstractNumId w:val="1"/>
+  </w:num>
+  <w:num w:numId="9" w16cid:durableId="1631087800">
     <w:abstractNumId w:val="4"/>
   </w:num>
-  <w:num w:numId="4" w16cid:durableId="1717464026">
-    <w:abstractNumId w:val="6"/>
-  </w:num>
-  <w:num w:numId="5" w16cid:durableId="1706830283">
-    <w:abstractNumId w:val="1"/>
-  </w:num>
-  <w:num w:numId="6" w16cid:durableId="1607957873">
-    <w:abstractNumId w:val="3"/>
-  </w:num>
-  <w:num w:numId="7" w16cid:durableId="1586721850">
-    <w:abstractNumId w:val="5"/>
+  <w:num w:numId="10" w16cid:durableId="1240170220">
+    <w:abstractNumId w:val="8"/>
   </w:num>
 </w:numbering>
 </file>

</xml_diff>